<commit_message>
Journal: Prologue (Sept 7-29 chats) and day one word for word, both sides, with passwords and keys removed; journey section in Mission Statement; record rules updated everywhere
Co-Authored-By: Claude Opus 5.5 <noreply@anthropic.com>
Claude-Session: https://claude.ai/code/session_01JPZJaTbXQFN2qiYRf4rkZK
</commit_message>
<xml_diff>
--- a/docs/Next_Owner_Market_Change_Log.docx
+++ b/docs/Next_Owner_Market_Change_Log.docx
@@ -2,7 +2,7 @@
 <file path=word/document.xml><?xml version="1.0" encoding="utf-8"?>
 <w:document xmlns:w="http://schemas.openxmlformats.org/wordprocessingml/2006/main" xmlns:m="http://schemas.openxmlformats.org/officeDocument/2006/math" xmlns:r="http://schemas.openxmlformats.org/officeDocument/2006/relationships" xmlns:o="urn:schemas-microsoft-com:office:office" xmlns:v="urn:schemas-microsoft-com:vml" xmlns:w10="urn:schemas-microsoft-com:office:word" xmlns:a="http://schemas.openxmlformats.org/drawingml/2006/main" xmlns:pic="http://schemas.openxmlformats.org/drawingml/2006/picture" xmlns:wp="http://schemas.openxmlformats.org/drawingml/2006/wordprocessingDrawing">
   <w:body>
-    <w:bookmarkStart w:id="203" w:name="next-owner-market--change-log"/>
+    <w:bookmarkStart w:id="204" w:name="next-owner-market--change-log"/>
     <w:p>
       <w:pPr>
         <w:pStyle w:val="Heading1"/>
@@ -20,7 +20,7 @@
           <w:iCs/>
           <w:i/>
         </w:rPr>
-        <w:t xml:space="preserve">Every change to the code, database, and documents, oldest first. Generated October 1, 2026 8:31 PM from the project history (180 changes).</w:t>
+        <w:t xml:space="preserve">Every change to the code, database, and documents, oldest first. Generated October 2, 2026 11:29 AM from the project history (181 changes).</w:t>
       </w:r>
     </w:p>
     <w:bookmarkStart w:id="52" w:name="tuesday-september-29-2026"/>
@@ -17423,7 +17423,7 @@
     </w:p>
     <w:bookmarkEnd w:id="155"/>
     <w:bookmarkEnd w:id="156"/>
-    <w:bookmarkStart w:id="202" w:name="thursday-october-1-2026"/>
+    <w:bookmarkStart w:id="203" w:name="thursday-october-1-2026"/>
     <w:p>
       <w:pPr>
         <w:pStyle w:val="Heading2"/>
@@ -23316,8 +23316,135 @@
       </w:r>
     </w:p>
     <w:bookmarkEnd w:id="201"/>
+    <w:bookmarkStart w:id="202" w:name="X3dca569d6333c3a5b29b46d016435282d06b79f"/>
+    <w:p>
+      <w:pPr>
+        <w:pStyle w:val="Heading3"/>
+      </w:pPr>
+      <w:r>
+        <w:t xml:space="preserve">20:31 — Mission Statement: the conversation behind it, both sides</w:t>
+      </w:r>
+    </w:p>
+    <w:p>
+      <w:pPr>
+        <w:numPr>
+          <w:ilvl w:val="0"/>
+          <w:numId w:val="1181"/>
+        </w:numPr>
+        <w:pStyle w:val="Compact"/>
+      </w:pPr>
+      <w:r>
+        <w:rPr>
+          <w:bCs/>
+          <w:b/>
+        </w:rPr>
+        <w:t xml:space="preserve">Documents:</w:t>
+      </w:r>
+      <w:r>
+        <w:t xml:space="preserve"> </w:t>
+      </w:r>
+      <w:r>
+        <w:rPr>
+          <w:rStyle w:val="VerbatimChar"/>
+        </w:rPr>
+        <w:t xml:space="preserve">docs/Next_Owner_Market_Build_Journal.docx</w:t>
+      </w:r>
+      <w:r>
+        <w:t xml:space="preserve">,</w:t>
+      </w:r>
+      <w:r>
+        <w:t xml:space="preserve"> </w:t>
+      </w:r>
+      <w:r>
+        <w:rPr>
+          <w:rStyle w:val="VerbatimChar"/>
+        </w:rPr>
+        <w:t xml:space="preserve">docs/Next_Owner_Market_Build_Journal.md</w:t>
+      </w:r>
+      <w:r>
+        <w:t xml:space="preserve">,</w:t>
+      </w:r>
+      <w:r>
+        <w:t xml:space="preserve"> </w:t>
+      </w:r>
+      <w:r>
+        <w:rPr>
+          <w:rStyle w:val="VerbatimChar"/>
+        </w:rPr>
+        <w:t xml:space="preserve">docs/Next_Owner_Market_Change_Log.docx</w:t>
+      </w:r>
+      <w:r>
+        <w:t xml:space="preserve">,</w:t>
+      </w:r>
+      <w:r>
+        <w:t xml:space="preserve"> </w:t>
+      </w:r>
+      <w:r>
+        <w:rPr>
+          <w:rStyle w:val="VerbatimChar"/>
+        </w:rPr>
+        <w:t xml:space="preserve">docs/Next_Owner_Market_Change_Log.md</w:t>
+      </w:r>
+      <w:r>
+        <w:t xml:space="preserve">,</w:t>
+      </w:r>
+      <w:r>
+        <w:t xml:space="preserve"> </w:t>
+      </w:r>
+      <w:r>
+        <w:rPr>
+          <w:rStyle w:val="VerbatimChar"/>
+        </w:rPr>
+        <w:t xml:space="preserve">docs/Next_Owner_Market_Mission_Statement.docx</w:t>
+      </w:r>
+      <w:r>
+        <w:t xml:space="preserve">,</w:t>
+      </w:r>
+      <w:r>
+        <w:t xml:space="preserve"> </w:t>
+      </w:r>
+      <w:r>
+        <w:rPr>
+          <w:rStyle w:val="VerbatimChar"/>
+        </w:rPr>
+        <w:t xml:space="preserve">docs/Next_Owner_Market_Mission_Statement.md</w:t>
+      </w:r>
+      <w:r>
+        <w:t xml:space="preserve">,</w:t>
+      </w:r>
+      <w:r>
+        <w:t xml:space="preserve"> </w:t>
+      </w:r>
+      <w:r>
+        <w:rPr>
+          <w:rStyle w:val="VerbatimChar"/>
+        </w:rPr>
+        <w:t xml:space="preserve">docs/journal_sessions/faa89acb-5a67-582b-a46a-1c3f3b736545.md</w:t>
+      </w:r>
+      <w:r>
+        <w:t xml:space="preserve">,</w:t>
+      </w:r>
+      <w:r>
+        <w:t xml:space="preserve"> </w:t>
+      </w:r>
+      <w:r>
+        <w:rPr>
+          <w:rStyle w:val="VerbatimChar"/>
+        </w:rPr>
+        <w:t xml:space="preserve">docs/journal_sessions/faa89acb-5a67-582b-a46a-1c3f3b736545.rows.json</w:t>
+      </w:r>
+    </w:p>
+    <w:p>
+      <w:pPr>
+        <w:pStyle w:val="FirstParagraph"/>
+      </w:pPr>
+      <w:r>
+        <w:t xml:space="preserve">change id e9fbcd1</w:t>
+      </w:r>
+    </w:p>
     <w:bookmarkEnd w:id="202"/>
     <w:bookmarkEnd w:id="203"/>
+    <w:bookmarkEnd w:id="204"/>
     <w:sectPr/>
   </w:body>
 </w:document>
@@ -24041,6 +24168,9 @@
     <w:abstractNumId w:val="991"/>
   </w:num>
   <w:num w:numId="1180">
+    <w:abstractNumId w:val="991"/>
+  </w:num>
+  <w:num w:numId="1181">
     <w:abstractNumId w:val="991"/>
   </w:num>
 </w:numbering>

</xml_diff>

<commit_message>
Prologue: add the Sept 22, 26 and 28 warehouse chats word for word
Co-Authored-By: Claude Opus 5.5 <noreply@anthropic.com>
Claude-Session: https://claude.ai/code/session_01JPZJaTbXQFN2qiYRf4rkZK
</commit_message>
<xml_diff>
--- a/docs/Next_Owner_Market_Change_Log.docx
+++ b/docs/Next_Owner_Market_Change_Log.docx
@@ -2,7 +2,7 @@
 <file path=word/document.xml><?xml version="1.0" encoding="utf-8"?>
 <w:document xmlns:w="http://schemas.openxmlformats.org/wordprocessingml/2006/main" xmlns:m="http://schemas.openxmlformats.org/officeDocument/2006/math" xmlns:r="http://schemas.openxmlformats.org/officeDocument/2006/relationships" xmlns:o="urn:schemas-microsoft-com:office:office" xmlns:v="urn:schemas-microsoft-com:vml" xmlns:w10="urn:schemas-microsoft-com:office:word" xmlns:a="http://schemas.openxmlformats.org/drawingml/2006/main" xmlns:pic="http://schemas.openxmlformats.org/drawingml/2006/picture" xmlns:wp="http://schemas.openxmlformats.org/drawingml/2006/wordprocessingDrawing">
   <w:body>
-    <w:bookmarkStart w:id="208" w:name="next-owner-market--change-log"/>
+    <w:bookmarkStart w:id="211" w:name="next-owner-market--change-log"/>
     <w:p>
       <w:pPr>
         <w:pStyle w:val="Heading1"/>
@@ -20,7 +20,7 @@
           <w:iCs/>
           <w:i/>
         </w:rPr>
-        <w:t xml:space="preserve">Every change to the code, database, and documents, oldest first. Generated October 2, 2026 12:37 PM from the project history (184 changes).</w:t>
+        <w:t xml:space="preserve">Every change to the code, database, and documents, oldest first. Generated October 2, 2026 2:35 PM from the project history (187 changes).</w:t>
       </w:r>
     </w:p>
     <w:bookmarkStart w:id="52" w:name="tuesday-september-29-2026"/>
@@ -23444,7 +23444,7 @@
     </w:p>
     <w:bookmarkEnd w:id="202"/>
     <w:bookmarkEnd w:id="203"/>
-    <w:bookmarkStart w:id="207" w:name="friday-october-2-2026"/>
+    <w:bookmarkStart w:id="210" w:name="friday-october-2-2026"/>
     <w:p>
       <w:pPr>
         <w:pStyle w:val="Heading2"/>
@@ -23927,8 +23927,293 @@
       </w:r>
     </w:p>
     <w:bookmarkEnd w:id="206"/>
+    <w:bookmarkStart w:id="207" w:name="Xf27dc0d15d62ed13cc1cb933845f2f19bee9ad2"/>
+    <w:p>
+      <w:pPr>
+        <w:pStyle w:val="Heading3"/>
+      </w:pPr>
+      <w:r>
+        <w:t xml:space="preserve">12:37 — Update build journal and change log</w:t>
+      </w:r>
+    </w:p>
+    <w:p>
+      <w:pPr>
+        <w:numPr>
+          <w:ilvl w:val="0"/>
+          <w:numId w:val="1185"/>
+        </w:numPr>
+        <w:pStyle w:val="Compact"/>
+      </w:pPr>
+      <w:r>
+        <w:rPr>
+          <w:bCs/>
+          <w:b/>
+        </w:rPr>
+        <w:t xml:space="preserve">Documents:</w:t>
+      </w:r>
+      <w:r>
+        <w:t xml:space="preserve"> </w:t>
+      </w:r>
+      <w:r>
+        <w:rPr>
+          <w:rStyle w:val="VerbatimChar"/>
+        </w:rPr>
+        <w:t xml:space="preserve">docs/Next_Owner_Market_Build_Journal.docx</w:t>
+      </w:r>
+      <w:r>
+        <w:t xml:space="preserve">,</w:t>
+      </w:r>
+      <w:r>
+        <w:t xml:space="preserve"> </w:t>
+      </w:r>
+      <w:r>
+        <w:rPr>
+          <w:rStyle w:val="VerbatimChar"/>
+        </w:rPr>
+        <w:t xml:space="preserve">docs/Next_Owner_Market_Build_Journal.md</w:t>
+      </w:r>
+      <w:r>
+        <w:t xml:space="preserve">,</w:t>
+      </w:r>
+      <w:r>
+        <w:t xml:space="preserve"> </w:t>
+      </w:r>
+      <w:r>
+        <w:rPr>
+          <w:rStyle w:val="VerbatimChar"/>
+        </w:rPr>
+        <w:t xml:space="preserve">docs/Next_Owner_Market_Change_Log.docx</w:t>
+      </w:r>
+      <w:r>
+        <w:t xml:space="preserve">,</w:t>
+      </w:r>
+      <w:r>
+        <w:t xml:space="preserve"> </w:t>
+      </w:r>
+      <w:r>
+        <w:rPr>
+          <w:rStyle w:val="VerbatimChar"/>
+        </w:rPr>
+        <w:t xml:space="preserve">docs/Next_Owner_Market_Change_Log.md</w:t>
+      </w:r>
+      <w:r>
+        <w:t xml:space="preserve">,</w:t>
+      </w:r>
+      <w:r>
+        <w:t xml:space="preserve"> </w:t>
+      </w:r>
+      <w:r>
+        <w:rPr>
+          <w:rStyle w:val="VerbatimChar"/>
+        </w:rPr>
+        <w:t xml:space="preserve">docs/journal_sessions/faa89acb-5a67-582b-a46a-1c3f3b736545.md</w:t>
+      </w:r>
+      <w:r>
+        <w:t xml:space="preserve">,</w:t>
+      </w:r>
+      <w:r>
+        <w:t xml:space="preserve"> </w:t>
+      </w:r>
+      <w:r>
+        <w:rPr>
+          <w:rStyle w:val="VerbatimChar"/>
+        </w:rPr>
+        <w:t xml:space="preserve">docs/journal_sessions/faa89acb-5a67-582b-a46a-1c3f3b736545.rows.json</w:t>
+      </w:r>
+    </w:p>
+    <w:p>
+      <w:pPr>
+        <w:pStyle w:val="FirstParagraph"/>
+      </w:pPr>
+      <w:r>
+        <w:t xml:space="preserve">change id 70de934</w:t>
+      </w:r>
+    </w:p>
     <w:bookmarkEnd w:id="207"/>
+    <w:bookmarkStart w:id="208" w:name="X4e9e11ffab42af26ccd07daa52382a481590a17"/>
+    <w:p>
+      <w:pPr>
+        <w:pStyle w:val="Heading3"/>
+      </w:pPr>
+      <w:r>
+        <w:t xml:space="preserve">12:38 — Facebook Page cover (1640x924, safe zone centered) and profile picture (720x720)</w:t>
+      </w:r>
+    </w:p>
+    <w:p>
+      <w:pPr>
+        <w:numPr>
+          <w:ilvl w:val="0"/>
+          <w:numId w:val="1186"/>
+        </w:numPr>
+        <w:pStyle w:val="Compact"/>
+      </w:pPr>
+      <w:r>
+        <w:rPr>
+          <w:bCs/>
+          <w:b/>
+        </w:rPr>
+        <w:t xml:space="preserve">Documents:</w:t>
+      </w:r>
+      <w:r>
+        <w:t xml:space="preserve"> </w:t>
+      </w:r>
+      <w:r>
+        <w:rPr>
+          <w:rStyle w:val="VerbatimChar"/>
+        </w:rPr>
+        <w:t xml:space="preserve">docs/brand/Next_Owner_Market_Facebook_Cover.png</w:t>
+      </w:r>
+      <w:r>
+        <w:t xml:space="preserve">,</w:t>
+      </w:r>
+      <w:r>
+        <w:t xml:space="preserve"> </w:t>
+      </w:r>
+      <w:r>
+        <w:rPr>
+          <w:rStyle w:val="VerbatimChar"/>
+        </w:rPr>
+        <w:t xml:space="preserve">docs/brand/Next_Owner_Market_Facebook_Profile.png</w:t>
+      </w:r>
+    </w:p>
+    <w:p>
+      <w:pPr>
+        <w:pStyle w:val="FirstParagraph"/>
+      </w:pPr>
+      <w:r>
+        <w:t xml:space="preserve">change id d60a122</w:t>
+      </w:r>
+    </w:p>
     <w:bookmarkEnd w:id="208"/>
+    <w:bookmarkStart w:id="209" w:name="X9d3427497d84a1e40a3970eb0d43a72710a3148"/>
+    <w:p>
+      <w:pPr>
+        <w:pStyle w:val="Heading3"/>
+      </w:pPr>
+      <w:r>
+        <w:t xml:space="preserve">12:45 — Facebook Page Kit: bio, categories, about, button, pinned post</w:t>
+      </w:r>
+    </w:p>
+    <w:p>
+      <w:pPr>
+        <w:numPr>
+          <w:ilvl w:val="0"/>
+          <w:numId w:val="1187"/>
+        </w:numPr>
+        <w:pStyle w:val="Compact"/>
+      </w:pPr>
+      <w:r>
+        <w:rPr>
+          <w:bCs/>
+          <w:b/>
+        </w:rPr>
+        <w:t xml:space="preserve">Documents:</w:t>
+      </w:r>
+      <w:r>
+        <w:t xml:space="preserve"> </w:t>
+      </w:r>
+      <w:r>
+        <w:rPr>
+          <w:rStyle w:val="VerbatimChar"/>
+        </w:rPr>
+        <w:t xml:space="preserve">docs/Next_Owner_Market_Build_Journal.docx</w:t>
+      </w:r>
+      <w:r>
+        <w:t xml:space="preserve">,</w:t>
+      </w:r>
+      <w:r>
+        <w:t xml:space="preserve"> </w:t>
+      </w:r>
+      <w:r>
+        <w:rPr>
+          <w:rStyle w:val="VerbatimChar"/>
+        </w:rPr>
+        <w:t xml:space="preserve">docs/Next_Owner_Market_Build_Journal.md</w:t>
+      </w:r>
+      <w:r>
+        <w:t xml:space="preserve">,</w:t>
+      </w:r>
+      <w:r>
+        <w:t xml:space="preserve"> </w:t>
+      </w:r>
+      <w:r>
+        <w:rPr>
+          <w:rStyle w:val="VerbatimChar"/>
+        </w:rPr>
+        <w:t xml:space="preserve">docs/Next_Owner_Market_Facebook_Page_Kit.docx</w:t>
+      </w:r>
+      <w:r>
+        <w:t xml:space="preserve">,</w:t>
+      </w:r>
+      <w:r>
+        <w:t xml:space="preserve"> </w:t>
+      </w:r>
+      <w:r>
+        <w:rPr>
+          <w:rStyle w:val="VerbatimChar"/>
+        </w:rPr>
+        <w:t xml:space="preserve">docs/Next_Owner_Market_Facebook_Page_Kit.md</w:t>
+      </w:r>
+      <w:r>
+        <w:t xml:space="preserve">,</w:t>
+      </w:r>
+      <w:r>
+        <w:t xml:space="preserve"> </w:t>
+      </w:r>
+      <w:r>
+        <w:rPr>
+          <w:rStyle w:val="VerbatimChar"/>
+        </w:rPr>
+        <w:t xml:space="preserve">docs/Next_Owner_Market_File_Index.docx</w:t>
+      </w:r>
+      <w:r>
+        <w:t xml:space="preserve">,</w:t>
+      </w:r>
+      <w:r>
+        <w:t xml:space="preserve"> </w:t>
+      </w:r>
+      <w:r>
+        <w:rPr>
+          <w:rStyle w:val="VerbatimChar"/>
+        </w:rPr>
+        <w:t xml:space="preserve">docs/Next_Owner_Market_File_Index.md</w:t>
+      </w:r>
+      <w:r>
+        <w:t xml:space="preserve">,</w:t>
+      </w:r>
+      <w:r>
+        <w:t xml:space="preserve"> </w:t>
+      </w:r>
+      <w:r>
+        <w:rPr>
+          <w:rStyle w:val="VerbatimChar"/>
+        </w:rPr>
+        <w:t xml:space="preserve">docs/journal_sessions/faa89acb-5a67-582b-a46a-1c3f3b736545.md</w:t>
+      </w:r>
+      <w:r>
+        <w:t xml:space="preserve">,</w:t>
+      </w:r>
+      <w:r>
+        <w:t xml:space="preserve"> </w:t>
+      </w:r>
+      <w:r>
+        <w:rPr>
+          <w:rStyle w:val="VerbatimChar"/>
+        </w:rPr>
+        <w:t xml:space="preserve">docs/journal_sessions/faa89acb-5a67-582b-a46a-1c3f3b736545.rows.json</w:t>
+      </w:r>
+    </w:p>
+    <w:p>
+      <w:pPr>
+        <w:pStyle w:val="FirstParagraph"/>
+      </w:pPr>
+      <w:r>
+        <w:t xml:space="preserve">change id 9e2c29c</w:t>
+      </w:r>
+    </w:p>
+    <w:bookmarkEnd w:id="209"/>
+    <w:bookmarkEnd w:id="210"/>
+    <w:bookmarkEnd w:id="211"/>
     <w:sectPr/>
   </w:body>
 </w:document>
@@ -24664,6 +24949,15 @@
     <w:abstractNumId w:val="991"/>
   </w:num>
   <w:num w:numId="1184">
+    <w:abstractNumId w:val="991"/>
+  </w:num>
+  <w:num w:numId="1185">
+    <w:abstractNumId w:val="991"/>
+  </w:num>
+  <w:num w:numId="1186">
+    <w:abstractNumId w:val="991"/>
+  </w:num>
+  <w:num w:numId="1187">
     <w:abstractNumId w:val="991"/>
   </w:num>
 </w:numbering>

</xml_diff>

<commit_message>
Guides: Something wrong? Tell it
Co-Authored-By: Claude Opus 5.5 <noreply@anthropic.com>
Claude-Session: https://claude.ai/code/session_01JPZJaTbXQFN2qiYRf4rkZK
</commit_message>
<xml_diff>
--- a/docs/Next_Owner_Market_Change_Log.docx
+++ b/docs/Next_Owner_Market_Change_Log.docx
@@ -2,7 +2,7 @@
 <file path=word/document.xml><?xml version="1.0" encoding="utf-8"?>
 <w:document xmlns:w="http://schemas.openxmlformats.org/wordprocessingml/2006/main" xmlns:m="http://schemas.openxmlformats.org/officeDocument/2006/math" xmlns:r="http://schemas.openxmlformats.org/officeDocument/2006/relationships" xmlns:o="urn:schemas-microsoft-com:office:office" xmlns:v="urn:schemas-microsoft-com:vml" xmlns:w10="urn:schemas-microsoft-com:office:word" xmlns:a="http://schemas.openxmlformats.org/drawingml/2006/main" xmlns:pic="http://schemas.openxmlformats.org/drawingml/2006/picture" xmlns:wp="http://schemas.openxmlformats.org/drawingml/2006/wordprocessingDrawing">
   <w:body>
-    <w:bookmarkStart w:id="211" w:name="next-owner-market--change-log"/>
+    <w:bookmarkStart w:id="214" w:name="next-owner-market--change-log"/>
     <w:p>
       <w:pPr>
         <w:pStyle w:val="Heading1"/>
@@ -20,7 +20,7 @@
           <w:iCs/>
           <w:i/>
         </w:rPr>
-        <w:t xml:space="preserve">Every change to the code, database, and documents, oldest first. Generated October 2, 2026 2:35 PM from the project history (187 changes).</w:t>
+        <w:t xml:space="preserve">Every change to the code, database, and documents, oldest first. Generated October 2, 2026 7:17 PM from the project history (190 changes).</w:t>
       </w:r>
     </w:p>
     <w:bookmarkStart w:id="52" w:name="tuesday-september-29-2026"/>
@@ -23444,7 +23444,7 @@
     </w:p>
     <w:bookmarkEnd w:id="202"/>
     <w:bookmarkEnd w:id="203"/>
-    <w:bookmarkStart w:id="210" w:name="friday-october-2-2026"/>
+    <w:bookmarkStart w:id="213" w:name="friday-october-2-2026"/>
     <w:p>
       <w:pPr>
         <w:pStyle w:val="Heading2"/>
@@ -24212,8 +24212,368 @@
       </w:r>
     </w:p>
     <w:bookmarkEnd w:id="209"/>
+    <w:bookmarkStart w:id="210" w:name="X329cbb05820b87d940b5ae95f0d2fb43542a234"/>
+    <w:p>
+      <w:pPr>
+        <w:pStyle w:val="Heading3"/>
+      </w:pPr>
+      <w:r>
+        <w:t xml:space="preserve">14:35 — Prologue: add the Sept 22, 26 and 28 warehouse chats word for word</w:t>
+      </w:r>
+    </w:p>
+    <w:p>
+      <w:pPr>
+        <w:numPr>
+          <w:ilvl w:val="0"/>
+          <w:numId w:val="1188"/>
+        </w:numPr>
+        <w:pStyle w:val="Compact"/>
+      </w:pPr>
+      <w:r>
+        <w:rPr>
+          <w:bCs/>
+          <w:b/>
+        </w:rPr>
+        <w:t xml:space="preserve">Documents:</w:t>
+      </w:r>
+      <w:r>
+        <w:t xml:space="preserve"> </w:t>
+      </w:r>
+      <w:r>
+        <w:rPr>
+          <w:rStyle w:val="VerbatimChar"/>
+        </w:rPr>
+        <w:t xml:space="preserve">docs/Next_Owner_Market_Build_Journal.docx</w:t>
+      </w:r>
+      <w:r>
+        <w:t xml:space="preserve">,</w:t>
+      </w:r>
+      <w:r>
+        <w:t xml:space="preserve"> </w:t>
+      </w:r>
+      <w:r>
+        <w:rPr>
+          <w:rStyle w:val="VerbatimChar"/>
+        </w:rPr>
+        <w:t xml:space="preserve">docs/Next_Owner_Market_Build_Journal.md</w:t>
+      </w:r>
+      <w:r>
+        <w:t xml:space="preserve">,</w:t>
+      </w:r>
+      <w:r>
+        <w:t xml:space="preserve"> </w:t>
+      </w:r>
+      <w:r>
+        <w:rPr>
+          <w:rStyle w:val="VerbatimChar"/>
+        </w:rPr>
+        <w:t xml:space="preserve">docs/Next_Owner_Market_Change_Log.docx</w:t>
+      </w:r>
+      <w:r>
+        <w:t xml:space="preserve">,</w:t>
+      </w:r>
+      <w:r>
+        <w:t xml:space="preserve"> </w:t>
+      </w:r>
+      <w:r>
+        <w:rPr>
+          <w:rStyle w:val="VerbatimChar"/>
+        </w:rPr>
+        <w:t xml:space="preserve">docs/Next_Owner_Market_Change_Log.md</w:t>
+      </w:r>
+      <w:r>
+        <w:t xml:space="preserve">,</w:t>
+      </w:r>
+      <w:r>
+        <w:t xml:space="preserve"> </w:t>
+      </w:r>
+      <w:r>
+        <w:rPr>
+          <w:rStyle w:val="VerbatimChar"/>
+        </w:rPr>
+        <w:t xml:space="preserve">docs/journal_prologue.md</w:t>
+      </w:r>
+      <w:r>
+        <w:t xml:space="preserve">,</w:t>
+      </w:r>
+      <w:r>
+        <w:t xml:space="preserve"> </w:t>
+      </w:r>
+      <w:r>
+        <w:rPr>
+          <w:rStyle w:val="VerbatimChar"/>
+        </w:rPr>
+        <w:t xml:space="preserve">docs/journal_sessions/faa89acb-5a67-582b-a46a-1c3f3b736545.md</w:t>
+      </w:r>
+      <w:r>
+        <w:t xml:space="preserve">,</w:t>
+      </w:r>
+      <w:r>
+        <w:t xml:space="preserve"> </w:t>
+      </w:r>
+      <w:r>
+        <w:rPr>
+          <w:rStyle w:val="VerbatimChar"/>
+        </w:rPr>
+        <w:t xml:space="preserve">docs/journal_sessions/faa89acb-5a67-582b-a46a-1c3f3b736545.rows.json</w:t>
+      </w:r>
+    </w:p>
+    <w:p>
+      <w:pPr>
+        <w:pStyle w:val="FirstParagraph"/>
+      </w:pPr>
+      <w:r>
+        <w:t xml:space="preserve">change id c3e44e1</w:t>
+      </w:r>
+    </w:p>
     <w:bookmarkEnd w:id="210"/>
+    <w:bookmarkStart w:id="211" w:name="Xe82bf16bf2df741497918293e952119ad42edf4"/>
+    <w:p>
+      <w:pPr>
+        <w:pStyle w:val="Heading3"/>
+      </w:pPr>
+      <w:r>
+        <w:t xml:space="preserve">18:21 — Operating rules: add rule 19 (one complete answer) and rule 20 (send records after every batch)</w:t>
+      </w:r>
+    </w:p>
+    <w:p>
+      <w:pPr>
+        <w:numPr>
+          <w:ilvl w:val="0"/>
+          <w:numId w:val="1189"/>
+        </w:numPr>
+        <w:pStyle w:val="Compact"/>
+      </w:pPr>
+      <w:r>
+        <w:rPr>
+          <w:bCs/>
+          <w:b/>
+        </w:rPr>
+        <w:t xml:space="preserve">Documents:</w:t>
+      </w:r>
+      <w:r>
+        <w:t xml:space="preserve"> </w:t>
+      </w:r>
+      <w:r>
+        <w:rPr>
+          <w:rStyle w:val="VerbatimChar"/>
+        </w:rPr>
+        <w:t xml:space="preserve">docs/Next_Owner_Market_Operating_Rules.docx</w:t>
+      </w:r>
+      <w:r>
+        <w:t xml:space="preserve">,</w:t>
+      </w:r>
+      <w:r>
+        <w:t xml:space="preserve"> </w:t>
+      </w:r>
+      <w:r>
+        <w:rPr>
+          <w:rStyle w:val="VerbatimChar"/>
+        </w:rPr>
+        <w:t xml:space="preserve">docs/Next_Owner_Market_Operating_Rules.md</w:t>
+      </w:r>
+    </w:p>
+    <w:p>
+      <w:pPr>
+        <w:pStyle w:val="FirstParagraph"/>
+      </w:pPr>
+      <w:r>
+        <w:t xml:space="preserve">change id bfee1fc</w:t>
+      </w:r>
+    </w:p>
     <w:bookmarkEnd w:id="211"/>
+    <w:bookmarkStart w:id="212" w:name="Xd763a2e8ab62ed21095fa139c34d5cb2f40425d"/>
+    <w:p>
+      <w:pPr>
+        <w:pStyle w:val="Heading3"/>
+      </w:pPr>
+      <w:r>
+        <w:t xml:space="preserve">19:14 — Something wrong? Tell it: fix box under every AI answer (What's it worth, Buy or Pass, Sort the pile). Type or talk a correction, same photos re-checked, free, updates the same check</w:t>
+      </w:r>
+    </w:p>
+    <w:p>
+      <w:pPr>
+        <w:numPr>
+          <w:ilvl w:val="0"/>
+          <w:numId w:val="1190"/>
+        </w:numPr>
+        <w:pStyle w:val="Compact"/>
+      </w:pPr>
+      <w:r>
+        <w:rPr>
+          <w:bCs/>
+          <w:b/>
+        </w:rPr>
+        <w:t xml:space="preserve">Documents:</w:t>
+      </w:r>
+      <w:r>
+        <w:t xml:space="preserve"> </w:t>
+      </w:r>
+      <w:r>
+        <w:rPr>
+          <w:rStyle w:val="VerbatimChar"/>
+        </w:rPr>
+        <w:t xml:space="preserve">docs/Next_Owner_Market_Build_Journal.md</w:t>
+      </w:r>
+      <w:r>
+        <w:t xml:space="preserve">,</w:t>
+      </w:r>
+      <w:r>
+        <w:t xml:space="preserve"> </w:t>
+      </w:r>
+      <w:r>
+        <w:rPr>
+          <w:rStyle w:val="VerbatimChar"/>
+        </w:rPr>
+        <w:t xml:space="preserve">docs/journal_sessions/faa89acb-5a67-582b-a46a-1c3f3b736545.md</w:t>
+      </w:r>
+      <w:r>
+        <w:t xml:space="preserve">,</w:t>
+      </w:r>
+      <w:r>
+        <w:t xml:space="preserve"> </w:t>
+      </w:r>
+      <w:r>
+        <w:rPr>
+          <w:rStyle w:val="VerbatimChar"/>
+        </w:rPr>
+        <w:t xml:space="preserve">docs/journal_sessions/faa89acb-5a67-582b-a46a-1c3f3b736545.rows.json</w:t>
+      </w:r>
+    </w:p>
+    <w:p>
+      <w:pPr>
+        <w:numPr>
+          <w:ilvl w:val="0"/>
+          <w:numId w:val="1190"/>
+        </w:numPr>
+        <w:pStyle w:val="Compact"/>
+      </w:pPr>
+      <w:r>
+        <w:rPr>
+          <w:bCs/>
+          <w:b/>
+        </w:rPr>
+        <w:t xml:space="preserve">Server routes (API):</w:t>
+      </w:r>
+      <w:r>
+        <w:t xml:space="preserve"> </w:t>
+      </w:r>
+      <w:r>
+        <w:rPr>
+          <w:rStyle w:val="VerbatimChar"/>
+        </w:rPr>
+        <w:t xml:space="preserve">src/app/api/buy-or-pass/route.ts</w:t>
+      </w:r>
+      <w:r>
+        <w:t xml:space="preserve">,</w:t>
+      </w:r>
+      <w:r>
+        <w:t xml:space="preserve"> </w:t>
+      </w:r>
+      <w:r>
+        <w:rPr>
+          <w:rStyle w:val="VerbatimChar"/>
+        </w:rPr>
+        <w:t xml:space="preserve">src/app/api/pile/route.ts</w:t>
+      </w:r>
+      <w:r>
+        <w:t xml:space="preserve">,</w:t>
+      </w:r>
+      <w:r>
+        <w:t xml:space="preserve"> </w:t>
+      </w:r>
+      <w:r>
+        <w:rPr>
+          <w:rStyle w:val="VerbatimChar"/>
+        </w:rPr>
+        <w:t xml:space="preserve">src/app/api/worth/route.ts</w:t>
+      </w:r>
+    </w:p>
+    <w:p>
+      <w:pPr>
+        <w:numPr>
+          <w:ilvl w:val="0"/>
+          <w:numId w:val="1190"/>
+        </w:numPr>
+        <w:pStyle w:val="Compact"/>
+      </w:pPr>
+      <w:r>
+        <w:rPr>
+          <w:bCs/>
+          <w:b/>
+        </w:rPr>
+        <w:t xml:space="preserve">Public site pages:</w:t>
+      </w:r>
+      <w:r>
+        <w:t xml:space="preserve"> </w:t>
+      </w:r>
+      <w:r>
+        <w:rPr>
+          <w:rStyle w:val="VerbatimChar"/>
+        </w:rPr>
+        <w:t xml:space="preserve">src/app/buy-or-pass/BuyPassClient.tsx</w:t>
+      </w:r>
+      <w:r>
+        <w:t xml:space="preserve">,</w:t>
+      </w:r>
+      <w:r>
+        <w:t xml:space="preserve"> </w:t>
+      </w:r>
+      <w:r>
+        <w:rPr>
+          <w:rStyle w:val="VerbatimChar"/>
+        </w:rPr>
+        <w:t xml:space="preserve">src/app/pile/PileClient.tsx</w:t>
+      </w:r>
+      <w:r>
+        <w:t xml:space="preserve">,</w:t>
+      </w:r>
+      <w:r>
+        <w:t xml:space="preserve"> </w:t>
+      </w:r>
+      <w:r>
+        <w:rPr>
+          <w:rStyle w:val="VerbatimChar"/>
+        </w:rPr>
+        <w:t xml:space="preserve">src/app/worth/WorthClient.tsx</w:t>
+      </w:r>
+    </w:p>
+    <w:p>
+      <w:pPr>
+        <w:numPr>
+          <w:ilvl w:val="0"/>
+          <w:numId w:val="1190"/>
+        </w:numPr>
+        <w:pStyle w:val="Compact"/>
+      </w:pPr>
+      <w:r>
+        <w:rPr>
+          <w:bCs/>
+          <w:b/>
+        </w:rPr>
+        <w:t xml:space="preserve">Shared UI pieces:</w:t>
+      </w:r>
+      <w:r>
+        <w:t xml:space="preserve"> </w:t>
+      </w:r>
+      <w:r>
+        <w:rPr>
+          <w:rStyle w:val="VerbatimChar"/>
+        </w:rPr>
+        <w:t xml:space="preserve">src/components/FixBox.tsx</w:t>
+      </w:r>
+    </w:p>
+    <w:p>
+      <w:pPr>
+        <w:pStyle w:val="FirstParagraph"/>
+      </w:pPr>
+      <w:r>
+        <w:t xml:space="preserve">change id 3756bc5</w:t>
+      </w:r>
+    </w:p>
+    <w:bookmarkEnd w:id="212"/>
+    <w:bookmarkEnd w:id="213"/>
+    <w:bookmarkEnd w:id="214"/>
     <w:sectPr/>
   </w:body>
 </w:document>
@@ -24958,6 +25318,15 @@
     <w:abstractNumId w:val="991"/>
   </w:num>
   <w:num w:numId="1187">
+    <w:abstractNumId w:val="991"/>
+  </w:num>
+  <w:num w:numId="1188">
+    <w:abstractNumId w:val="991"/>
+  </w:num>
+  <w:num w:numId="1189">
+    <w:abstractNumId w:val="991"/>
+  </w:num>
+  <w:num w:numId="1190">
     <w:abstractNumId w:val="991"/>
   </w:num>
 </w:numbering>

</xml_diff>

<commit_message>
Docs: Missing a part? Find it (guides, white paper, walkthrough)
Co-Authored-By: Claude Opus 5.5 <noreply@anthropic.com>
Claude-Session: https://claude.ai/code/session_01JPZJaTbXQFN2qiYRf4rkZK
</commit_message>
<xml_diff>
--- a/docs/Next_Owner_Market_Change_Log.docx
+++ b/docs/Next_Owner_Market_Change_Log.docx
@@ -2,7 +2,7 @@
 <file path=word/document.xml><?xml version="1.0" encoding="utf-8"?>
 <w:document xmlns:w="http://schemas.openxmlformats.org/wordprocessingml/2006/main" xmlns:m="http://schemas.openxmlformats.org/officeDocument/2006/math" xmlns:r="http://schemas.openxmlformats.org/officeDocument/2006/relationships" xmlns:o="urn:schemas-microsoft-com:office:office" xmlns:v="urn:schemas-microsoft-com:vml" xmlns:w10="urn:schemas-microsoft-com:office:word" xmlns:a="http://schemas.openxmlformats.org/drawingml/2006/main" xmlns:pic="http://schemas.openxmlformats.org/drawingml/2006/picture" xmlns:wp="http://schemas.openxmlformats.org/drawingml/2006/wordprocessingDrawing">
   <w:body>
-    <w:bookmarkStart w:id="215" w:name="next-owner-market--change-log"/>
+    <w:bookmarkStart w:id="218" w:name="next-owner-market--change-log"/>
     <w:p>
       <w:pPr>
         <w:pStyle w:val="Heading1"/>
@@ -20,7 +20,7 @@
           <w:iCs/>
           <w:i/>
         </w:rPr>
-        <w:t xml:space="preserve">Every change to the code, database, and documents, oldest first. Generated October 2, 2026 7:20 PM from the project history (191 changes).</w:t>
+        <w:t xml:space="preserve">Every change to the code, database, and documents, oldest first. Generated October 2, 2026 7:32 PM from the project history (194 changes).</w:t>
       </w:r>
     </w:p>
     <w:bookmarkStart w:id="52" w:name="tuesday-september-29-2026"/>
@@ -23444,7 +23444,7 @@
     </w:p>
     <w:bookmarkEnd w:id="202"/>
     <w:bookmarkEnd w:id="203"/>
-    <w:bookmarkStart w:id="214" w:name="friday-october-2-2026"/>
+    <w:bookmarkStart w:id="217" w:name="friday-october-2-2026"/>
     <w:p>
       <w:pPr>
         <w:pStyle w:val="Heading2"/>
@@ -24723,8 +24723,320 @@
       </w:r>
     </w:p>
     <w:bookmarkEnd w:id="213"/>
+    <w:bookmarkStart w:id="214" w:name="Xa4ba38d6524a2deb65b86c627da13a6015f6741"/>
+    <w:p>
+      <w:pPr>
+        <w:pStyle w:val="Heading3"/>
+      </w:pPr>
+      <w:r>
+        <w:t xml:space="preserve">19:20 — Update build journal and change log</w:t>
+      </w:r>
+    </w:p>
+    <w:p>
+      <w:pPr>
+        <w:numPr>
+          <w:ilvl w:val="0"/>
+          <w:numId w:val="1192"/>
+        </w:numPr>
+        <w:pStyle w:val="Compact"/>
+      </w:pPr>
+      <w:r>
+        <w:rPr>
+          <w:bCs/>
+          <w:b/>
+        </w:rPr>
+        <w:t xml:space="preserve">Documents:</w:t>
+      </w:r>
+      <w:r>
+        <w:t xml:space="preserve"> </w:t>
+      </w:r>
+      <w:r>
+        <w:rPr>
+          <w:rStyle w:val="VerbatimChar"/>
+        </w:rPr>
+        <w:t xml:space="preserve">docs/Next_Owner_Market_Build_Journal.docx</w:t>
+      </w:r>
+      <w:r>
+        <w:t xml:space="preserve">,</w:t>
+      </w:r>
+      <w:r>
+        <w:t xml:space="preserve"> </w:t>
+      </w:r>
+      <w:r>
+        <w:rPr>
+          <w:rStyle w:val="VerbatimChar"/>
+        </w:rPr>
+        <w:t xml:space="preserve">docs/Next_Owner_Market_Build_Journal.md</w:t>
+      </w:r>
+      <w:r>
+        <w:t xml:space="preserve">,</w:t>
+      </w:r>
+      <w:r>
+        <w:t xml:space="preserve"> </w:t>
+      </w:r>
+      <w:r>
+        <w:rPr>
+          <w:rStyle w:val="VerbatimChar"/>
+        </w:rPr>
+        <w:t xml:space="preserve">docs/Next_Owner_Market_Change_Log.docx</w:t>
+      </w:r>
+      <w:r>
+        <w:t xml:space="preserve">,</w:t>
+      </w:r>
+      <w:r>
+        <w:t xml:space="preserve"> </w:t>
+      </w:r>
+      <w:r>
+        <w:rPr>
+          <w:rStyle w:val="VerbatimChar"/>
+        </w:rPr>
+        <w:t xml:space="preserve">docs/Next_Owner_Market_Change_Log.md</w:t>
+      </w:r>
+      <w:r>
+        <w:t xml:space="preserve">,</w:t>
+      </w:r>
+      <w:r>
+        <w:t xml:space="preserve"> </w:t>
+      </w:r>
+      <w:r>
+        <w:rPr>
+          <w:rStyle w:val="VerbatimChar"/>
+        </w:rPr>
+        <w:t xml:space="preserve">docs/journal_sessions/faa89acb-5a67-582b-a46a-1c3f3b736545.md</w:t>
+      </w:r>
+      <w:r>
+        <w:t xml:space="preserve">,</w:t>
+      </w:r>
+      <w:r>
+        <w:t xml:space="preserve"> </w:t>
+      </w:r>
+      <w:r>
+        <w:rPr>
+          <w:rStyle w:val="VerbatimChar"/>
+        </w:rPr>
+        <w:t xml:space="preserve">docs/journal_sessions/faa89acb-5a67-582b-a46a-1c3f3b736545.rows.json</w:t>
+      </w:r>
+    </w:p>
+    <w:p>
+      <w:pPr>
+        <w:pStyle w:val="FirstParagraph"/>
+      </w:pPr>
+      <w:r>
+        <w:t xml:space="preserve">change id 3f0912e</w:t>
+      </w:r>
+    </w:p>
     <w:bookmarkEnd w:id="214"/>
+    <w:bookmarkStart w:id="215" w:name="X21f4957bbca929a3dc132a3b862e072138bde20"/>
+    <w:p>
+      <w:pPr>
+        <w:pStyle w:val="Heading3"/>
+      </w:pPr>
+      <w:r>
+        <w:t xml:space="preserve">19:29 — Missing a part? Find it: every lookup (What's it worth, Buy or Pass, Sort the pile) names missing/worn parts, part price, value with the part, profit with it, and Amazon/eBay search buttons (affiliate IDs slot in from settings)</w:t>
+      </w:r>
+    </w:p>
+    <w:p>
+      <w:pPr>
+        <w:numPr>
+          <w:ilvl w:val="0"/>
+          <w:numId w:val="1193"/>
+        </w:numPr>
+        <w:pStyle w:val="Compact"/>
+      </w:pPr>
+      <w:r>
+        <w:rPr>
+          <w:bCs/>
+          <w:b/>
+        </w:rPr>
+        <w:t xml:space="preserve">Server routes (API):</w:t>
+      </w:r>
+      <w:r>
+        <w:t xml:space="preserve"> </w:t>
+      </w:r>
+      <w:r>
+        <w:rPr>
+          <w:rStyle w:val="VerbatimChar"/>
+        </w:rPr>
+        <w:t xml:space="preserve">src/app/api/buy-or-pass/route.ts</w:t>
+      </w:r>
+      <w:r>
+        <w:t xml:space="preserve">,</w:t>
+      </w:r>
+      <w:r>
+        <w:t xml:space="preserve"> </w:t>
+      </w:r>
+      <w:r>
+        <w:rPr>
+          <w:rStyle w:val="VerbatimChar"/>
+        </w:rPr>
+        <w:t xml:space="preserve">src/app/api/pile/route.ts</w:t>
+      </w:r>
+      <w:r>
+        <w:t xml:space="preserve">,</w:t>
+      </w:r>
+      <w:r>
+        <w:t xml:space="preserve"> </w:t>
+      </w:r>
+      <w:r>
+        <w:rPr>
+          <w:rStyle w:val="VerbatimChar"/>
+        </w:rPr>
+        <w:t xml:space="preserve">src/app/api/worth/route.ts</w:t>
+      </w:r>
+    </w:p>
+    <w:p>
+      <w:pPr>
+        <w:numPr>
+          <w:ilvl w:val="0"/>
+          <w:numId w:val="1193"/>
+        </w:numPr>
+        <w:pStyle w:val="Compact"/>
+      </w:pPr>
+      <w:r>
+        <w:rPr>
+          <w:bCs/>
+          <w:b/>
+        </w:rPr>
+        <w:t xml:space="preserve">Public site pages:</w:t>
+      </w:r>
+      <w:r>
+        <w:t xml:space="preserve"> </w:t>
+      </w:r>
+      <w:r>
+        <w:rPr>
+          <w:rStyle w:val="VerbatimChar"/>
+        </w:rPr>
+        <w:t xml:space="preserve">src/app/buy-or-pass/BuyPassClient.tsx</w:t>
+      </w:r>
+      <w:r>
+        <w:t xml:space="preserve">,</w:t>
+      </w:r>
+      <w:r>
+        <w:t xml:space="preserve"> </w:t>
+      </w:r>
+      <w:r>
+        <w:rPr>
+          <w:rStyle w:val="VerbatimChar"/>
+        </w:rPr>
+        <w:t xml:space="preserve">src/app/pile/PileClient.tsx</w:t>
+      </w:r>
+      <w:r>
+        <w:t xml:space="preserve">,</w:t>
+      </w:r>
+      <w:r>
+        <w:t xml:space="preserve"> </w:t>
+      </w:r>
+      <w:r>
+        <w:rPr>
+          <w:rStyle w:val="VerbatimChar"/>
+        </w:rPr>
+        <w:t xml:space="preserve">src/app/worth/WorthClient.tsx</w:t>
+      </w:r>
+    </w:p>
+    <w:p>
+      <w:pPr>
+        <w:numPr>
+          <w:ilvl w:val="0"/>
+          <w:numId w:val="1193"/>
+        </w:numPr>
+        <w:pStyle w:val="Compact"/>
+      </w:pPr>
+      <w:r>
+        <w:rPr>
+          <w:bCs/>
+          <w:b/>
+        </w:rPr>
+        <w:t xml:space="preserve">Shared UI pieces:</w:t>
+      </w:r>
+      <w:r>
+        <w:t xml:space="preserve"> </w:t>
+      </w:r>
+      <w:r>
+        <w:rPr>
+          <w:rStyle w:val="VerbatimChar"/>
+        </w:rPr>
+        <w:t xml:space="preserve">src/components/PartsBox.tsx</w:t>
+      </w:r>
+    </w:p>
+    <w:p>
+      <w:pPr>
+        <w:numPr>
+          <w:ilvl w:val="0"/>
+          <w:numId w:val="1193"/>
+        </w:numPr>
+        <w:pStyle w:val="Compact"/>
+      </w:pPr>
+      <w:r>
+        <w:rPr>
+          <w:bCs/>
+          <w:b/>
+        </w:rPr>
+        <w:t xml:space="preserve">Shared code (logic):</w:t>
+      </w:r>
+      <w:r>
+        <w:t xml:space="preserve"> </w:t>
+      </w:r>
+      <w:r>
+        <w:rPr>
+          <w:rStyle w:val="VerbatimChar"/>
+        </w:rPr>
+        <w:t xml:space="preserve">src/lib/parts.ts</w:t>
+      </w:r>
+    </w:p>
+    <w:p>
+      <w:pPr>
+        <w:pStyle w:val="FirstParagraph"/>
+      </w:pPr>
+      <w:r>
+        <w:t xml:space="preserve">change id 95bc65b</w:t>
+      </w:r>
+    </w:p>
     <w:bookmarkEnd w:id="215"/>
+    <w:bookmarkStart w:id="216" w:name="X1e644bf9f651d9e8e5ddb106f17aacc84a0f872"/>
+    <w:p>
+      <w:pPr>
+        <w:pStyle w:val="Heading3"/>
+      </w:pPr>
+      <w:r>
+        <w:t xml:space="preserve">19:32 — Parts: clean search phrases (no notes or parentheses)</w:t>
+      </w:r>
+    </w:p>
+    <w:p>
+      <w:pPr>
+        <w:numPr>
+          <w:ilvl w:val="0"/>
+          <w:numId w:val="1194"/>
+        </w:numPr>
+        <w:pStyle w:val="Compact"/>
+      </w:pPr>
+      <w:r>
+        <w:rPr>
+          <w:bCs/>
+          <w:b/>
+        </w:rPr>
+        <w:t xml:space="preserve">Shared code (logic):</w:t>
+      </w:r>
+      <w:r>
+        <w:t xml:space="preserve"> </w:t>
+      </w:r>
+      <w:r>
+        <w:rPr>
+          <w:rStyle w:val="VerbatimChar"/>
+        </w:rPr>
+        <w:t xml:space="preserve">src/lib/parts.ts</w:t>
+      </w:r>
+    </w:p>
+    <w:p>
+      <w:pPr>
+        <w:pStyle w:val="FirstParagraph"/>
+      </w:pPr>
+      <w:r>
+        <w:t xml:space="preserve">change id ca0638c</w:t>
+      </w:r>
+    </w:p>
+    <w:bookmarkEnd w:id="216"/>
+    <w:bookmarkEnd w:id="217"/>
+    <w:bookmarkEnd w:id="218"/>
     <w:sectPr/>
   </w:body>
 </w:document>
@@ -25481,6 +25793,15 @@
     <w:abstractNumId w:val="991"/>
   </w:num>
   <w:num w:numId="1191">
+    <w:abstractNumId w:val="991"/>
+  </w:num>
+  <w:num w:numId="1192">
+    <w:abstractNumId w:val="991"/>
+  </w:num>
+  <w:num w:numId="1193">
+    <w:abstractNumId w:val="991"/>
+  </w:num>
+  <w:num w:numId="1194">
     <w:abstractNumId w:val="991"/>
   </w:num>
 </w:numbering>

</xml_diff>

<commit_message>
Records: journal and change log
Co-Authored-By: Claude Opus 5.5 <noreply@anthropic.com>
Claude-Session: https://claude.ai/code/session_01JPZJaTbXQFN2qiYRf4rkZK
</commit_message>
<xml_diff>
--- a/docs/Next_Owner_Market_Change_Log.docx
+++ b/docs/Next_Owner_Market_Change_Log.docx
@@ -2,7 +2,7 @@
 <file path=word/document.xml><?xml version="1.0" encoding="utf-8"?>
 <w:document xmlns:w="http://schemas.openxmlformats.org/wordprocessingml/2006/main" xmlns:m="http://schemas.openxmlformats.org/officeDocument/2006/math" xmlns:r="http://schemas.openxmlformats.org/officeDocument/2006/relationships" xmlns:o="urn:schemas-microsoft-com:office:office" xmlns:v="urn:schemas-microsoft-com:vml" xmlns:w10="urn:schemas-microsoft-com:office:word" xmlns:a="http://schemas.openxmlformats.org/drawingml/2006/main" xmlns:pic="http://schemas.openxmlformats.org/drawingml/2006/picture" xmlns:wp="http://schemas.openxmlformats.org/drawingml/2006/wordprocessingDrawing">
   <w:body>
-    <w:bookmarkStart w:id="218" w:name="next-owner-market--change-log"/>
+    <w:bookmarkStart w:id="219" w:name="next-owner-market--change-log"/>
     <w:p>
       <w:pPr>
         <w:pStyle w:val="Heading1"/>
@@ -20,7 +20,7 @@
           <w:iCs/>
           <w:i/>
         </w:rPr>
-        <w:t xml:space="preserve">Every change to the code, database, and documents, oldest first. Generated October 2, 2026 7:32 PM from the project history (194 changes).</w:t>
+        <w:t xml:space="preserve">Every change to the code, database, and documents, oldest first. Generated October 2, 2026 7:35 PM from the project history (195 changes).</w:t>
       </w:r>
     </w:p>
     <w:bookmarkStart w:id="52" w:name="tuesday-september-29-2026"/>
@@ -23444,7 +23444,7 @@
     </w:p>
     <w:bookmarkEnd w:id="202"/>
     <w:bookmarkEnd w:id="203"/>
-    <w:bookmarkStart w:id="217" w:name="friday-october-2-2026"/>
+    <w:bookmarkStart w:id="218" w:name="friday-october-2-2026"/>
     <w:p>
       <w:pPr>
         <w:pStyle w:val="Heading2"/>
@@ -25035,8 +25035,189 @@
       </w:r>
     </w:p>
     <w:bookmarkEnd w:id="216"/>
+    <w:bookmarkStart w:id="217" w:name="X7a9e5f9155dcbc842ca633a510969549807e296"/>
+    <w:p>
+      <w:pPr>
+        <w:pStyle w:val="Heading3"/>
+      </w:pPr>
+      <w:r>
+        <w:t xml:space="preserve">19:35 — Docs: Missing a part? Find it (guides, white paper, walkthrough)</w:t>
+      </w:r>
+    </w:p>
+    <w:p>
+      <w:pPr>
+        <w:numPr>
+          <w:ilvl w:val="0"/>
+          <w:numId w:val="1195"/>
+        </w:numPr>
+        <w:pStyle w:val="Compact"/>
+      </w:pPr>
+      <w:r>
+        <w:rPr>
+          <w:bCs/>
+          <w:b/>
+        </w:rPr>
+        <w:t xml:space="preserve">Documents:</w:t>
+      </w:r>
+      <w:r>
+        <w:t xml:space="preserve"> </w:t>
+      </w:r>
+      <w:r>
+        <w:rPr>
+          <w:rStyle w:val="VerbatimChar"/>
+        </w:rPr>
+        <w:t xml:space="preserve">docs/Next_Owner_Market_Build_Journal.docx</w:t>
+      </w:r>
+      <w:r>
+        <w:t xml:space="preserve">,</w:t>
+      </w:r>
+      <w:r>
+        <w:t xml:space="preserve"> </w:t>
+      </w:r>
+      <w:r>
+        <w:rPr>
+          <w:rStyle w:val="VerbatimChar"/>
+        </w:rPr>
+        <w:t xml:space="preserve">docs/Next_Owner_Market_Build_Journal.md</w:t>
+      </w:r>
+      <w:r>
+        <w:t xml:space="preserve">,</w:t>
+      </w:r>
+      <w:r>
+        <w:t xml:space="preserve"> </w:t>
+      </w:r>
+      <w:r>
+        <w:rPr>
+          <w:rStyle w:val="VerbatimChar"/>
+        </w:rPr>
+        <w:t xml:space="preserve">docs/Next_Owner_Market_Change_Log.docx</w:t>
+      </w:r>
+      <w:r>
+        <w:t xml:space="preserve">,</w:t>
+      </w:r>
+      <w:r>
+        <w:t xml:space="preserve"> </w:t>
+      </w:r>
+      <w:r>
+        <w:rPr>
+          <w:rStyle w:val="VerbatimChar"/>
+        </w:rPr>
+        <w:t xml:space="preserve">docs/Next_Owner_Market_Change_Log.md</w:t>
+      </w:r>
+      <w:r>
+        <w:t xml:space="preserve">,</w:t>
+      </w:r>
+      <w:r>
+        <w:t xml:space="preserve"> </w:t>
+      </w:r>
+      <w:r>
+        <w:rPr>
+          <w:rStyle w:val="VerbatimChar"/>
+        </w:rPr>
+        <w:t xml:space="preserve">docs/Next_Owner_Market_Complete_Guide.docx</w:t>
+      </w:r>
+      <w:r>
+        <w:t xml:space="preserve">,</w:t>
+      </w:r>
+      <w:r>
+        <w:t xml:space="preserve"> </w:t>
+      </w:r>
+      <w:r>
+        <w:rPr>
+          <w:rStyle w:val="VerbatimChar"/>
+        </w:rPr>
+        <w:t xml:space="preserve">docs/Next_Owner_Market_Complete_Guide.md</w:t>
+      </w:r>
+      <w:r>
+        <w:t xml:space="preserve">,</w:t>
+      </w:r>
+      <w:r>
+        <w:t xml:space="preserve"> </w:t>
+      </w:r>
+      <w:r>
+        <w:rPr>
+          <w:rStyle w:val="VerbatimChar"/>
+        </w:rPr>
+        <w:t xml:space="preserve">docs/Next_Owner_Market_Presentation_Walkthrough.docx</w:t>
+      </w:r>
+      <w:r>
+        <w:t xml:space="preserve">,</w:t>
+      </w:r>
+      <w:r>
+        <w:t xml:space="preserve"> </w:t>
+      </w:r>
+      <w:r>
+        <w:rPr>
+          <w:rStyle w:val="VerbatimChar"/>
+        </w:rPr>
+        <w:t xml:space="preserve">docs/Next_Owner_Market_Presentation_Walkthrough.md</w:t>
+      </w:r>
+      <w:r>
+        <w:t xml:space="preserve">,</w:t>
+      </w:r>
+      <w:r>
+        <w:t xml:space="preserve"> </w:t>
+      </w:r>
+      <w:r>
+        <w:rPr>
+          <w:rStyle w:val="VerbatimChar"/>
+        </w:rPr>
+        <w:t xml:space="preserve">docs/Next_Owner_Market_User_Guide.docx</w:t>
+      </w:r>
+      <w:r>
+        <w:t xml:space="preserve">,</w:t>
+      </w:r>
+      <w:r>
+        <w:t xml:space="preserve"> </w:t>
+      </w:r>
+      <w:r>
+        <w:rPr>
+          <w:rStyle w:val="VerbatimChar"/>
+        </w:rPr>
+        <w:t xml:space="preserve">docs/Next_Owner_Market_User_Guide.md</w:t>
+      </w:r>
+      <w:r>
+        <w:t xml:space="preserve">,</w:t>
+      </w:r>
+      <w:r>
+        <w:t xml:space="preserve"> </w:t>
+      </w:r>
+      <w:r>
+        <w:rPr>
+          <w:rStyle w:val="VerbatimChar"/>
+        </w:rPr>
+        <w:t xml:space="preserve">docs/Next_Owner_Market_White_Paper.docx</w:t>
+      </w:r>
+      <w:r>
+        <w:t xml:space="preserve">,</w:t>
+      </w:r>
+      <w:r>
+        <w:t xml:space="preserve"> </w:t>
+      </w:r>
+      <w:r>
+        <w:rPr>
+          <w:rStyle w:val="VerbatimChar"/>
+        </w:rPr>
+        <w:t xml:space="preserve">docs/Next_Owner_Market_White_Paper.md</w:t>
+      </w:r>
+      <w:r>
+        <w:t xml:space="preserve"> </w:t>
+      </w:r>
+      <w:r>
+        <w:t xml:space="preserve">(+2 more)</w:t>
+      </w:r>
+    </w:p>
+    <w:p>
+      <w:pPr>
+        <w:pStyle w:val="FirstParagraph"/>
+      </w:pPr>
+      <w:r>
+        <w:t xml:space="preserve">change id c2ef04f</w:t>
+      </w:r>
+    </w:p>
     <w:bookmarkEnd w:id="217"/>
     <w:bookmarkEnd w:id="218"/>
+    <w:bookmarkEnd w:id="219"/>
     <w:sectPr/>
   </w:body>
 </w:document>
@@ -25802,6 +25983,9 @@
     <w:abstractNumId w:val="991"/>
   </w:num>
   <w:num w:numId="1194">
+    <w:abstractNumId w:val="991"/>
+  </w:num>
+  <w:num w:numId="1195">
     <w:abstractNumId w:val="991"/>
   </w:num>
 </w:numbering>

</xml_diff>

<commit_message>
Docs: Google Merchant Center fix guide; guides updated; records
Co-Authored-By: Claude Opus 5.5 <noreply@anthropic.com>
Claude-Session: https://claude.ai/code/session_01JPZJaTbXQFN2qiYRf4rkZK
</commit_message>
<xml_diff>
--- a/docs/Next_Owner_Market_Change_Log.docx
+++ b/docs/Next_Owner_Market_Change_Log.docx
@@ -2,7 +2,7 @@
 <file path=word/document.xml><?xml version="1.0" encoding="utf-8"?>
 <w:document xmlns:w="http://schemas.openxmlformats.org/wordprocessingml/2006/main" xmlns:m="http://schemas.openxmlformats.org/officeDocument/2006/math" xmlns:r="http://schemas.openxmlformats.org/officeDocument/2006/relationships" xmlns:o="urn:schemas-microsoft-com:office:office" xmlns:v="urn:schemas-microsoft-com:vml" xmlns:w10="urn:schemas-microsoft-com:office:word" xmlns:a="http://schemas.openxmlformats.org/drawingml/2006/main" xmlns:pic="http://schemas.openxmlformats.org/drawingml/2006/picture" xmlns:wp="http://schemas.openxmlformats.org/drawingml/2006/wordprocessingDrawing">
   <w:body>
-    <w:bookmarkStart w:id="259" w:name="next-owner-market--change-log"/>
+    <w:bookmarkStart w:id="261" w:name="next-owner-market--change-log"/>
     <w:p>
       <w:pPr>
         <w:pStyle w:val="Heading1"/>
@@ -20,7 +20,7 @@
           <w:iCs/>
           <w:i/>
         </w:rPr>
-        <w:t xml:space="preserve">Every change to the code, database, and documents, oldest first. Generated October 5, 2026 2:29 AM from the project history (233 changes).</w:t>
+        <w:t xml:space="preserve">Every change to the code, database, and documents, oldest first. Generated October 5, 2026 2:46 AM from the project history (235 changes).</w:t>
       </w:r>
     </w:p>
     <w:bookmarkStart w:id="52" w:name="tuesday-september-29-2026"/>
@@ -32094,7 +32094,7 @@
     </w:p>
     <w:bookmarkEnd w:id="254"/>
     <w:bookmarkEnd w:id="255"/>
-    <w:bookmarkStart w:id="258" w:name="monday-october-5-2026"/>
+    <w:bookmarkStart w:id="260" w:name="monday-october-5-2026"/>
     <w:p>
       <w:pPr>
         <w:pStyle w:val="Heading2"/>
@@ -32400,8 +32400,349 @@
       </w:r>
     </w:p>
     <w:bookmarkEnd w:id="257"/>
+    <w:bookmarkStart w:id="258" w:name="X4a113ef40b3c49bc93fd5a8e174fb3d1087e4ea"/>
+    <w:p>
+      <w:pPr>
+        <w:pStyle w:val="Heading3"/>
+      </w:pPr>
+      <w:r>
+        <w:t xml:space="preserve">02:33 — Records: journal update</w:t>
+      </w:r>
+    </w:p>
+    <w:p>
+      <w:pPr>
+        <w:numPr>
+          <w:ilvl w:val="0"/>
+          <w:numId w:val="1234"/>
+        </w:numPr>
+        <w:pStyle w:val="Compact"/>
+      </w:pPr>
+      <w:r>
+        <w:rPr>
+          <w:bCs/>
+          <w:b/>
+        </w:rPr>
+        <w:t xml:space="preserve">Documents:</w:t>
+      </w:r>
+      <w:r>
+        <w:t xml:space="preserve"> </w:t>
+      </w:r>
+      <w:r>
+        <w:rPr>
+          <w:rStyle w:val="VerbatimChar"/>
+        </w:rPr>
+        <w:t xml:space="preserve">docs/Next_Owner_Market_Build_Journal.docx</w:t>
+      </w:r>
+      <w:r>
+        <w:t xml:space="preserve">,</w:t>
+      </w:r>
+      <w:r>
+        <w:t xml:space="preserve"> </w:t>
+      </w:r>
+      <w:r>
+        <w:rPr>
+          <w:rStyle w:val="VerbatimChar"/>
+        </w:rPr>
+        <w:t xml:space="preserve">docs/Next_Owner_Market_Change_Log.docx</w:t>
+      </w:r>
+      <w:r>
+        <w:t xml:space="preserve">,</w:t>
+      </w:r>
+      <w:r>
+        <w:t xml:space="preserve"> </w:t>
+      </w:r>
+      <w:r>
+        <w:rPr>
+          <w:rStyle w:val="VerbatimChar"/>
+        </w:rPr>
+        <w:t xml:space="preserve">docs/Next_Owner_Market_Change_Log.md</w:t>
+      </w:r>
+    </w:p>
+    <w:p>
+      <w:pPr>
+        <w:pStyle w:val="FirstParagraph"/>
+      </w:pPr>
+      <w:r>
+        <w:t xml:space="preserve">change id 4e7e15c</w:t>
+      </w:r>
+    </w:p>
     <w:bookmarkEnd w:id="258"/>
+    <w:bookmarkStart w:id="259" w:name="X2c203b646ec6073d5e79726c3a1b1a793c69be0"/>
+    <w:p>
+      <w:pPr>
+        <w:pStyle w:val="Heading3"/>
+      </w:pPr>
+      <w:r>
+        <w:t xml:space="preserve">02:43 — Google Merchant Center 'Misrepresentation' fixes: feed lists only our own shippable items with honest shipping and condition; new Contact, About, Returns, Shipping pages with site-wide footer; Terms blanks filled with operator and contact; item pages link returns/shipping/contact</w:t>
+      </w:r>
+    </w:p>
+    <w:p>
+      <w:pPr>
+        <w:numPr>
+          <w:ilvl w:val="0"/>
+          <w:numId w:val="1235"/>
+        </w:numPr>
+        <w:pStyle w:val="Compact"/>
+      </w:pPr>
+      <w:r>
+        <w:rPr>
+          <w:bCs/>
+          <w:b/>
+        </w:rPr>
+        <w:t xml:space="preserve">Documents:</w:t>
+      </w:r>
+      <w:r>
+        <w:t xml:space="preserve"> </w:t>
+      </w:r>
+      <w:r>
+        <w:rPr>
+          <w:rStyle w:val="VerbatimChar"/>
+        </w:rPr>
+        <w:t xml:space="preserve">docs/Next_Owner_Market_Build_Journal.md</w:t>
+      </w:r>
+      <w:r>
+        <w:t xml:space="preserve">,</w:t>
+      </w:r>
+      <w:r>
+        <w:t xml:space="preserve"> </w:t>
+      </w:r>
+      <w:r>
+        <w:rPr>
+          <w:rStyle w:val="VerbatimChar"/>
+        </w:rPr>
+        <w:t xml:space="preserve">docs/journal_sessions/faa89acb-5a67-582b-a46a-1c3f3b736545.md</w:t>
+      </w:r>
+      <w:r>
+        <w:t xml:space="preserve">,</w:t>
+      </w:r>
+      <w:r>
+        <w:t xml:space="preserve"> </w:t>
+      </w:r>
+      <w:r>
+        <w:rPr>
+          <w:rStyle w:val="VerbatimChar"/>
+        </w:rPr>
+        <w:t xml:space="preserve">docs/journal_sessions/faa89acb-5a67-582b-a46a-1c3f3b736545.rows.json</w:t>
+      </w:r>
+    </w:p>
+    <w:p>
+      <w:pPr>
+        <w:numPr>
+          <w:ilvl w:val="0"/>
+          <w:numId w:val="1235"/>
+        </w:numPr>
+        <w:pStyle w:val="Compact"/>
+      </w:pPr>
+      <w:r>
+        <w:rPr>
+          <w:bCs/>
+          <w:b/>
+        </w:rPr>
+        <w:t xml:space="preserve">Public site pages:</w:t>
+      </w:r>
+      <w:r>
+        <w:t xml:space="preserve"> </w:t>
+      </w:r>
+      <w:r>
+        <w:rPr>
+          <w:rStyle w:val="VerbatimChar"/>
+        </w:rPr>
+        <w:t xml:space="preserve">src/app/PolicyPage.tsx</w:t>
+      </w:r>
+      <w:r>
+        <w:t xml:space="preserve">,</w:t>
+      </w:r>
+      <w:r>
+        <w:t xml:space="preserve"> </w:t>
+      </w:r>
+      <w:r>
+        <w:rPr>
+          <w:rStyle w:val="VerbatimChar"/>
+        </w:rPr>
+        <w:t xml:space="preserve">src/app/SiteFooter.tsx</w:t>
+      </w:r>
+      <w:r>
+        <w:t xml:space="preserve">,</w:t>
+      </w:r>
+      <w:r>
+        <w:t xml:space="preserve"> </w:t>
+      </w:r>
+      <w:r>
+        <w:rPr>
+          <w:rStyle w:val="VerbatimChar"/>
+        </w:rPr>
+        <w:t xml:space="preserve">src/app/about/page.tsx</w:t>
+      </w:r>
+      <w:r>
+        <w:t xml:space="preserve">,</w:t>
+      </w:r>
+      <w:r>
+        <w:t xml:space="preserve"> </w:t>
+      </w:r>
+      <w:r>
+        <w:rPr>
+          <w:rStyle w:val="VerbatimChar"/>
+        </w:rPr>
+        <w:t xml:space="preserve">src/app/contact/page.tsx</w:t>
+      </w:r>
+      <w:r>
+        <w:t xml:space="preserve">,</w:t>
+      </w:r>
+      <w:r>
+        <w:t xml:space="preserve"> </w:t>
+      </w:r>
+      <w:r>
+        <w:rPr>
+          <w:rStyle w:val="VerbatimChar"/>
+        </w:rPr>
+        <w:t xml:space="preserve">src/app/feed/google.xml/route.ts</w:t>
+      </w:r>
+      <w:r>
+        <w:t xml:space="preserve">,</w:t>
+      </w:r>
+      <w:r>
+        <w:t xml:space="preserve"> </w:t>
+      </w:r>
+      <w:r>
+        <w:rPr>
+          <w:rStyle w:val="VerbatimChar"/>
+        </w:rPr>
+        <w:t xml:space="preserve">src/app/layout.tsx</w:t>
+      </w:r>
+      <w:r>
+        <w:t xml:space="preserve">,</w:t>
+      </w:r>
+      <w:r>
+        <w:t xml:space="preserve"> </w:t>
+      </w:r>
+      <w:r>
+        <w:rPr>
+          <w:rStyle w:val="VerbatimChar"/>
+        </w:rPr>
+        <w:t xml:space="preserve">src/app/page.tsx</w:t>
+      </w:r>
+      <w:r>
+        <w:t xml:space="preserve">,</w:t>
+      </w:r>
+      <w:r>
+        <w:t xml:space="preserve"> </w:t>
+      </w:r>
+      <w:r>
+        <w:rPr>
+          <w:rStyle w:val="VerbatimChar"/>
+        </w:rPr>
+        <w:t xml:space="preserve">src/app/returns/page.tsx</w:t>
+      </w:r>
+      <w:r>
+        <w:t xml:space="preserve">,</w:t>
+      </w:r>
+      <w:r>
+        <w:t xml:space="preserve"> </w:t>
+      </w:r>
+      <w:r>
+        <w:rPr>
+          <w:rStyle w:val="VerbatimChar"/>
+        </w:rPr>
+        <w:t xml:space="preserve">src/app/shipping/page.tsx</w:t>
+      </w:r>
+      <w:r>
+        <w:t xml:space="preserve">,</w:t>
+      </w:r>
+      <w:r>
+        <w:t xml:space="preserve"> </w:t>
+      </w:r>
+      <w:r>
+        <w:rPr>
+          <w:rStyle w:val="VerbatimChar"/>
+        </w:rPr>
+        <w:t xml:space="preserve">src/app/sitemap.ts</w:t>
+      </w:r>
+      <w:r>
+        <w:t xml:space="preserve">,</w:t>
+      </w:r>
+      <w:r>
+        <w:t xml:space="preserve"> </w:t>
+      </w:r>
+      <w:r>
+        <w:rPr>
+          <w:rStyle w:val="VerbatimChar"/>
+        </w:rPr>
+        <w:t xml:space="preserve">src/app/terms/page.tsx</w:t>
+      </w:r>
+    </w:p>
+    <w:p>
+      <w:pPr>
+        <w:numPr>
+          <w:ilvl w:val="0"/>
+          <w:numId w:val="1235"/>
+        </w:numPr>
+        <w:pStyle w:val="Compact"/>
+      </w:pPr>
+      <w:r>
+        <w:rPr>
+          <w:bCs/>
+          <w:b/>
+        </w:rPr>
+        <w:t xml:space="preserve">Public item page:</w:t>
+      </w:r>
+      <w:r>
+        <w:t xml:space="preserve"> </w:t>
+      </w:r>
+      <w:r>
+        <w:rPr>
+          <w:rStyle w:val="VerbatimChar"/>
+        </w:rPr>
+        <w:t xml:space="preserve">src/app/item/[sku]/page.tsx</w:t>
+      </w:r>
+    </w:p>
+    <w:p>
+      <w:pPr>
+        <w:numPr>
+          <w:ilvl w:val="0"/>
+          <w:numId w:val="1235"/>
+        </w:numPr>
+        <w:pStyle w:val="Compact"/>
+      </w:pPr>
+      <w:r>
+        <w:rPr>
+          <w:bCs/>
+          <w:b/>
+        </w:rPr>
+        <w:t xml:space="preserve">Shared code (logic):</w:t>
+      </w:r>
+      <w:r>
+        <w:t xml:space="preserve"> </w:t>
+      </w:r>
+      <w:r>
+        <w:rPr>
+          <w:rStyle w:val="VerbatimChar"/>
+        </w:rPr>
+        <w:t xml:space="preserve">src/lib/business.ts</w:t>
+      </w:r>
+      <w:r>
+        <w:t xml:space="preserve">,</w:t>
+      </w:r>
+      <w:r>
+        <w:t xml:space="preserve"> </w:t>
+      </w:r>
+      <w:r>
+        <w:rPr>
+          <w:rStyle w:val="VerbatimChar"/>
+        </w:rPr>
+        <w:t xml:space="preserve">src/lib/shipping.ts</w:t>
+      </w:r>
+    </w:p>
+    <w:p>
+      <w:pPr>
+        <w:pStyle w:val="FirstParagraph"/>
+      </w:pPr>
+      <w:r>
+        <w:t xml:space="preserve">change id 207c85e</w:t>
+      </w:r>
+    </w:p>
     <w:bookmarkEnd w:id="259"/>
+    <w:bookmarkEnd w:id="260"/>
+    <w:bookmarkEnd w:id="261"/>
     <w:sectPr/>
   </w:body>
 </w:document>
@@ -33284,6 +33625,12 @@
     <w:abstractNumId w:val="991"/>
   </w:num>
   <w:num w:numId="1233">
+    <w:abstractNumId w:val="991"/>
+  </w:num>
+  <w:num w:numId="1234">
+    <w:abstractNumId w:val="991"/>
+  </w:num>
+  <w:num w:numId="1235">
     <w:abstractNumId w:val="991"/>
   </w:num>
 </w:numbering>

</xml_diff>

<commit_message>
Records: Google Shopping steps added to the owner's urgent to-do list
Co-Authored-By: Claude Opus 5.5 <noreply@anthropic.com>
Claude-Session: https://claude.ai/code/session_01JPZJaTbXQFN2qiYRf4rkZK
</commit_message>
<xml_diff>
--- a/docs/Next_Owner_Market_Change_Log.docx
+++ b/docs/Next_Owner_Market_Change_Log.docx
@@ -2,7 +2,7 @@
 <file path=word/document.xml><?xml version="1.0" encoding="utf-8"?>
 <w:document xmlns:w="http://schemas.openxmlformats.org/wordprocessingml/2006/main" xmlns:m="http://schemas.openxmlformats.org/officeDocument/2006/math" xmlns:r="http://schemas.openxmlformats.org/officeDocument/2006/relationships" xmlns:o="urn:schemas-microsoft-com:office:office" xmlns:v="urn:schemas-microsoft-com:vml" xmlns:w10="urn:schemas-microsoft-com:office:word" xmlns:a="http://schemas.openxmlformats.org/drawingml/2006/main" xmlns:pic="http://schemas.openxmlformats.org/drawingml/2006/picture" xmlns:wp="http://schemas.openxmlformats.org/drawingml/2006/wordprocessingDrawing">
   <w:body>
-    <w:bookmarkStart w:id="261" w:name="next-owner-market--change-log"/>
+    <w:bookmarkStart w:id="262" w:name="next-owner-market--change-log"/>
     <w:p>
       <w:pPr>
         <w:pStyle w:val="Heading1"/>
@@ -20,7 +20,7 @@
           <w:iCs/>
           <w:i/>
         </w:rPr>
-        <w:t xml:space="preserve">Every change to the code, database, and documents, oldest first. Generated October 5, 2026 2:46 AM from the project history (235 changes).</w:t>
+        <w:t xml:space="preserve">Every change to the code, database, and documents, oldest first. Generated October 5, 2026 1:19 PM from the project history (236 changes).</w:t>
       </w:r>
     </w:p>
     <w:bookmarkStart w:id="52" w:name="tuesday-september-29-2026"/>
@@ -32094,7 +32094,7 @@
     </w:p>
     <w:bookmarkEnd w:id="254"/>
     <w:bookmarkEnd w:id="255"/>
-    <w:bookmarkStart w:id="260" w:name="monday-october-5-2026"/>
+    <w:bookmarkStart w:id="261" w:name="monday-october-5-2026"/>
     <w:p>
       <w:pPr>
         <w:pStyle w:val="Heading2"/>
@@ -32741,8 +32741,189 @@
       </w:r>
     </w:p>
     <w:bookmarkEnd w:id="259"/>
+    <w:bookmarkStart w:id="260" w:name="X06438df18cfe804e39491dc938d7a4f7ed8cfb4"/>
+    <w:p>
+      <w:pPr>
+        <w:pStyle w:val="Heading3"/>
+      </w:pPr>
+      <w:r>
+        <w:t xml:space="preserve">02:46 — Docs: Google Merchant Center fix guide; guides updated; records</w:t>
+      </w:r>
+    </w:p>
+    <w:p>
+      <w:pPr>
+        <w:numPr>
+          <w:ilvl w:val="0"/>
+          <w:numId w:val="1236"/>
+        </w:numPr>
+        <w:pStyle w:val="Compact"/>
+      </w:pPr>
+      <w:r>
+        <w:rPr>
+          <w:bCs/>
+          <w:b/>
+        </w:rPr>
+        <w:t xml:space="preserve">Documents:</w:t>
+      </w:r>
+      <w:r>
+        <w:t xml:space="preserve"> </w:t>
+      </w:r>
+      <w:r>
+        <w:rPr>
+          <w:rStyle w:val="VerbatimChar"/>
+        </w:rPr>
+        <w:t xml:space="preserve">docs/Next_Owner_Market_AddOn_Modules_White_Paper.docx</w:t>
+      </w:r>
+      <w:r>
+        <w:t xml:space="preserve">,</w:t>
+      </w:r>
+      <w:r>
+        <w:t xml:space="preserve"> </w:t>
+      </w:r>
+      <w:r>
+        <w:rPr>
+          <w:rStyle w:val="VerbatimChar"/>
+        </w:rPr>
+        <w:t xml:space="preserve">docs/Next_Owner_Market_Beat_The_Competition.docx</w:t>
+      </w:r>
+      <w:r>
+        <w:t xml:space="preserve">,</w:t>
+      </w:r>
+      <w:r>
+        <w:t xml:space="preserve"> </w:t>
+      </w:r>
+      <w:r>
+        <w:rPr>
+          <w:rStyle w:val="VerbatimChar"/>
+        </w:rPr>
+        <w:t xml:space="preserve">docs/Next_Owner_Market_Build_Journal.docx</w:t>
+      </w:r>
+      <w:r>
+        <w:t xml:space="preserve">,</w:t>
+      </w:r>
+      <w:r>
+        <w:t xml:space="preserve"> </w:t>
+      </w:r>
+      <w:r>
+        <w:rPr>
+          <w:rStyle w:val="VerbatimChar"/>
+        </w:rPr>
+        <w:t xml:space="preserve">docs/Next_Owner_Market_Build_Journal.md</w:t>
+      </w:r>
+      <w:r>
+        <w:t xml:space="preserve">,</w:t>
+      </w:r>
+      <w:r>
+        <w:t xml:space="preserve"> </w:t>
+      </w:r>
+      <w:r>
+        <w:rPr>
+          <w:rStyle w:val="VerbatimChar"/>
+        </w:rPr>
+        <w:t xml:space="preserve">docs/Next_Owner_Market_Change_Log.docx</w:t>
+      </w:r>
+      <w:r>
+        <w:t xml:space="preserve">,</w:t>
+      </w:r>
+      <w:r>
+        <w:t xml:space="preserve"> </w:t>
+      </w:r>
+      <w:r>
+        <w:rPr>
+          <w:rStyle w:val="VerbatimChar"/>
+        </w:rPr>
+        <w:t xml:space="preserve">docs/Next_Owner_Market_Change_Log.md</w:t>
+      </w:r>
+      <w:r>
+        <w:t xml:space="preserve">,</w:t>
+      </w:r>
+      <w:r>
+        <w:t xml:space="preserve"> </w:t>
+      </w:r>
+      <w:r>
+        <w:rPr>
+          <w:rStyle w:val="VerbatimChar"/>
+        </w:rPr>
+        <w:t xml:space="preserve">docs/Next_Owner_Market_Complete_Guide.docx</w:t>
+      </w:r>
+      <w:r>
+        <w:t xml:space="preserve">,</w:t>
+      </w:r>
+      <w:r>
+        <w:t xml:space="preserve"> </w:t>
+      </w:r>
+      <w:r>
+        <w:rPr>
+          <w:rStyle w:val="VerbatimChar"/>
+        </w:rPr>
+        <w:t xml:space="preserve">docs/Next_Owner_Market_Complete_Guide.md</w:t>
+      </w:r>
+      <w:r>
+        <w:t xml:space="preserve">,</w:t>
+      </w:r>
+      <w:r>
+        <w:t xml:space="preserve"> </w:t>
+      </w:r>
+      <w:r>
+        <w:rPr>
+          <w:rStyle w:val="VerbatimChar"/>
+        </w:rPr>
+        <w:t xml:space="preserve">docs/Next_Owner_Market_Estate_Pack_Legal_Research.docx</w:t>
+      </w:r>
+      <w:r>
+        <w:t xml:space="preserve">,</w:t>
+      </w:r>
+      <w:r>
+        <w:t xml:space="preserve"> </w:t>
+      </w:r>
+      <w:r>
+        <w:rPr>
+          <w:rStyle w:val="VerbatimChar"/>
+        </w:rPr>
+        <w:t xml:space="preserve">docs/Next_Owner_Market_Facebook_Page_Kit.docx</w:t>
+      </w:r>
+      <w:r>
+        <w:t xml:space="preserve">,</w:t>
+      </w:r>
+      <w:r>
+        <w:t xml:space="preserve"> </w:t>
+      </w:r>
+      <w:r>
+        <w:rPr>
+          <w:rStyle w:val="VerbatimChar"/>
+        </w:rPr>
+        <w:t xml:space="preserve">docs/Next_Owner_Market_File_Index.docx</w:t>
+      </w:r>
+      <w:r>
+        <w:t xml:space="preserve">,</w:t>
+      </w:r>
+      <w:r>
+        <w:t xml:space="preserve"> </w:t>
+      </w:r>
+      <w:r>
+        <w:rPr>
+          <w:rStyle w:val="VerbatimChar"/>
+        </w:rPr>
+        <w:t xml:space="preserve">docs/Next_Owner_Market_File_Index.md</w:t>
+      </w:r>
+      <w:r>
+        <w:t xml:space="preserve"> </w:t>
+      </w:r>
+      <w:r>
+        <w:t xml:space="preserve">(+17 more)</w:t>
+      </w:r>
+    </w:p>
+    <w:p>
+      <w:pPr>
+        <w:pStyle w:val="FirstParagraph"/>
+      </w:pPr>
+      <w:r>
+        <w:t xml:space="preserve">change id a023263</w:t>
+      </w:r>
+    </w:p>
     <w:bookmarkEnd w:id="260"/>
     <w:bookmarkEnd w:id="261"/>
+    <w:bookmarkEnd w:id="262"/>
     <w:sectPr/>
   </w:body>
 </w:document>
@@ -33631,6 +33812,9 @@
     <w:abstractNumId w:val="991"/>
   </w:num>
   <w:num w:numId="1235">
+    <w:abstractNumId w:val="991"/>
+  </w:num>
+  <w:num w:numId="1236">
     <w:abstractNumId w:val="991"/>
   </w:num>
 </w:numbering>

</xml_diff>

<commit_message>
Records: twice-daily to-do reminders
Co-Authored-By: Claude Opus 5.5 <noreply@anthropic.com>
Claude-Session: https://claude.ai/code/session_01JPZJaTbXQFN2qiYRf4rkZK
</commit_message>
<xml_diff>
--- a/docs/Next_Owner_Market_Change_Log.docx
+++ b/docs/Next_Owner_Market_Change_Log.docx
@@ -2,7 +2,7 @@
 <file path=word/document.xml><?xml version="1.0" encoding="utf-8"?>
 <w:document xmlns:w="http://schemas.openxmlformats.org/wordprocessingml/2006/main" xmlns:m="http://schemas.openxmlformats.org/officeDocument/2006/math" xmlns:r="http://schemas.openxmlformats.org/officeDocument/2006/relationships" xmlns:o="urn:schemas-microsoft-com:office:office" xmlns:v="urn:schemas-microsoft-com:vml" xmlns:w10="urn:schemas-microsoft-com:office:word" xmlns:a="http://schemas.openxmlformats.org/drawingml/2006/main" xmlns:pic="http://schemas.openxmlformats.org/drawingml/2006/picture" xmlns:wp="http://schemas.openxmlformats.org/drawingml/2006/wordprocessingDrawing">
   <w:body>
-    <w:bookmarkStart w:id="262" w:name="next-owner-market--change-log"/>
+    <w:bookmarkStart w:id="264" w:name="next-owner-market--change-log"/>
     <w:p>
       <w:pPr>
         <w:pStyle w:val="Heading1"/>
@@ -20,7 +20,7 @@
           <w:iCs/>
           <w:i/>
         </w:rPr>
-        <w:t xml:space="preserve">Every change to the code, database, and documents, oldest first. Generated October 5, 2026 1:19 PM from the project history (236 changes).</w:t>
+        <w:t xml:space="preserve">Every change to the code, database, and documents, oldest first. Generated October 5, 2026 1:30 PM from the project history (238 changes).</w:t>
       </w:r>
     </w:p>
     <w:bookmarkStart w:id="52" w:name="tuesday-september-29-2026"/>
@@ -32094,7 +32094,7 @@
     </w:p>
     <w:bookmarkEnd w:id="254"/>
     <w:bookmarkEnd w:id="255"/>
-    <w:bookmarkStart w:id="261" w:name="monday-october-5-2026"/>
+    <w:bookmarkStart w:id="263" w:name="monday-october-5-2026"/>
     <w:p>
       <w:pPr>
         <w:pStyle w:val="Heading2"/>
@@ -32922,8 +32922,331 @@
       </w:r>
     </w:p>
     <w:bookmarkEnd w:id="260"/>
+    <w:bookmarkStart w:id="261" w:name="Xa8ab9781cce1030abe88ee2a80c662b380f5e1e"/>
+    <w:p>
+      <w:pPr>
+        <w:pStyle w:val="Heading3"/>
+      </w:pPr>
+      <w:r>
+        <w:t xml:space="preserve">13:20 — Records: Google Shopping steps added to the owner's urgent to-do list</w:t>
+      </w:r>
+    </w:p>
+    <w:p>
+      <w:pPr>
+        <w:numPr>
+          <w:ilvl w:val="0"/>
+          <w:numId w:val="1237"/>
+        </w:numPr>
+        <w:pStyle w:val="Compact"/>
+      </w:pPr>
+      <w:r>
+        <w:rPr>
+          <w:bCs/>
+          <w:b/>
+        </w:rPr>
+        <w:t xml:space="preserve">Documents:</w:t>
+      </w:r>
+      <w:r>
+        <w:t xml:space="preserve"> </w:t>
+      </w:r>
+      <w:r>
+        <w:rPr>
+          <w:rStyle w:val="VerbatimChar"/>
+        </w:rPr>
+        <w:t xml:space="preserve">docs/Next_Owner_Market_AddOn_Modules_White_Paper.docx</w:t>
+      </w:r>
+      <w:r>
+        <w:t xml:space="preserve">,</w:t>
+      </w:r>
+      <w:r>
+        <w:t xml:space="preserve"> </w:t>
+      </w:r>
+      <w:r>
+        <w:rPr>
+          <w:rStyle w:val="VerbatimChar"/>
+        </w:rPr>
+        <w:t xml:space="preserve">docs/Next_Owner_Market_Beat_The_Competition.docx</w:t>
+      </w:r>
+      <w:r>
+        <w:t xml:space="preserve">,</w:t>
+      </w:r>
+      <w:r>
+        <w:t xml:space="preserve"> </w:t>
+      </w:r>
+      <w:r>
+        <w:rPr>
+          <w:rStyle w:val="VerbatimChar"/>
+        </w:rPr>
+        <w:t xml:space="preserve">docs/Next_Owner_Market_Build_Journal.docx</w:t>
+      </w:r>
+      <w:r>
+        <w:t xml:space="preserve">,</w:t>
+      </w:r>
+      <w:r>
+        <w:t xml:space="preserve"> </w:t>
+      </w:r>
+      <w:r>
+        <w:rPr>
+          <w:rStyle w:val="VerbatimChar"/>
+        </w:rPr>
+        <w:t xml:space="preserve">docs/Next_Owner_Market_Build_Journal.md</w:t>
+      </w:r>
+      <w:r>
+        <w:t xml:space="preserve">,</w:t>
+      </w:r>
+      <w:r>
+        <w:t xml:space="preserve"> </w:t>
+      </w:r>
+      <w:r>
+        <w:rPr>
+          <w:rStyle w:val="VerbatimChar"/>
+        </w:rPr>
+        <w:t xml:space="preserve">docs/Next_Owner_Market_Change_Log.docx</w:t>
+      </w:r>
+      <w:r>
+        <w:t xml:space="preserve">,</w:t>
+      </w:r>
+      <w:r>
+        <w:t xml:space="preserve"> </w:t>
+      </w:r>
+      <w:r>
+        <w:rPr>
+          <w:rStyle w:val="VerbatimChar"/>
+        </w:rPr>
+        <w:t xml:space="preserve">docs/Next_Owner_Market_Change_Log.md</w:t>
+      </w:r>
+      <w:r>
+        <w:t xml:space="preserve">,</w:t>
+      </w:r>
+      <w:r>
+        <w:t xml:space="preserve"> </w:t>
+      </w:r>
+      <w:r>
+        <w:rPr>
+          <w:rStyle w:val="VerbatimChar"/>
+        </w:rPr>
+        <w:t xml:space="preserve">docs/Next_Owner_Market_Complete_Guide.docx</w:t>
+      </w:r>
+      <w:r>
+        <w:t xml:space="preserve">,</w:t>
+      </w:r>
+      <w:r>
+        <w:t xml:space="preserve"> </w:t>
+      </w:r>
+      <w:r>
+        <w:rPr>
+          <w:rStyle w:val="VerbatimChar"/>
+        </w:rPr>
+        <w:t xml:space="preserve">docs/Next_Owner_Market_Estate_Pack_Legal_Research.docx</w:t>
+      </w:r>
+      <w:r>
+        <w:t xml:space="preserve">,</w:t>
+      </w:r>
+      <w:r>
+        <w:t xml:space="preserve"> </w:t>
+      </w:r>
+      <w:r>
+        <w:rPr>
+          <w:rStyle w:val="VerbatimChar"/>
+        </w:rPr>
+        <w:t xml:space="preserve">docs/Next_Owner_Market_Facebook_Page_Kit.docx</w:t>
+      </w:r>
+      <w:r>
+        <w:t xml:space="preserve">,</w:t>
+      </w:r>
+      <w:r>
+        <w:t xml:space="preserve"> </w:t>
+      </w:r>
+      <w:r>
+        <w:rPr>
+          <w:rStyle w:val="VerbatimChar"/>
+        </w:rPr>
+        <w:t xml:space="preserve">docs/Next_Owner_Market_File_Index.docx</w:t>
+      </w:r>
+      <w:r>
+        <w:t xml:space="preserve">,</w:t>
+      </w:r>
+      <w:r>
+        <w:t xml:space="preserve"> </w:t>
+      </w:r>
+      <w:r>
+        <w:rPr>
+          <w:rStyle w:val="VerbatimChar"/>
+        </w:rPr>
+        <w:t xml:space="preserve">docs/Next_Owner_Market_Google_Merchant_Center_Fix.docx</w:t>
+      </w:r>
+      <w:r>
+        <w:t xml:space="preserve">,</w:t>
+      </w:r>
+      <w:r>
+        <w:t xml:space="preserve"> </w:t>
+      </w:r>
+      <w:r>
+        <w:rPr>
+          <w:rStyle w:val="VerbatimChar"/>
+        </w:rPr>
+        <w:t xml:space="preserve">docs/Next_Owner_Market_Launch_Kit.docx</w:t>
+      </w:r>
+      <w:r>
+        <w:t xml:space="preserve"> </w:t>
+      </w:r>
+      <w:r>
+        <w:t xml:space="preserve">(+12 more)</w:t>
+      </w:r>
+    </w:p>
+    <w:p>
+      <w:pPr>
+        <w:pStyle w:val="FirstParagraph"/>
+      </w:pPr>
+      <w:r>
+        <w:t xml:space="preserve">change id 2ecb7f6</w:t>
+      </w:r>
+    </w:p>
     <w:bookmarkEnd w:id="261"/>
+    <w:bookmarkStart w:id="262" w:name="X49c051281abb9643cda28e1e601fcc83da2a935"/>
+    <w:p>
+      <w:pPr>
+        <w:pStyle w:val="Heading3"/>
+      </w:pPr>
+      <w:r>
+        <w:t xml:space="preserve">13:25 — To-do reminders: full list by email and text at 11 AM and 5 PM (pg_cron); long texts go as picture messages; private settings staff-only</w:t>
+      </w:r>
+    </w:p>
+    <w:p>
+      <w:pPr>
+        <w:numPr>
+          <w:ilvl w:val="0"/>
+          <w:numId w:val="1238"/>
+        </w:numPr>
+        <w:pStyle w:val="Compact"/>
+      </w:pPr>
+      <w:r>
+        <w:rPr>
+          <w:bCs/>
+          <w:b/>
+        </w:rPr>
+        <w:t xml:space="preserve">Documents:</w:t>
+      </w:r>
+      <w:r>
+        <w:t xml:space="preserve"> </w:t>
+      </w:r>
+      <w:r>
+        <w:rPr>
+          <w:rStyle w:val="VerbatimChar"/>
+        </w:rPr>
+        <w:t xml:space="preserve">docs/Next_Owner_Market_Complete_Guide.md</w:t>
+      </w:r>
+      <w:r>
+        <w:t xml:space="preserve">,</w:t>
+      </w:r>
+      <w:r>
+        <w:t xml:space="preserve"> </w:t>
+      </w:r>
+      <w:r>
+        <w:rPr>
+          <w:rStyle w:val="VerbatimChar"/>
+        </w:rPr>
+        <w:t xml:space="preserve">docs/Next_Owner_Market_User_Guide.md</w:t>
+      </w:r>
+    </w:p>
+    <w:p>
+      <w:pPr>
+        <w:numPr>
+          <w:ilvl w:val="0"/>
+          <w:numId w:val="1238"/>
+        </w:numPr>
+        <w:pStyle w:val="Compact"/>
+      </w:pPr>
+      <w:r>
+        <w:rPr>
+          <w:bCs/>
+          <w:b/>
+        </w:rPr>
+        <w:t xml:space="preserve">Server routes (API):</w:t>
+      </w:r>
+      <w:r>
+        <w:t xml:space="preserve"> </w:t>
+      </w:r>
+      <w:r>
+        <w:rPr>
+          <w:rStyle w:val="VerbatimChar"/>
+        </w:rPr>
+        <w:t xml:space="preserve">src/app/api/todo/remind/route.ts</w:t>
+      </w:r>
+    </w:p>
+    <w:p>
+      <w:pPr>
+        <w:numPr>
+          <w:ilvl w:val="0"/>
+          <w:numId w:val="1238"/>
+        </w:numPr>
+        <w:pStyle w:val="Compact"/>
+      </w:pPr>
+      <w:r>
+        <w:rPr>
+          <w:bCs/>
+          <w:b/>
+        </w:rPr>
+        <w:t xml:space="preserve">Shared code (logic):</w:t>
+      </w:r>
+      <w:r>
+        <w:t xml:space="preserve"> </w:t>
+      </w:r>
+      <w:r>
+        <w:rPr>
+          <w:rStyle w:val="VerbatimChar"/>
+        </w:rPr>
+        <w:t xml:space="preserve">src/lib/alert.ts</w:t>
+      </w:r>
+      <w:r>
+        <w:t xml:space="preserve">,</w:t>
+      </w:r>
+      <w:r>
+        <w:t xml:space="preserve"> </w:t>
+      </w:r>
+      <w:r>
+        <w:rPr>
+          <w:rStyle w:val="VerbatimChar"/>
+        </w:rPr>
+        <w:t xml:space="preserve">src/lib/automations.ts</w:t>
+      </w:r>
+    </w:p>
+    <w:p>
+      <w:pPr>
+        <w:numPr>
+          <w:ilvl w:val="0"/>
+          <w:numId w:val="1238"/>
+        </w:numPr>
+        <w:pStyle w:val="Compact"/>
+      </w:pPr>
+      <w:r>
+        <w:rPr>
+          <w:bCs/>
+          <w:b/>
+        </w:rPr>
+        <w:t xml:space="preserve">Database (migrations):</w:t>
+      </w:r>
+      <w:r>
+        <w:t xml:space="preserve"> </w:t>
+      </w:r>
+      <w:r>
+        <w:rPr>
+          <w:rStyle w:val="VerbatimChar"/>
+        </w:rPr>
+        <w:t xml:space="preserve">supabase/migrations/039_todo_twice_daily.sql</w:t>
+      </w:r>
+    </w:p>
+    <w:p>
+      <w:pPr>
+        <w:pStyle w:val="FirstParagraph"/>
+      </w:pPr>
+      <w:r>
+        <w:t xml:space="preserve">change id 0ed7ade</w:t>
+      </w:r>
+    </w:p>
     <w:bookmarkEnd w:id="262"/>
+    <w:bookmarkEnd w:id="263"/>
+    <w:bookmarkEnd w:id="264"/>
     <w:sectPr/>
   </w:body>
 </w:document>
@@ -33815,6 +34138,12 @@
     <w:abstractNumId w:val="991"/>
   </w:num>
   <w:num w:numId="1236">
+    <w:abstractNumId w:val="991"/>
+  </w:num>
+  <w:num w:numId="1237">
+    <w:abstractNumId w:val="991"/>
+  </w:num>
+  <w:num w:numId="1238">
     <w:abstractNumId w:val="991"/>
   </w:num>
 </w:numbering>

</xml_diff>

<commit_message>
App Builder's Playbook: master guide for building any app the way we built this one (exact to-do/reminder handoff with real code, every rule, pattern, outside service and workaround, trial-and-error lesson, cost and gotcha); rebuilt from the real code in every zip; new rule 21 keeps it current
Co-Authored-By: Claude Opus 5.5 <noreply@anthropic.com>
Claude-Session: https://claude.ai/code/session_01JPZJaTbXQFN2qiYRf4rkZK
</commit_message>
<xml_diff>
--- a/docs/Next_Owner_Market_Change_Log.docx
+++ b/docs/Next_Owner_Market_Change_Log.docx
@@ -2,7 +2,7 @@
 <file path=word/document.xml><?xml version="1.0" encoding="utf-8"?>
 <w:document xmlns:w="http://schemas.openxmlformats.org/wordprocessingml/2006/main" xmlns:m="http://schemas.openxmlformats.org/officeDocument/2006/math" xmlns:r="http://schemas.openxmlformats.org/officeDocument/2006/relationships" xmlns:o="urn:schemas-microsoft-com:office:office" xmlns:v="urn:schemas-microsoft-com:vml" xmlns:w10="urn:schemas-microsoft-com:office:word" xmlns:a="http://schemas.openxmlformats.org/drawingml/2006/main" xmlns:pic="http://schemas.openxmlformats.org/drawingml/2006/picture" xmlns:wp="http://schemas.openxmlformats.org/drawingml/2006/wordprocessingDrawing">
   <w:body>
-    <w:bookmarkStart w:id="264" w:name="next-owner-market--change-log"/>
+    <w:bookmarkStart w:id="266" w:name="next-owner-market--change-log"/>
     <w:p>
       <w:pPr>
         <w:pStyle w:val="Heading1"/>
@@ -20,7 +20,7 @@
           <w:iCs/>
           <w:i/>
         </w:rPr>
-        <w:t xml:space="preserve">Every change to the code, database, and documents, oldest first. Generated October 5, 2026 1:30 PM from the project history (238 changes).</w:t>
+        <w:t xml:space="preserve">Every change to the code, database, and documents, oldest first. Generated October 5, 2026 6:53 PM from the project history (240 changes).</w:t>
       </w:r>
     </w:p>
     <w:bookmarkStart w:id="52" w:name="tuesday-september-29-2026"/>
@@ -32094,7 +32094,7 @@
     </w:p>
     <w:bookmarkEnd w:id="254"/>
     <w:bookmarkEnd w:id="255"/>
-    <w:bookmarkStart w:id="263" w:name="monday-october-5-2026"/>
+    <w:bookmarkStart w:id="265" w:name="monday-october-5-2026"/>
     <w:p>
       <w:pPr>
         <w:pStyle w:val="Heading2"/>
@@ -33245,8 +33245,318 @@
       </w:r>
     </w:p>
     <w:bookmarkEnd w:id="262"/>
+    <w:bookmarkStart w:id="263" w:name="X0a9542f343ae87dd0a44ea9c2a46df948c0afa0"/>
+    <w:p>
+      <w:pPr>
+        <w:pStyle w:val="Heading3"/>
+      </w:pPr>
+      <w:r>
+        <w:t xml:space="preserve">13:30 — Records: twice-daily to-do reminders</w:t>
+      </w:r>
+    </w:p>
+    <w:p>
+      <w:pPr>
+        <w:numPr>
+          <w:ilvl w:val="0"/>
+          <w:numId w:val="1239"/>
+        </w:numPr>
+        <w:pStyle w:val="Compact"/>
+      </w:pPr>
+      <w:r>
+        <w:rPr>
+          <w:bCs/>
+          <w:b/>
+        </w:rPr>
+        <w:t xml:space="preserve">Documents:</w:t>
+      </w:r>
+      <w:r>
+        <w:t xml:space="preserve"> </w:t>
+      </w:r>
+      <w:r>
+        <w:rPr>
+          <w:rStyle w:val="VerbatimChar"/>
+        </w:rPr>
+        <w:t xml:space="preserve">docs/Next_Owner_Market_AddOn_Modules_White_Paper.docx</w:t>
+      </w:r>
+      <w:r>
+        <w:t xml:space="preserve">,</w:t>
+      </w:r>
+      <w:r>
+        <w:t xml:space="preserve"> </w:t>
+      </w:r>
+      <w:r>
+        <w:rPr>
+          <w:rStyle w:val="VerbatimChar"/>
+        </w:rPr>
+        <w:t xml:space="preserve">docs/Next_Owner_Market_Beat_The_Competition.docx</w:t>
+      </w:r>
+      <w:r>
+        <w:t xml:space="preserve">,</w:t>
+      </w:r>
+      <w:r>
+        <w:t xml:space="preserve"> </w:t>
+      </w:r>
+      <w:r>
+        <w:rPr>
+          <w:rStyle w:val="VerbatimChar"/>
+        </w:rPr>
+        <w:t xml:space="preserve">docs/Next_Owner_Market_Build_Journal.docx</w:t>
+      </w:r>
+      <w:r>
+        <w:t xml:space="preserve">,</w:t>
+      </w:r>
+      <w:r>
+        <w:t xml:space="preserve"> </w:t>
+      </w:r>
+      <w:r>
+        <w:rPr>
+          <w:rStyle w:val="VerbatimChar"/>
+        </w:rPr>
+        <w:t xml:space="preserve">docs/Next_Owner_Market_Build_Journal.md</w:t>
+      </w:r>
+      <w:r>
+        <w:t xml:space="preserve">,</w:t>
+      </w:r>
+      <w:r>
+        <w:t xml:space="preserve"> </w:t>
+      </w:r>
+      <w:r>
+        <w:rPr>
+          <w:rStyle w:val="VerbatimChar"/>
+        </w:rPr>
+        <w:t xml:space="preserve">docs/Next_Owner_Market_Change_Log.docx</w:t>
+      </w:r>
+      <w:r>
+        <w:t xml:space="preserve">,</w:t>
+      </w:r>
+      <w:r>
+        <w:t xml:space="preserve"> </w:t>
+      </w:r>
+      <w:r>
+        <w:rPr>
+          <w:rStyle w:val="VerbatimChar"/>
+        </w:rPr>
+        <w:t xml:space="preserve">docs/Next_Owner_Market_Change_Log.md</w:t>
+      </w:r>
+      <w:r>
+        <w:t xml:space="preserve">,</w:t>
+      </w:r>
+      <w:r>
+        <w:t xml:space="preserve"> </w:t>
+      </w:r>
+      <w:r>
+        <w:rPr>
+          <w:rStyle w:val="VerbatimChar"/>
+        </w:rPr>
+        <w:t xml:space="preserve">docs/Next_Owner_Market_Complete_Guide.docx</w:t>
+      </w:r>
+      <w:r>
+        <w:t xml:space="preserve">,</w:t>
+      </w:r>
+      <w:r>
+        <w:t xml:space="preserve"> </w:t>
+      </w:r>
+      <w:r>
+        <w:rPr>
+          <w:rStyle w:val="VerbatimChar"/>
+        </w:rPr>
+        <w:t xml:space="preserve">docs/Next_Owner_Market_Estate_Pack_Legal_Research.docx</w:t>
+      </w:r>
+      <w:r>
+        <w:t xml:space="preserve">,</w:t>
+      </w:r>
+      <w:r>
+        <w:t xml:space="preserve"> </w:t>
+      </w:r>
+      <w:r>
+        <w:rPr>
+          <w:rStyle w:val="VerbatimChar"/>
+        </w:rPr>
+        <w:t xml:space="preserve">docs/Next_Owner_Market_Facebook_Page_Kit.docx</w:t>
+      </w:r>
+      <w:r>
+        <w:t xml:space="preserve">,</w:t>
+      </w:r>
+      <w:r>
+        <w:t xml:space="preserve"> </w:t>
+      </w:r>
+      <w:r>
+        <w:rPr>
+          <w:rStyle w:val="VerbatimChar"/>
+        </w:rPr>
+        <w:t xml:space="preserve">docs/Next_Owner_Market_File_Index.docx</w:t>
+      </w:r>
+      <w:r>
+        <w:t xml:space="preserve">,</w:t>
+      </w:r>
+      <w:r>
+        <w:t xml:space="preserve"> </w:t>
+      </w:r>
+      <w:r>
+        <w:rPr>
+          <w:rStyle w:val="VerbatimChar"/>
+        </w:rPr>
+        <w:t xml:space="preserve">docs/Next_Owner_Market_Google_Merchant_Center_Fix.docx</w:t>
+      </w:r>
+      <w:r>
+        <w:t xml:space="preserve">,</w:t>
+      </w:r>
+      <w:r>
+        <w:t xml:space="preserve"> </w:t>
+      </w:r>
+      <w:r>
+        <w:rPr>
+          <w:rStyle w:val="VerbatimChar"/>
+        </w:rPr>
+        <w:t xml:space="preserve">docs/Next_Owner_Market_Launch_Kit.docx</w:t>
+      </w:r>
+      <w:r>
+        <w:t xml:space="preserve"> </w:t>
+      </w:r>
+      <w:r>
+        <w:t xml:space="preserve">(+12 more)</w:t>
+      </w:r>
+    </w:p>
+    <w:p>
+      <w:pPr>
+        <w:pStyle w:val="FirstParagraph"/>
+      </w:pPr>
+      <w:r>
+        <w:t xml:space="preserve">change id 2c67f37</w:t>
+      </w:r>
+    </w:p>
     <w:bookmarkEnd w:id="263"/>
+    <w:bookmarkStart w:id="264" w:name="Xa1205d77a2c1ee9893c669ad136ba70b19de94a"/>
+    <w:p>
+      <w:pPr>
+        <w:pStyle w:val="Heading3"/>
+      </w:pPr>
+      <w:r>
+        <w:t xml:space="preserve">18:46 — To-do page: wording now matches the 11 AM / 5 PM reminders; 'Only once it's due within 3 days' option works again</w:t>
+      </w:r>
+    </w:p>
+    <w:p>
+      <w:pPr>
+        <w:numPr>
+          <w:ilvl w:val="0"/>
+          <w:numId w:val="1240"/>
+        </w:numPr>
+        <w:pStyle w:val="Compact"/>
+      </w:pPr>
+      <w:r>
+        <w:rPr>
+          <w:bCs/>
+          <w:b/>
+        </w:rPr>
+        <w:t xml:space="preserve">Documents:</w:t>
+      </w:r>
+      <w:r>
+        <w:t xml:space="preserve"> </w:t>
+      </w:r>
+      <w:r>
+        <w:rPr>
+          <w:rStyle w:val="VerbatimChar"/>
+        </w:rPr>
+        <w:t xml:space="preserve">docs/Next_Owner_Market_Build_Journal.md</w:t>
+      </w:r>
+      <w:r>
+        <w:t xml:space="preserve">,</w:t>
+      </w:r>
+      <w:r>
+        <w:t xml:space="preserve"> </w:t>
+      </w:r>
+      <w:r>
+        <w:rPr>
+          <w:rStyle w:val="VerbatimChar"/>
+        </w:rPr>
+        <w:t xml:space="preserve">docs/journal_sessions/faa89acb-5a67-582b-a46a-1c3f3b736545.md</w:t>
+      </w:r>
+      <w:r>
+        <w:t xml:space="preserve">,</w:t>
+      </w:r>
+      <w:r>
+        <w:t xml:space="preserve"> </w:t>
+      </w:r>
+      <w:r>
+        <w:rPr>
+          <w:rStyle w:val="VerbatimChar"/>
+        </w:rPr>
+        <w:t xml:space="preserve">docs/journal_sessions/faa89acb-5a67-582b-a46a-1c3f3b736545.rows.json</w:t>
+      </w:r>
+    </w:p>
+    <w:p>
+      <w:pPr>
+        <w:numPr>
+          <w:ilvl w:val="0"/>
+          <w:numId w:val="1240"/>
+        </w:numPr>
+        <w:pStyle w:val="Compact"/>
+      </w:pPr>
+      <w:r>
+        <w:rPr>
+          <w:bCs/>
+          <w:b/>
+        </w:rPr>
+        <w:t xml:space="preserve">Seller / staff app:</w:t>
+      </w:r>
+      <w:r>
+        <w:t xml:space="preserve"> </w:t>
+      </w:r>
+      <w:r>
+        <w:rPr>
+          <w:rStyle w:val="VerbatimChar"/>
+        </w:rPr>
+        <w:t xml:space="preserve">src/app/app/todo/TodoClient.tsx</w:t>
+      </w:r>
+      <w:r>
+        <w:t xml:space="preserve">,</w:t>
+      </w:r>
+      <w:r>
+        <w:t xml:space="preserve"> </w:t>
+      </w:r>
+      <w:r>
+        <w:rPr>
+          <w:rStyle w:val="VerbatimChar"/>
+        </w:rPr>
+        <w:t xml:space="preserve">src/app/app/todo/page.tsx</w:t>
+      </w:r>
+    </w:p>
+    <w:p>
+      <w:pPr>
+        <w:numPr>
+          <w:ilvl w:val="0"/>
+          <w:numId w:val="1240"/>
+        </w:numPr>
+        <w:pStyle w:val="Compact"/>
+      </w:pPr>
+      <w:r>
+        <w:rPr>
+          <w:bCs/>
+          <w:b/>
+        </w:rPr>
+        <w:t xml:space="preserve">Shared code (logic):</w:t>
+      </w:r>
+      <w:r>
+        <w:t xml:space="preserve"> </w:t>
+      </w:r>
+      <w:r>
+        <w:rPr>
+          <w:rStyle w:val="VerbatimChar"/>
+        </w:rPr>
+        <w:t xml:space="preserve">src/lib/automations.ts</w:t>
+      </w:r>
+    </w:p>
+    <w:p>
+      <w:pPr>
+        <w:pStyle w:val="FirstParagraph"/>
+      </w:pPr>
+      <w:r>
+        <w:t xml:space="preserve">change id cef6b0a</w:t>
+      </w:r>
+    </w:p>
     <w:bookmarkEnd w:id="264"/>
+    <w:bookmarkEnd w:id="265"/>
+    <w:bookmarkEnd w:id="266"/>
     <w:sectPr/>
   </w:body>
 </w:document>
@@ -34144,6 +34454,12 @@
     <w:abstractNumId w:val="991"/>
   </w:num>
   <w:num w:numId="1238">
+    <w:abstractNumId w:val="991"/>
+  </w:num>
+  <w:num w:numId="1239">
+    <w:abstractNumId w:val="991"/>
+  </w:num>
+  <w:num w:numId="1240">
     <w:abstractNumId w:val="991"/>
   </w:num>
 </w:numbering>

</xml_diff>

<commit_message>
Records: latest journal, change log and playbook
Co-Authored-By: Claude Opus 5.5 <noreply@anthropic.com>
Claude-Session: https://claude.ai/code/session_01JPZJaTbXQFN2qiYRf4rkZK
</commit_message>
<xml_diff>
--- a/docs/Next_Owner_Market_Change_Log.docx
+++ b/docs/Next_Owner_Market_Change_Log.docx
@@ -2,7 +2,7 @@
 <file path=word/document.xml><?xml version="1.0" encoding="utf-8"?>
 <w:document xmlns:w="http://schemas.openxmlformats.org/wordprocessingml/2006/main" xmlns:m="http://schemas.openxmlformats.org/officeDocument/2006/math" xmlns:r="http://schemas.openxmlformats.org/officeDocument/2006/relationships" xmlns:o="urn:schemas-microsoft-com:office:office" xmlns:v="urn:schemas-microsoft-com:vml" xmlns:w10="urn:schemas-microsoft-com:office:word" xmlns:a="http://schemas.openxmlformats.org/drawingml/2006/main" xmlns:pic="http://schemas.openxmlformats.org/drawingml/2006/picture" xmlns:wp="http://schemas.openxmlformats.org/drawingml/2006/wordprocessingDrawing">
   <w:body>
-    <w:bookmarkStart w:id="266" w:name="next-owner-market--change-log"/>
+    <w:bookmarkStart w:id="267" w:name="next-owner-market--change-log"/>
     <w:p>
       <w:pPr>
         <w:pStyle w:val="Heading1"/>
@@ -20,7 +20,7 @@
           <w:iCs/>
           <w:i/>
         </w:rPr>
-        <w:t xml:space="preserve">Every change to the code, database, and documents, oldest first. Generated October 5, 2026 6:53 PM from the project history (240 changes).</w:t>
+        <w:t xml:space="preserve">Every change to the code, database, and documents, oldest first. Generated October 5, 2026 6:57 PM from the project history (241 changes).</w:t>
       </w:r>
     </w:p>
     <w:bookmarkStart w:id="52" w:name="tuesday-september-29-2026"/>
@@ -32094,7 +32094,7 @@
     </w:p>
     <w:bookmarkEnd w:id="254"/>
     <w:bookmarkEnd w:id="255"/>
-    <w:bookmarkStart w:id="265" w:name="monday-october-5-2026"/>
+    <w:bookmarkStart w:id="266" w:name="monday-october-5-2026"/>
     <w:p>
       <w:pPr>
         <w:pStyle w:val="Heading2"/>
@@ -33555,8 +33555,251 @@
       </w:r>
     </w:p>
     <w:bookmarkEnd w:id="264"/>
+    <w:bookmarkStart w:id="265" w:name="Xdc2dd1030d05975af1c1ac0576c812951d8234f"/>
+    <w:p>
+      <w:pPr>
+        <w:pStyle w:val="Heading3"/>
+      </w:pPr>
+      <w:r>
+        <w:t xml:space="preserve">18:53 — App Builder's Playbook: master guide for building any app the way we built this one (exact to-do/reminder handoff with real code, every rule, pattern, outside service and workaround, trial-and-error lesson, cost and gotcha); rebuilt from the real code in every zip; new rule 21 keeps it current</w:t>
+      </w:r>
+    </w:p>
+    <w:p>
+      <w:pPr>
+        <w:numPr>
+          <w:ilvl w:val="0"/>
+          <w:numId w:val="1241"/>
+        </w:numPr>
+        <w:pStyle w:val="Compact"/>
+      </w:pPr>
+      <w:r>
+        <w:rPr>
+          <w:bCs/>
+          <w:b/>
+        </w:rPr>
+        <w:t xml:space="preserve">Project rules:</w:t>
+      </w:r>
+      <w:r>
+        <w:t xml:space="preserve"> </w:t>
+      </w:r>
+      <w:r>
+        <w:rPr>
+          <w:rStyle w:val="VerbatimChar"/>
+        </w:rPr>
+        <w:t xml:space="preserve">CLAUDE.md</w:t>
+      </w:r>
+    </w:p>
+    <w:p>
+      <w:pPr>
+        <w:numPr>
+          <w:ilvl w:val="0"/>
+          <w:numId w:val="1241"/>
+        </w:numPr>
+        <w:pStyle w:val="Compact"/>
+      </w:pPr>
+      <w:r>
+        <w:rPr>
+          <w:bCs/>
+          <w:b/>
+        </w:rPr>
+        <w:t xml:space="preserve">Documents:</w:t>
+      </w:r>
+      <w:r>
+        <w:t xml:space="preserve"> </w:t>
+      </w:r>
+      <w:r>
+        <w:rPr>
+          <w:rStyle w:val="VerbatimChar"/>
+        </w:rPr>
+        <w:t xml:space="preserve">docs/Next_Owner_Market_AddOn_Modules_White_Paper.docx</w:t>
+      </w:r>
+      <w:r>
+        <w:t xml:space="preserve">,</w:t>
+      </w:r>
+      <w:r>
+        <w:t xml:space="preserve"> </w:t>
+      </w:r>
+      <w:r>
+        <w:rPr>
+          <w:rStyle w:val="VerbatimChar"/>
+        </w:rPr>
+        <w:t xml:space="preserve">docs/Next_Owner_Market_App_Builder_Playbook.docx</w:t>
+      </w:r>
+      <w:r>
+        <w:t xml:space="preserve">,</w:t>
+      </w:r>
+      <w:r>
+        <w:t xml:space="preserve"> </w:t>
+      </w:r>
+      <w:r>
+        <w:rPr>
+          <w:rStyle w:val="VerbatimChar"/>
+        </w:rPr>
+        <w:t xml:space="preserve">docs/Next_Owner_Market_App_Builder_Playbook.md</w:t>
+      </w:r>
+      <w:r>
+        <w:t xml:space="preserve">,</w:t>
+      </w:r>
+      <w:r>
+        <w:t xml:space="preserve"> </w:t>
+      </w:r>
+      <w:r>
+        <w:rPr>
+          <w:rStyle w:val="VerbatimChar"/>
+        </w:rPr>
+        <w:t xml:space="preserve">docs/Next_Owner_Market_Beat_The_Competition.docx</w:t>
+      </w:r>
+      <w:r>
+        <w:t xml:space="preserve">,</w:t>
+      </w:r>
+      <w:r>
+        <w:t xml:space="preserve"> </w:t>
+      </w:r>
+      <w:r>
+        <w:rPr>
+          <w:rStyle w:val="VerbatimChar"/>
+        </w:rPr>
+        <w:t xml:space="preserve">docs/Next_Owner_Market_Build_Journal.docx</w:t>
+      </w:r>
+      <w:r>
+        <w:t xml:space="preserve">,</w:t>
+      </w:r>
+      <w:r>
+        <w:t xml:space="preserve"> </w:t>
+      </w:r>
+      <w:r>
+        <w:rPr>
+          <w:rStyle w:val="VerbatimChar"/>
+        </w:rPr>
+        <w:t xml:space="preserve">docs/Next_Owner_Market_Build_Journal.md</w:t>
+      </w:r>
+      <w:r>
+        <w:t xml:space="preserve">,</w:t>
+      </w:r>
+      <w:r>
+        <w:t xml:space="preserve"> </w:t>
+      </w:r>
+      <w:r>
+        <w:rPr>
+          <w:rStyle w:val="VerbatimChar"/>
+        </w:rPr>
+        <w:t xml:space="preserve">docs/Next_Owner_Market_Change_Log.docx</w:t>
+      </w:r>
+      <w:r>
+        <w:t xml:space="preserve">,</w:t>
+      </w:r>
+      <w:r>
+        <w:t xml:space="preserve"> </w:t>
+      </w:r>
+      <w:r>
+        <w:rPr>
+          <w:rStyle w:val="VerbatimChar"/>
+        </w:rPr>
+        <w:t xml:space="preserve">docs/Next_Owner_Market_Change_Log.md</w:t>
+      </w:r>
+      <w:r>
+        <w:t xml:space="preserve">,</w:t>
+      </w:r>
+      <w:r>
+        <w:t xml:space="preserve"> </w:t>
+      </w:r>
+      <w:r>
+        <w:rPr>
+          <w:rStyle w:val="VerbatimChar"/>
+        </w:rPr>
+        <w:t xml:space="preserve">docs/Next_Owner_Market_Complete_Guide.docx</w:t>
+      </w:r>
+      <w:r>
+        <w:t xml:space="preserve">,</w:t>
+      </w:r>
+      <w:r>
+        <w:t xml:space="preserve"> </w:t>
+      </w:r>
+      <w:r>
+        <w:rPr>
+          <w:rStyle w:val="VerbatimChar"/>
+        </w:rPr>
+        <w:t xml:space="preserve">docs/Next_Owner_Market_Estate_Pack_Legal_Research.docx</w:t>
+      </w:r>
+      <w:r>
+        <w:t xml:space="preserve">,</w:t>
+      </w:r>
+      <w:r>
+        <w:t xml:space="preserve"> </w:t>
+      </w:r>
+      <w:r>
+        <w:rPr>
+          <w:rStyle w:val="VerbatimChar"/>
+        </w:rPr>
+        <w:t xml:space="preserve">docs/Next_Owner_Market_Facebook_Page_Kit.docx</w:t>
+      </w:r>
+      <w:r>
+        <w:t xml:space="preserve">,</w:t>
+      </w:r>
+      <w:r>
+        <w:t xml:space="preserve"> </w:t>
+      </w:r>
+      <w:r>
+        <w:rPr>
+          <w:rStyle w:val="VerbatimChar"/>
+        </w:rPr>
+        <w:t xml:space="preserve">docs/Next_Owner_Market_File_Index.docx</w:t>
+      </w:r>
+      <w:r>
+        <w:t xml:space="preserve"> </w:t>
+      </w:r>
+      <w:r>
+        <w:t xml:space="preserve">(+17 more)</w:t>
+      </w:r>
+    </w:p>
+    <w:p>
+      <w:pPr>
+        <w:numPr>
+          <w:ilvl w:val="0"/>
+          <w:numId w:val="1241"/>
+        </w:numPr>
+        <w:pStyle w:val="Compact"/>
+      </w:pPr>
+      <w:r>
+        <w:rPr>
+          <w:bCs/>
+          <w:b/>
+        </w:rPr>
+        <w:t xml:space="preserve">Automation scripts:</w:t>
+      </w:r>
+      <w:r>
+        <w:t xml:space="preserve"> </w:t>
+      </w:r>
+      <w:r>
+        <w:rPr>
+          <w:rStyle w:val="VerbatimChar"/>
+        </w:rPr>
+        <w:t xml:space="preserve">scripts/build_playbook.py</w:t>
+      </w:r>
+      <w:r>
+        <w:t xml:space="preserve">,</w:t>
+      </w:r>
+      <w:r>
+        <w:t xml:space="preserve"> </w:t>
+      </w:r>
+      <w:r>
+        <w:rPr>
+          <w:rStyle w:val="VerbatimChar"/>
+        </w:rPr>
+        <w:t xml:space="preserve">scripts/package.sh</w:t>
+      </w:r>
+    </w:p>
+    <w:p>
+      <w:pPr>
+        <w:pStyle w:val="FirstParagraph"/>
+      </w:pPr>
+      <w:r>
+        <w:t xml:space="preserve">change id cfd9ee3</w:t>
+      </w:r>
+    </w:p>
     <w:bookmarkEnd w:id="265"/>
     <w:bookmarkEnd w:id="266"/>
+    <w:bookmarkEnd w:id="267"/>
     <w:sectPr/>
   </w:body>
 </w:document>
@@ -34460,6 +34703,9 @@
     <w:abstractNumId w:val="991"/>
   </w:num>
   <w:num w:numId="1240">
+    <w:abstractNumId w:val="991"/>
+  </w:num>
+  <w:num w:numId="1241">
     <w:abstractNumId w:val="991"/>
   </w:num>
 </w:numbering>

</xml_diff>

<commit_message>
Records: journal, change log, Playbook v1.2
Co-Authored-By: Claude Opus 5.5 <noreply@anthropic.com>
Claude-Session: https://claude.ai/code/session_01JPZJaTbXQFN2qiYRf4rkZK
</commit_message>
<xml_diff>
--- a/docs/Next_Owner_Market_Change_Log.docx
+++ b/docs/Next_Owner_Market_Change_Log.docx
@@ -2,7 +2,7 @@
 <file path=word/document.xml><?xml version="1.0" encoding="utf-8"?>
 <w:document xmlns:w="http://schemas.openxmlformats.org/wordprocessingml/2006/main" xmlns:m="http://schemas.openxmlformats.org/officeDocument/2006/math" xmlns:r="http://schemas.openxmlformats.org/officeDocument/2006/relationships" xmlns:o="urn:schemas-microsoft-com:office:office" xmlns:v="urn:schemas-microsoft-com:vml" xmlns:w10="urn:schemas-microsoft-com:office:word" xmlns:a="http://schemas.openxmlformats.org/drawingml/2006/main" xmlns:pic="http://schemas.openxmlformats.org/drawingml/2006/picture" xmlns:wp="http://schemas.openxmlformats.org/drawingml/2006/wordprocessingDrawing">
   <w:body>
-    <w:bookmarkStart w:id="267" w:name="next-owner-market--change-log"/>
+    <w:bookmarkStart w:id="269" w:name="next-owner-market--change-log"/>
     <w:p>
       <w:pPr>
         <w:pStyle w:val="Heading1"/>
@@ -20,7 +20,7 @@
           <w:iCs/>
           <w:i/>
         </w:rPr>
-        <w:t xml:space="preserve">Every change to the code, database, and documents, oldest first. Generated October 5, 2026 6:57 PM from the project history (241 changes).</w:t>
+        <w:t xml:space="preserve">Every change to the code, database, and documents, oldest first. Generated October 5, 2026 8:45 PM from the project history (243 changes).</w:t>
       </w:r>
     </w:p>
     <w:bookmarkStart w:id="52" w:name="tuesday-september-29-2026"/>
@@ -32094,7 +32094,7 @@
     </w:p>
     <w:bookmarkEnd w:id="254"/>
     <w:bookmarkEnd w:id="255"/>
-    <w:bookmarkStart w:id="266" w:name="monday-october-5-2026"/>
+    <w:bookmarkStart w:id="268" w:name="monday-october-5-2026"/>
     <w:p>
       <w:pPr>
         <w:pStyle w:val="Heading2"/>
@@ -33798,8 +33798,575 @@
       </w:r>
     </w:p>
     <w:bookmarkEnd w:id="265"/>
+    <w:bookmarkStart w:id="266" w:name="X31734c67417070c9fcfe5a8679e42be895cd537"/>
+    <w:p>
+      <w:pPr>
+        <w:pStyle w:val="Heading3"/>
+      </w:pPr>
+      <w:r>
+        <w:t xml:space="preserve">18:57 — Records: latest journal, change log and playbook</w:t>
+      </w:r>
+    </w:p>
+    <w:p>
+      <w:pPr>
+        <w:numPr>
+          <w:ilvl w:val="0"/>
+          <w:numId w:val="1242"/>
+        </w:numPr>
+        <w:pStyle w:val="Compact"/>
+      </w:pPr>
+      <w:r>
+        <w:rPr>
+          <w:bCs/>
+          <w:b/>
+        </w:rPr>
+        <w:t xml:space="preserve">Documents:</w:t>
+      </w:r>
+      <w:r>
+        <w:t xml:space="preserve"> </w:t>
+      </w:r>
+      <w:r>
+        <w:rPr>
+          <w:rStyle w:val="VerbatimChar"/>
+        </w:rPr>
+        <w:t xml:space="preserve">docs/Next_Owner_Market_AddOn_Modules_White_Paper.docx</w:t>
+      </w:r>
+      <w:r>
+        <w:t xml:space="preserve">,</w:t>
+      </w:r>
+      <w:r>
+        <w:t xml:space="preserve"> </w:t>
+      </w:r>
+      <w:r>
+        <w:rPr>
+          <w:rStyle w:val="VerbatimChar"/>
+        </w:rPr>
+        <w:t xml:space="preserve">docs/Next_Owner_Market_App_Builder_Playbook.docx</w:t>
+      </w:r>
+      <w:r>
+        <w:t xml:space="preserve">,</w:t>
+      </w:r>
+      <w:r>
+        <w:t xml:space="preserve"> </w:t>
+      </w:r>
+      <w:r>
+        <w:rPr>
+          <w:rStyle w:val="VerbatimChar"/>
+        </w:rPr>
+        <w:t xml:space="preserve">docs/Next_Owner_Market_Beat_The_Competition.docx</w:t>
+      </w:r>
+      <w:r>
+        <w:t xml:space="preserve">,</w:t>
+      </w:r>
+      <w:r>
+        <w:t xml:space="preserve"> </w:t>
+      </w:r>
+      <w:r>
+        <w:rPr>
+          <w:rStyle w:val="VerbatimChar"/>
+        </w:rPr>
+        <w:t xml:space="preserve">docs/Next_Owner_Market_Build_Journal.docx</w:t>
+      </w:r>
+      <w:r>
+        <w:t xml:space="preserve">,</w:t>
+      </w:r>
+      <w:r>
+        <w:t xml:space="preserve"> </w:t>
+      </w:r>
+      <w:r>
+        <w:rPr>
+          <w:rStyle w:val="VerbatimChar"/>
+        </w:rPr>
+        <w:t xml:space="preserve">docs/Next_Owner_Market_Build_Journal.md</w:t>
+      </w:r>
+      <w:r>
+        <w:t xml:space="preserve">,</w:t>
+      </w:r>
+      <w:r>
+        <w:t xml:space="preserve"> </w:t>
+      </w:r>
+      <w:r>
+        <w:rPr>
+          <w:rStyle w:val="VerbatimChar"/>
+        </w:rPr>
+        <w:t xml:space="preserve">docs/Next_Owner_Market_Change_Log.docx</w:t>
+      </w:r>
+      <w:r>
+        <w:t xml:space="preserve">,</w:t>
+      </w:r>
+      <w:r>
+        <w:t xml:space="preserve"> </w:t>
+      </w:r>
+      <w:r>
+        <w:rPr>
+          <w:rStyle w:val="VerbatimChar"/>
+        </w:rPr>
+        <w:t xml:space="preserve">docs/Next_Owner_Market_Change_Log.md</w:t>
+      </w:r>
+      <w:r>
+        <w:t xml:space="preserve">,</w:t>
+      </w:r>
+      <w:r>
+        <w:t xml:space="preserve"> </w:t>
+      </w:r>
+      <w:r>
+        <w:rPr>
+          <w:rStyle w:val="VerbatimChar"/>
+        </w:rPr>
+        <w:t xml:space="preserve">docs/Next_Owner_Market_Complete_Guide.docx</w:t>
+      </w:r>
+      <w:r>
+        <w:t xml:space="preserve">,</w:t>
+      </w:r>
+      <w:r>
+        <w:t xml:space="preserve"> </w:t>
+      </w:r>
+      <w:r>
+        <w:rPr>
+          <w:rStyle w:val="VerbatimChar"/>
+        </w:rPr>
+        <w:t xml:space="preserve">docs/Next_Owner_Market_Estate_Pack_Legal_Research.docx</w:t>
+      </w:r>
+      <w:r>
+        <w:t xml:space="preserve">,</w:t>
+      </w:r>
+      <w:r>
+        <w:t xml:space="preserve"> </w:t>
+      </w:r>
+      <w:r>
+        <w:rPr>
+          <w:rStyle w:val="VerbatimChar"/>
+        </w:rPr>
+        <w:t xml:space="preserve">docs/Next_Owner_Market_Facebook_Page_Kit.docx</w:t>
+      </w:r>
+      <w:r>
+        <w:t xml:space="preserve">,</w:t>
+      </w:r>
+      <w:r>
+        <w:t xml:space="preserve"> </w:t>
+      </w:r>
+      <w:r>
+        <w:rPr>
+          <w:rStyle w:val="VerbatimChar"/>
+        </w:rPr>
+        <w:t xml:space="preserve">docs/Next_Owner_Market_File_Index.docx</w:t>
+      </w:r>
+      <w:r>
+        <w:t xml:space="preserve">,</w:t>
+      </w:r>
+      <w:r>
+        <w:t xml:space="preserve"> </w:t>
+      </w:r>
+      <w:r>
+        <w:rPr>
+          <w:rStyle w:val="VerbatimChar"/>
+        </w:rPr>
+        <w:t xml:space="preserve">docs/Next_Owner_Market_Google_Merchant_Center_Fix.docx</w:t>
+      </w:r>
+      <w:r>
+        <w:t xml:space="preserve"> </w:t>
+      </w:r>
+      <w:r>
+        <w:t xml:space="preserve">(+13 more)</w:t>
+      </w:r>
+    </w:p>
+    <w:p>
+      <w:pPr>
+        <w:pStyle w:val="FirstParagraph"/>
+      </w:pPr>
+      <w:r>
+        <w:t xml:space="preserve">change id 4301f81</w:t>
+      </w:r>
+    </w:p>
     <w:bookmarkEnd w:id="266"/>
+    <w:bookmarkStart w:id="267" w:name="X396b6912b3bdfcd36fed9311a0f1f931eded7ad"/>
+    <w:p>
+      <w:pPr>
+        <w:pStyle w:val="Heading3"/>
+      </w:pPr>
+      <w:r>
+        <w:t xml:space="preserve">20:42 — Lessons from the political posting app: AI listings and copies no longer contain em dashes or curly quotes; a failed to-do reminder retries at :20 and :40; a session can't end with unsent changes (Stop hook); diff check before deploys; Playbook v1.2 merges both apps' lessons</w:t>
+      </w:r>
+    </w:p>
+    <w:p>
+      <w:pPr>
+        <w:numPr>
+          <w:ilvl w:val="0"/>
+          <w:numId w:val="1243"/>
+        </w:numPr>
+        <w:pStyle w:val="Compact"/>
+      </w:pPr>
+      <w:r>
+        <w:rPr>
+          <w:bCs/>
+          <w:b/>
+        </w:rPr>
+        <w:t xml:space="preserve">Project automation:</w:t>
+      </w:r>
+      <w:r>
+        <w:t xml:space="preserve"> </w:t>
+      </w:r>
+      <w:r>
+        <w:rPr>
+          <w:rStyle w:val="VerbatimChar"/>
+        </w:rPr>
+        <w:t xml:space="preserve">.claude/settings.json</w:t>
+      </w:r>
+    </w:p>
+    <w:p>
+      <w:pPr>
+        <w:numPr>
+          <w:ilvl w:val="0"/>
+          <w:numId w:val="1243"/>
+        </w:numPr>
+        <w:pStyle w:val="Compact"/>
+      </w:pPr>
+      <w:r>
+        <w:rPr>
+          <w:bCs/>
+          <w:b/>
+        </w:rPr>
+        <w:t xml:space="preserve">Project rules:</w:t>
+      </w:r>
+      <w:r>
+        <w:t xml:space="preserve"> </w:t>
+      </w:r>
+      <w:r>
+        <w:rPr>
+          <w:rStyle w:val="VerbatimChar"/>
+        </w:rPr>
+        <w:t xml:space="preserve">CLAUDE.md</w:t>
+      </w:r>
+    </w:p>
+    <w:p>
+      <w:pPr>
+        <w:numPr>
+          <w:ilvl w:val="0"/>
+          <w:numId w:val="1243"/>
+        </w:numPr>
+        <w:pStyle w:val="Compact"/>
+      </w:pPr>
+      <w:r>
+        <w:rPr>
+          <w:bCs/>
+          <w:b/>
+        </w:rPr>
+        <w:t xml:space="preserve">Documents:</w:t>
+      </w:r>
+      <w:r>
+        <w:t xml:space="preserve"> </w:t>
+      </w:r>
+      <w:r>
+        <w:rPr>
+          <w:rStyle w:val="VerbatimChar"/>
+        </w:rPr>
+        <w:t xml:space="preserve">docs/Next_Owner_Market_App_Builder_Playbook.md</w:t>
+      </w:r>
+      <w:r>
+        <w:t xml:space="preserve">,</w:t>
+      </w:r>
+      <w:r>
+        <w:t xml:space="preserve"> </w:t>
+      </w:r>
+      <w:r>
+        <w:rPr>
+          <w:rStyle w:val="VerbatimChar"/>
+        </w:rPr>
+        <w:t xml:space="preserve">docs/Next_Owner_Market_Build_Journal.md</w:t>
+      </w:r>
+      <w:r>
+        <w:t xml:space="preserve">,</w:t>
+      </w:r>
+      <w:r>
+        <w:t xml:space="preserve"> </w:t>
+      </w:r>
+      <w:r>
+        <w:rPr>
+          <w:rStyle w:val="VerbatimChar"/>
+        </w:rPr>
+        <w:t xml:space="preserve">docs/Next_Owner_Market_Complete_Guide.md</w:t>
+      </w:r>
+      <w:r>
+        <w:t xml:space="preserve">,</w:t>
+      </w:r>
+      <w:r>
+        <w:t xml:space="preserve"> </w:t>
+      </w:r>
+      <w:r>
+        <w:rPr>
+          <w:rStyle w:val="VerbatimChar"/>
+        </w:rPr>
+        <w:t xml:space="preserve">docs/Next_Owner_Market_Operating_Rules.md</w:t>
+      </w:r>
+      <w:r>
+        <w:t xml:space="preserve">,</w:t>
+      </w:r>
+      <w:r>
+        <w:t xml:space="preserve"> </w:t>
+      </w:r>
+      <w:r>
+        <w:rPr>
+          <w:rStyle w:val="VerbatimChar"/>
+        </w:rPr>
+        <w:t xml:space="preserve">docs/Next_Owner_Market_User_Guide.md</w:t>
+      </w:r>
+      <w:r>
+        <w:t xml:space="preserve">,</w:t>
+      </w:r>
+      <w:r>
+        <w:t xml:space="preserve"> </w:t>
+      </w:r>
+      <w:r>
+        <w:rPr>
+          <w:rStyle w:val="VerbatimChar"/>
+        </w:rPr>
+        <w:t xml:space="preserve">docs/journal_sessions/faa89acb-5a67-582b-a46a-1c3f3b736545.md</w:t>
+      </w:r>
+      <w:r>
+        <w:t xml:space="preserve">,</w:t>
+      </w:r>
+      <w:r>
+        <w:t xml:space="preserve"> </w:t>
+      </w:r>
+      <w:r>
+        <w:rPr>
+          <w:rStyle w:val="VerbatimChar"/>
+        </w:rPr>
+        <w:t xml:space="preserve">docs/journal_sessions/faa89acb-5a67-582b-a46a-1c3f3b736545.rows.json</w:t>
+      </w:r>
+      <w:r>
+        <w:t xml:space="preserve">,</w:t>
+      </w:r>
+      <w:r>
+        <w:t xml:space="preserve"> </w:t>
+      </w:r>
+      <w:r>
+        <w:rPr>
+          <w:rStyle w:val="VerbatimChar"/>
+        </w:rPr>
+        <w:t xml:space="preserve">docs/playbook/template.md</w:t>
+      </w:r>
+    </w:p>
+    <w:p>
+      <w:pPr>
+        <w:numPr>
+          <w:ilvl w:val="0"/>
+          <w:numId w:val="1243"/>
+        </w:numPr>
+        <w:pStyle w:val="Compact"/>
+      </w:pPr>
+      <w:r>
+        <w:rPr>
+          <w:bCs/>
+          <w:b/>
+        </w:rPr>
+        <w:t xml:space="preserve">Automation scripts:</w:t>
+      </w:r>
+      <w:r>
+        <w:t xml:space="preserve"> </w:t>
+      </w:r>
+      <w:r>
+        <w:rPr>
+          <w:rStyle w:val="VerbatimChar"/>
+        </w:rPr>
+        <w:t xml:space="preserve">scripts/build_playbook.py</w:t>
+      </w:r>
+      <w:r>
+        <w:t xml:space="preserve">,</w:t>
+      </w:r>
+      <w:r>
+        <w:t xml:space="preserve"> </w:t>
+      </w:r>
+      <w:r>
+        <w:rPr>
+          <w:rStyle w:val="VerbatimChar"/>
+        </w:rPr>
+        <w:t xml:space="preserve">scripts/diff_check.sh</w:t>
+      </w:r>
+      <w:r>
+        <w:t xml:space="preserve">,</w:t>
+      </w:r>
+      <w:r>
+        <w:t xml:space="preserve"> </w:t>
+      </w:r>
+      <w:r>
+        <w:rPr>
+          <w:rStyle w:val="VerbatimChar"/>
+        </w:rPr>
+        <w:t xml:space="preserve">scripts/mark_sent.sh</w:t>
+      </w:r>
+      <w:r>
+        <w:t xml:space="preserve">,</w:t>
+      </w:r>
+      <w:r>
+        <w:t xml:space="preserve"> </w:t>
+      </w:r>
+      <w:r>
+        <w:rPr>
+          <w:rStyle w:val="VerbatimChar"/>
+        </w:rPr>
+        <w:t xml:space="preserve">scripts/stop_check.py</w:t>
+      </w:r>
+    </w:p>
+    <w:p>
+      <w:pPr>
+        <w:numPr>
+          <w:ilvl w:val="0"/>
+          <w:numId w:val="1243"/>
+        </w:numPr>
+        <w:pStyle w:val="Compact"/>
+      </w:pPr>
+      <w:r>
+        <w:rPr>
+          <w:bCs/>
+          <w:b/>
+        </w:rPr>
+        <w:t xml:space="preserve">Server routes (API):</w:t>
+      </w:r>
+      <w:r>
+        <w:t xml:space="preserve"> </w:t>
+      </w:r>
+      <w:r>
+        <w:rPr>
+          <w:rStyle w:val="VerbatimChar"/>
+        </w:rPr>
+        <w:t xml:space="preserve">src/app/api/ai-listing/revise/route.ts</w:t>
+      </w:r>
+      <w:r>
+        <w:t xml:space="preserve">,</w:t>
+      </w:r>
+      <w:r>
+        <w:t xml:space="preserve"> </w:t>
+      </w:r>
+      <w:r>
+        <w:rPr>
+          <w:rStyle w:val="VerbatimChar"/>
+        </w:rPr>
+        <w:t xml:space="preserve">src/app/api/ai-listing/route.ts</w:t>
+      </w:r>
+      <w:r>
+        <w:t xml:space="preserve">,</w:t>
+      </w:r>
+      <w:r>
+        <w:t xml:space="preserve"> </w:t>
+      </w:r>
+      <w:r>
+        <w:rPr>
+          <w:rStyle w:val="VerbatimChar"/>
+        </w:rPr>
+        <w:t xml:space="preserve">src/app/api/todo/remind/route.ts</w:t>
+      </w:r>
+      <w:r>
+        <w:t xml:space="preserve">,</w:t>
+      </w:r>
+      <w:r>
+        <w:t xml:space="preserve"> </w:t>
+      </w:r>
+      <w:r>
+        <w:rPr>
+          <w:rStyle w:val="VerbatimChar"/>
+        </w:rPr>
+        <w:t xml:space="preserve">src/app/api/try/route.ts</w:t>
+      </w:r>
+      <w:r>
+        <w:t xml:space="preserve">,</w:t>
+      </w:r>
+      <w:r>
+        <w:t xml:space="preserve"> </w:t>
+      </w:r>
+      <w:r>
+        <w:rPr>
+          <w:rStyle w:val="VerbatimChar"/>
+        </w:rPr>
+        <w:t xml:space="preserve">src/app/api/worth/route.ts</w:t>
+      </w:r>
+    </w:p>
+    <w:p>
+      <w:pPr>
+        <w:numPr>
+          <w:ilvl w:val="0"/>
+          <w:numId w:val="1243"/>
+        </w:numPr>
+        <w:pStyle w:val="Compact"/>
+      </w:pPr>
+      <w:r>
+        <w:rPr>
+          <w:bCs/>
+          <w:b/>
+        </w:rPr>
+        <w:t xml:space="preserve">Seller / staff app:</w:t>
+      </w:r>
+      <w:r>
+        <w:t xml:space="preserve"> </w:t>
+      </w:r>
+      <w:r>
+        <w:rPr>
+          <w:rStyle w:val="VerbatimChar"/>
+        </w:rPr>
+        <w:t xml:space="preserve">src/app/app/items/[id]/page.tsx</w:t>
+      </w:r>
+    </w:p>
+    <w:p>
+      <w:pPr>
+        <w:numPr>
+          <w:ilvl w:val="0"/>
+          <w:numId w:val="1243"/>
+        </w:numPr>
+        <w:pStyle w:val="Compact"/>
+      </w:pPr>
+      <w:r>
+        <w:rPr>
+          <w:bCs/>
+          <w:b/>
+        </w:rPr>
+        <w:t xml:space="preserve">Shared code (logic):</w:t>
+      </w:r>
+      <w:r>
+        <w:t xml:space="preserve"> </w:t>
+      </w:r>
+      <w:r>
+        <w:rPr>
+          <w:rStyle w:val="VerbatimChar"/>
+        </w:rPr>
+        <w:t xml:space="preserve">src/lib/listing.ts</w:t>
+      </w:r>
+    </w:p>
+    <w:p>
+      <w:pPr>
+        <w:numPr>
+          <w:ilvl w:val="0"/>
+          <w:numId w:val="1243"/>
+        </w:numPr>
+        <w:pStyle w:val="Compact"/>
+      </w:pPr>
+      <w:r>
+        <w:rPr>
+          <w:bCs/>
+          <w:b/>
+        </w:rPr>
+        <w:t xml:space="preserve">Database (migrations):</w:t>
+      </w:r>
+      <w:r>
+        <w:t xml:space="preserve"> </w:t>
+      </w:r>
+      <w:r>
+        <w:rPr>
+          <w:rStyle w:val="VerbatimChar"/>
+        </w:rPr>
+        <w:t xml:space="preserve">supabase/migrations/039_todo_twice_daily.sql</w:t>
+      </w:r>
+    </w:p>
+    <w:p>
+      <w:pPr>
+        <w:pStyle w:val="FirstParagraph"/>
+      </w:pPr>
+      <w:r>
+        <w:t xml:space="preserve">change id 9aba39d</w:t>
+      </w:r>
+    </w:p>
     <w:bookmarkEnd w:id="267"/>
+    <w:bookmarkEnd w:id="268"/>
+    <w:bookmarkEnd w:id="269"/>
     <w:sectPr/>
   </w:body>
 </w:document>
@@ -34706,6 +35273,12 @@
     <w:abstractNumId w:val="991"/>
   </w:num>
   <w:num w:numId="1241">
+    <w:abstractNumId w:val="991"/>
+  </w:num>
+  <w:num w:numId="1242">
+    <w:abstractNumId w:val="991"/>
+  </w:num>
+  <w:num w:numId="1243">
     <w:abstractNumId w:val="991"/>
   </w:num>
 </w:numbering>

</xml_diff>

<commit_message>
Records: Help box dash fix
Co-Authored-By: Claude Opus 5.5 <noreply@anthropic.com>
Claude-Session: https://claude.ai/code/session_01JPZJaTbXQFN2qiYRf4rkZK
</commit_message>
<xml_diff>
--- a/docs/Next_Owner_Market_Change_Log.docx
+++ b/docs/Next_Owner_Market_Change_Log.docx
@@ -2,7 +2,7 @@
 <file path=word/document.xml><?xml version="1.0" encoding="utf-8"?>
 <w:document xmlns:w="http://schemas.openxmlformats.org/wordprocessingml/2006/main" xmlns:m="http://schemas.openxmlformats.org/officeDocument/2006/math" xmlns:r="http://schemas.openxmlformats.org/officeDocument/2006/relationships" xmlns:o="urn:schemas-microsoft-com:office:office" xmlns:v="urn:schemas-microsoft-com:vml" xmlns:w10="urn:schemas-microsoft-com:office:word" xmlns:a="http://schemas.openxmlformats.org/drawingml/2006/main" xmlns:pic="http://schemas.openxmlformats.org/drawingml/2006/picture" xmlns:wp="http://schemas.openxmlformats.org/drawingml/2006/wordprocessingDrawing">
   <w:body>
-    <w:bookmarkStart w:id="273" w:name="next-owner-market--change-log"/>
+    <w:bookmarkStart w:id="275" w:name="next-owner-market--change-log"/>
     <w:p>
       <w:pPr>
         <w:pStyle w:val="Heading1"/>
@@ -20,7 +20,7 @@
           <w:iCs/>
           <w:i/>
         </w:rPr>
-        <w:t xml:space="preserve">Every change to the code, database, and documents, oldest first. Generated October 9, 2026 10:53 AM from the project history (246 changes).</w:t>
+        <w:t xml:space="preserve">Every change to the code, database, and documents, oldest first. Generated October 9, 2026 11:06 AM from the project history (248 changes).</w:t>
       </w:r>
     </w:p>
     <w:bookmarkStart w:id="52" w:name="tuesday-september-29-2026"/>
@@ -34728,7 +34728,7 @@
     </w:p>
     <w:bookmarkEnd w:id="269"/>
     <w:bookmarkEnd w:id="270"/>
-    <w:bookmarkStart w:id="272" w:name="friday-october-9-2026"/>
+    <w:bookmarkStart w:id="274" w:name="friday-october-9-2026"/>
     <w:p>
       <w:pPr>
         <w:pStyle w:val="Heading2"/>
@@ -34938,8 +34938,232 @@
       </w:r>
     </w:p>
     <w:bookmarkEnd w:id="271"/>
+    <w:bookmarkStart w:id="272" w:name="X188ee9c8ae0a10de7486dc7efefb6e0df6bd5f7"/>
+    <w:p>
+      <w:pPr>
+        <w:pStyle w:val="Heading3"/>
+      </w:pPr>
+      <w:r>
+        <w:t xml:space="preserve">10:53 — Records: AI outage fix, journal, change log, playbook</w:t>
+      </w:r>
+    </w:p>
+    <w:p>
+      <w:pPr>
+        <w:numPr>
+          <w:ilvl w:val="0"/>
+          <w:numId w:val="1247"/>
+        </w:numPr>
+        <w:pStyle w:val="Compact"/>
+      </w:pPr>
+      <w:r>
+        <w:rPr>
+          <w:bCs/>
+          <w:b/>
+        </w:rPr>
+        <w:t xml:space="preserve">Documents:</w:t>
+      </w:r>
+      <w:r>
+        <w:t xml:space="preserve"> </w:t>
+      </w:r>
+      <w:r>
+        <w:rPr>
+          <w:rStyle w:val="VerbatimChar"/>
+        </w:rPr>
+        <w:t xml:space="preserve">docs/Next_Owner_Market_AddOn_Modules_White_Paper.docx</w:t>
+      </w:r>
+      <w:r>
+        <w:t xml:space="preserve">,</w:t>
+      </w:r>
+      <w:r>
+        <w:t xml:space="preserve"> </w:t>
+      </w:r>
+      <w:r>
+        <w:rPr>
+          <w:rStyle w:val="VerbatimChar"/>
+        </w:rPr>
+        <w:t xml:space="preserve">docs/Next_Owner_Market_App_Builder_Playbook.docx</w:t>
+      </w:r>
+      <w:r>
+        <w:t xml:space="preserve">,</w:t>
+      </w:r>
+      <w:r>
+        <w:t xml:space="preserve"> </w:t>
+      </w:r>
+      <w:r>
+        <w:rPr>
+          <w:rStyle w:val="VerbatimChar"/>
+        </w:rPr>
+        <w:t xml:space="preserve">docs/Next_Owner_Market_App_Builder_Playbook.md</w:t>
+      </w:r>
+      <w:r>
+        <w:t xml:space="preserve">,</w:t>
+      </w:r>
+      <w:r>
+        <w:t xml:space="preserve"> </w:t>
+      </w:r>
+      <w:r>
+        <w:rPr>
+          <w:rStyle w:val="VerbatimChar"/>
+        </w:rPr>
+        <w:t xml:space="preserve">docs/Next_Owner_Market_Beat_The_Competition.docx</w:t>
+      </w:r>
+      <w:r>
+        <w:t xml:space="preserve">,</w:t>
+      </w:r>
+      <w:r>
+        <w:t xml:space="preserve"> </w:t>
+      </w:r>
+      <w:r>
+        <w:rPr>
+          <w:rStyle w:val="VerbatimChar"/>
+        </w:rPr>
+        <w:t xml:space="preserve">docs/Next_Owner_Market_Build_Journal.docx</w:t>
+      </w:r>
+      <w:r>
+        <w:t xml:space="preserve">,</w:t>
+      </w:r>
+      <w:r>
+        <w:t xml:space="preserve"> </w:t>
+      </w:r>
+      <w:r>
+        <w:rPr>
+          <w:rStyle w:val="VerbatimChar"/>
+        </w:rPr>
+        <w:t xml:space="preserve">docs/Next_Owner_Market_Build_Journal.md</w:t>
+      </w:r>
+      <w:r>
+        <w:t xml:space="preserve">,</w:t>
+      </w:r>
+      <w:r>
+        <w:t xml:space="preserve"> </w:t>
+      </w:r>
+      <w:r>
+        <w:rPr>
+          <w:rStyle w:val="VerbatimChar"/>
+        </w:rPr>
+        <w:t xml:space="preserve">docs/Next_Owner_Market_Change_Log.docx</w:t>
+      </w:r>
+      <w:r>
+        <w:t xml:space="preserve">,</w:t>
+      </w:r>
+      <w:r>
+        <w:t xml:space="preserve"> </w:t>
+      </w:r>
+      <w:r>
+        <w:rPr>
+          <w:rStyle w:val="VerbatimChar"/>
+        </w:rPr>
+        <w:t xml:space="preserve">docs/Next_Owner_Market_Change_Log.md</w:t>
+      </w:r>
+      <w:r>
+        <w:t xml:space="preserve">,</w:t>
+      </w:r>
+      <w:r>
+        <w:t xml:space="preserve"> </w:t>
+      </w:r>
+      <w:r>
+        <w:rPr>
+          <w:rStyle w:val="VerbatimChar"/>
+        </w:rPr>
+        <w:t xml:space="preserve">docs/Next_Owner_Market_Complete_Guide.docx</w:t>
+      </w:r>
+      <w:r>
+        <w:t xml:space="preserve">,</w:t>
+      </w:r>
+      <w:r>
+        <w:t xml:space="preserve"> </w:t>
+      </w:r>
+      <w:r>
+        <w:rPr>
+          <w:rStyle w:val="VerbatimChar"/>
+        </w:rPr>
+        <w:t xml:space="preserve">docs/Next_Owner_Market_Estate_Pack_Legal_Research.docx</w:t>
+      </w:r>
+      <w:r>
+        <w:t xml:space="preserve">,</w:t>
+      </w:r>
+      <w:r>
+        <w:t xml:space="preserve"> </w:t>
+      </w:r>
+      <w:r>
+        <w:rPr>
+          <w:rStyle w:val="VerbatimChar"/>
+        </w:rPr>
+        <w:t xml:space="preserve">docs/Next_Owner_Market_Facebook_Page_Kit.docx</w:t>
+      </w:r>
+      <w:r>
+        <w:t xml:space="preserve">,</w:t>
+      </w:r>
+      <w:r>
+        <w:t xml:space="preserve"> </w:t>
+      </w:r>
+      <w:r>
+        <w:rPr>
+          <w:rStyle w:val="VerbatimChar"/>
+        </w:rPr>
+        <w:t xml:space="preserve">docs/Next_Owner_Market_File_Index.docx</w:t>
+      </w:r>
+      <w:r>
+        <w:t xml:space="preserve"> </w:t>
+      </w:r>
+      <w:r>
+        <w:t xml:space="preserve">(+14 more)</w:t>
+      </w:r>
+    </w:p>
+    <w:p>
+      <w:pPr>
+        <w:pStyle w:val="FirstParagraph"/>
+      </w:pPr>
+      <w:r>
+        <w:t xml:space="preserve">change id 024036b</w:t>
+      </w:r>
+    </w:p>
     <w:bookmarkEnd w:id="272"/>
+    <w:bookmarkStart w:id="273" w:name="X59464c93f78629c4e953b678330a305f46ae4cf"/>
+    <w:p>
+      <w:pPr>
+        <w:pStyle w:val="Heading3"/>
+      </w:pPr>
+      <w:r>
+        <w:t xml:space="preserve">10:59 — Help box answers no longer contain long dashes or curly quotes</w:t>
+      </w:r>
+    </w:p>
+    <w:p>
+      <w:pPr>
+        <w:numPr>
+          <w:ilvl w:val="0"/>
+          <w:numId w:val="1248"/>
+        </w:numPr>
+        <w:pStyle w:val="Compact"/>
+      </w:pPr>
+      <w:r>
+        <w:rPr>
+          <w:bCs/>
+          <w:b/>
+        </w:rPr>
+        <w:t xml:space="preserve">Server routes (API):</w:t>
+      </w:r>
+      <w:r>
+        <w:t xml:space="preserve"> </w:t>
+      </w:r>
+      <w:r>
+        <w:rPr>
+          <w:rStyle w:val="VerbatimChar"/>
+        </w:rPr>
+        <w:t xml:space="preserve">src/app/api/ask/route.ts</w:t>
+      </w:r>
+    </w:p>
+    <w:p>
+      <w:pPr>
+        <w:pStyle w:val="FirstParagraph"/>
+      </w:pPr>
+      <w:r>
+        <w:t xml:space="preserve">change id 7a5bef1</w:t>
+      </w:r>
+    </w:p>
     <w:bookmarkEnd w:id="273"/>
+    <w:bookmarkEnd w:id="274"/>
+    <w:bookmarkEnd w:id="275"/>
     <w:sectPr/>
   </w:body>
 </w:document>
@@ -35861,6 +36085,12 @@
     <w:abstractNumId w:val="991"/>
   </w:num>
   <w:num w:numId="1246">
+    <w:abstractNumId w:val="991"/>
+  </w:num>
+  <w:num w:numId="1247">
+    <w:abstractNumId w:val="991"/>
+  </w:num>
+  <w:num w:numId="1248">
     <w:abstractNumId w:val="991"/>
   </w:num>
 </w:numbering>

</xml_diff>

<commit_message>
Records: reel with sound
Co-Authored-By: Claude Opus 5.5 <noreply@anthropic.com>
Claude-Session: https://claude.ai/code/session_01JPZJaTbXQFN2qiYRf4rkZK
</commit_message>
<xml_diff>
--- a/docs/Next_Owner_Market_Change_Log.docx
+++ b/docs/Next_Owner_Market_Change_Log.docx
@@ -2,7 +2,7 @@
 <file path=word/document.xml><?xml version="1.0" encoding="utf-8"?>
 <w:document xmlns:w="http://schemas.openxmlformats.org/wordprocessingml/2006/main" xmlns:m="http://schemas.openxmlformats.org/officeDocument/2006/math" xmlns:r="http://schemas.openxmlformats.org/officeDocument/2006/relationships" xmlns:o="urn:schemas-microsoft-com:office:office" xmlns:v="urn:schemas-microsoft-com:vml" xmlns:w10="urn:schemas-microsoft-com:office:word" xmlns:a="http://schemas.openxmlformats.org/drawingml/2006/main" xmlns:pic="http://schemas.openxmlformats.org/drawingml/2006/picture" xmlns:wp="http://schemas.openxmlformats.org/drawingml/2006/wordprocessingDrawing">
   <w:body>
-    <w:bookmarkStart w:id="278" w:name="next-owner-market--change-log"/>
+    <w:bookmarkStart w:id="280" w:name="next-owner-market--change-log"/>
     <w:p>
       <w:pPr>
         <w:pStyle w:val="Heading1"/>
@@ -20,7 +20,7 @@
           <w:iCs/>
           <w:i/>
         </w:rPr>
-        <w:t xml:space="preserve">Every change to the code, database, and documents, oldest first. Generated October 9, 2026 11:39 AM from the project history (251 changes).</w:t>
+        <w:t xml:space="preserve">Every change to the code, database, and documents, oldest first. Generated October 9, 2026 11:47 AM from the project history (253 changes).</w:t>
       </w:r>
     </w:p>
     <w:bookmarkStart w:id="52" w:name="tuesday-september-29-2026"/>
@@ -34728,7 +34728,7 @@
     </w:p>
     <w:bookmarkEnd w:id="269"/>
     <w:bookmarkEnd w:id="270"/>
-    <w:bookmarkStart w:id="277" w:name="friday-october-9-2026"/>
+    <w:bookmarkStart w:id="279" w:name="friday-october-9-2026"/>
     <w:p>
       <w:pPr>
         <w:pStyle w:val="Heading2"/>
@@ -35561,8 +35561,256 @@
       </w:r>
     </w:p>
     <w:bookmarkEnd w:id="276"/>
+    <w:bookmarkStart w:id="277" w:name="X715c13af0d426c25e92b1ef1b7c8dbbcdb5f14c"/>
+    <w:p>
+      <w:pPr>
+        <w:pStyle w:val="Heading3"/>
+      </w:pPr>
+      <w:r>
+        <w:t xml:space="preserve">11:39 — Records: promo reel, playbook note</w:t>
+      </w:r>
+    </w:p>
+    <w:p>
+      <w:pPr>
+        <w:numPr>
+          <w:ilvl w:val="0"/>
+          <w:numId w:val="1252"/>
+        </w:numPr>
+        <w:pStyle w:val="Compact"/>
+      </w:pPr>
+      <w:r>
+        <w:rPr>
+          <w:bCs/>
+          <w:b/>
+        </w:rPr>
+        <w:t xml:space="preserve">Documents:</w:t>
+      </w:r>
+      <w:r>
+        <w:t xml:space="preserve"> </w:t>
+      </w:r>
+      <w:r>
+        <w:rPr>
+          <w:rStyle w:val="VerbatimChar"/>
+        </w:rPr>
+        <w:t xml:space="preserve">docs/Next_Owner_Market_AddOn_Modules_White_Paper.docx</w:t>
+      </w:r>
+      <w:r>
+        <w:t xml:space="preserve">,</w:t>
+      </w:r>
+      <w:r>
+        <w:t xml:space="preserve"> </w:t>
+      </w:r>
+      <w:r>
+        <w:rPr>
+          <w:rStyle w:val="VerbatimChar"/>
+        </w:rPr>
+        <w:t xml:space="preserve">docs/Next_Owner_Market_App_Builder_Playbook.docx</w:t>
+      </w:r>
+      <w:r>
+        <w:t xml:space="preserve">,</w:t>
+      </w:r>
+      <w:r>
+        <w:t xml:space="preserve"> </w:t>
+      </w:r>
+      <w:r>
+        <w:rPr>
+          <w:rStyle w:val="VerbatimChar"/>
+        </w:rPr>
+        <w:t xml:space="preserve">docs/Next_Owner_Market_App_Builder_Playbook.md</w:t>
+      </w:r>
+      <w:r>
+        <w:t xml:space="preserve">,</w:t>
+      </w:r>
+      <w:r>
+        <w:t xml:space="preserve"> </w:t>
+      </w:r>
+      <w:r>
+        <w:rPr>
+          <w:rStyle w:val="VerbatimChar"/>
+        </w:rPr>
+        <w:t xml:space="preserve">docs/Next_Owner_Market_Beat_The_Competition.docx</w:t>
+      </w:r>
+      <w:r>
+        <w:t xml:space="preserve">,</w:t>
+      </w:r>
+      <w:r>
+        <w:t xml:space="preserve"> </w:t>
+      </w:r>
+      <w:r>
+        <w:rPr>
+          <w:rStyle w:val="VerbatimChar"/>
+        </w:rPr>
+        <w:t xml:space="preserve">docs/Next_Owner_Market_Build_Journal.docx</w:t>
+      </w:r>
+      <w:r>
+        <w:t xml:space="preserve">,</w:t>
+      </w:r>
+      <w:r>
+        <w:t xml:space="preserve"> </w:t>
+      </w:r>
+      <w:r>
+        <w:rPr>
+          <w:rStyle w:val="VerbatimChar"/>
+        </w:rPr>
+        <w:t xml:space="preserve">docs/Next_Owner_Market_Build_Journal.md</w:t>
+      </w:r>
+      <w:r>
+        <w:t xml:space="preserve">,</w:t>
+      </w:r>
+      <w:r>
+        <w:t xml:space="preserve"> </w:t>
+      </w:r>
+      <w:r>
+        <w:rPr>
+          <w:rStyle w:val="VerbatimChar"/>
+        </w:rPr>
+        <w:t xml:space="preserve">docs/Next_Owner_Market_Change_Log.docx</w:t>
+      </w:r>
+      <w:r>
+        <w:t xml:space="preserve">,</w:t>
+      </w:r>
+      <w:r>
+        <w:t xml:space="preserve"> </w:t>
+      </w:r>
+      <w:r>
+        <w:rPr>
+          <w:rStyle w:val="VerbatimChar"/>
+        </w:rPr>
+        <w:t xml:space="preserve">docs/Next_Owner_Market_Change_Log.md</w:t>
+      </w:r>
+      <w:r>
+        <w:t xml:space="preserve">,</w:t>
+      </w:r>
+      <w:r>
+        <w:t xml:space="preserve"> </w:t>
+      </w:r>
+      <w:r>
+        <w:rPr>
+          <w:rStyle w:val="VerbatimChar"/>
+        </w:rPr>
+        <w:t xml:space="preserve">docs/Next_Owner_Market_Complete_Guide.docx</w:t>
+      </w:r>
+      <w:r>
+        <w:t xml:space="preserve">,</w:t>
+      </w:r>
+      <w:r>
+        <w:t xml:space="preserve"> </w:t>
+      </w:r>
+      <w:r>
+        <w:rPr>
+          <w:rStyle w:val="VerbatimChar"/>
+        </w:rPr>
+        <w:t xml:space="preserve">docs/Next_Owner_Market_Estate_Pack_Legal_Research.docx</w:t>
+      </w:r>
+      <w:r>
+        <w:t xml:space="preserve">,</w:t>
+      </w:r>
+      <w:r>
+        <w:t xml:space="preserve"> </w:t>
+      </w:r>
+      <w:r>
+        <w:rPr>
+          <w:rStyle w:val="VerbatimChar"/>
+        </w:rPr>
+        <w:t xml:space="preserve">docs/Next_Owner_Market_Facebook_Page_Kit.docx</w:t>
+      </w:r>
+      <w:r>
+        <w:t xml:space="preserve">,</w:t>
+      </w:r>
+      <w:r>
+        <w:t xml:space="preserve"> </w:t>
+      </w:r>
+      <w:r>
+        <w:rPr>
+          <w:rStyle w:val="VerbatimChar"/>
+        </w:rPr>
+        <w:t xml:space="preserve">docs/Next_Owner_Market_File_Index.docx</w:t>
+      </w:r>
+      <w:r>
+        <w:t xml:space="preserve"> </w:t>
+      </w:r>
+      <w:r>
+        <w:t xml:space="preserve">(+15 more)</w:t>
+      </w:r>
+    </w:p>
+    <w:p>
+      <w:pPr>
+        <w:pStyle w:val="FirstParagraph"/>
+      </w:pPr>
+      <w:r>
+        <w:t xml:space="preserve">change id 2ddccba</w:t>
+      </w:r>
+    </w:p>
     <w:bookmarkEnd w:id="277"/>
+    <w:bookmarkStart w:id="278" w:name="X384dbf4b46f995ea58e4ef9c32747e3491e0063"/>
+    <w:p>
+      <w:pPr>
+        <w:pStyle w:val="Heading3"/>
+      </w:pPr>
+      <w:r>
+        <w:t xml:space="preserve">11:47 — Promo reel now has sound: original music composed in code (no licensing) plus sound effects timed to each tap, price reveal and scene change</w:t>
+      </w:r>
+    </w:p>
+    <w:p>
+      <w:pPr>
+        <w:numPr>
+          <w:ilvl w:val="0"/>
+          <w:numId w:val="1253"/>
+        </w:numPr>
+        <w:pStyle w:val="Compact"/>
+      </w:pPr>
+      <w:r>
+        <w:rPr>
+          <w:bCs/>
+          <w:b/>
+        </w:rPr>
+        <w:t xml:space="preserve">Documents:</w:t>
+      </w:r>
+      <w:r>
+        <w:t xml:space="preserve"> </w:t>
+      </w:r>
+      <w:r>
+        <w:rPr>
+          <w:rStyle w:val="VerbatimChar"/>
+        </w:rPr>
+        <w:t xml:space="preserve">docs/ads/Next_Owner_Market_Reel_Whats_It_Worth.mp4</w:t>
+      </w:r>
+      <w:r>
+        <w:t xml:space="preserve">,</w:t>
+      </w:r>
+      <w:r>
+        <w:t xml:space="preserve"> </w:t>
+      </w:r>
+      <w:r>
+        <w:rPr>
+          <w:rStyle w:val="VerbatimChar"/>
+        </w:rPr>
+        <w:t xml:space="preserve">docs/ads/source/README.md</w:t>
+      </w:r>
+      <w:r>
+        <w:t xml:space="preserve">,</w:t>
+      </w:r>
+      <w:r>
+        <w:t xml:space="preserve"> </w:t>
+      </w:r>
+      <w:r>
+        <w:rPr>
+          <w:rStyle w:val="VerbatimChar"/>
+        </w:rPr>
+        <w:t xml:space="preserve">docs/ads/source/sound.py</w:t>
+      </w:r>
+    </w:p>
+    <w:p>
+      <w:pPr>
+        <w:pStyle w:val="FirstParagraph"/>
+      </w:pPr>
+      <w:r>
+        <w:t xml:space="preserve">change id d9ea08f</w:t>
+      </w:r>
+    </w:p>
     <w:bookmarkEnd w:id="278"/>
+    <w:bookmarkEnd w:id="279"/>
+    <w:bookmarkEnd w:id="280"/>
     <w:sectPr/>
   </w:body>
 </w:document>
@@ -36499,6 +36747,12 @@
     <w:abstractNumId w:val="991"/>
   </w:num>
   <w:num w:numId="1251">
+    <w:abstractNumId w:val="991"/>
+  </w:num>
+  <w:num w:numId="1252">
+    <w:abstractNumId w:val="991"/>
+  </w:num>
+  <w:num w:numId="1253">
     <w:abstractNumId w:val="991"/>
   </w:num>
 </w:numbering>

</xml_diff>

<commit_message>
Records: shareable reel link
Co-Authored-By: Claude Opus 5.5 <noreply@anthropic.com>
Claude-Session: https://claude.ai/code/session_01JPZJaTbXQFN2qiYRf4rkZK
</commit_message>
<xml_diff>
--- a/docs/Next_Owner_Market_Change_Log.docx
+++ b/docs/Next_Owner_Market_Change_Log.docx
@@ -2,7 +2,7 @@
 <file path=word/document.xml><?xml version="1.0" encoding="utf-8"?>
 <w:document xmlns:w="http://schemas.openxmlformats.org/wordprocessingml/2006/main" xmlns:m="http://schemas.openxmlformats.org/officeDocument/2006/math" xmlns:r="http://schemas.openxmlformats.org/officeDocument/2006/relationships" xmlns:o="urn:schemas-microsoft-com:office:office" xmlns:v="urn:schemas-microsoft-com:vml" xmlns:w10="urn:schemas-microsoft-com:office:word" xmlns:a="http://schemas.openxmlformats.org/drawingml/2006/main" xmlns:pic="http://schemas.openxmlformats.org/drawingml/2006/picture" xmlns:wp="http://schemas.openxmlformats.org/drawingml/2006/wordprocessingDrawing">
   <w:body>
-    <w:bookmarkStart w:id="280" w:name="next-owner-market--change-log"/>
+    <w:bookmarkStart w:id="282" w:name="next-owner-market--change-log"/>
     <w:p>
       <w:pPr>
         <w:pStyle w:val="Heading1"/>
@@ -20,7 +20,7 @@
           <w:iCs/>
           <w:i/>
         </w:rPr>
-        <w:t xml:space="preserve">Every change to the code, database, and documents, oldest first. Generated October 9, 2026 11:47 AM from the project history (253 changes).</w:t>
+        <w:t xml:space="preserve">Every change to the code, database, and documents, oldest first. Generated October 9, 2026 11:55 AM from the project history (255 changes).</w:t>
       </w:r>
     </w:p>
     <w:bookmarkStart w:id="52" w:name="tuesday-september-29-2026"/>
@@ -34728,7 +34728,7 @@
     </w:p>
     <w:bookmarkEnd w:id="269"/>
     <w:bookmarkEnd w:id="270"/>
-    <w:bookmarkStart w:id="279" w:name="friday-october-9-2026"/>
+    <w:bookmarkStart w:id="281" w:name="friday-october-9-2026"/>
     <w:p>
       <w:pPr>
         <w:pStyle w:val="Heading2"/>
@@ -35809,8 +35809,232 @@
       </w:r>
     </w:p>
     <w:bookmarkEnd w:id="278"/>
+    <w:bookmarkStart w:id="279" w:name="X10499b1ba23cbec5d7593ccd1b89bf420988af7"/>
+    <w:p>
+      <w:pPr>
+        <w:pStyle w:val="Heading3"/>
+      </w:pPr>
+      <w:r>
+        <w:t xml:space="preserve">11:47 — Records: reel with sound</w:t>
+      </w:r>
+    </w:p>
+    <w:p>
+      <w:pPr>
+        <w:numPr>
+          <w:ilvl w:val="0"/>
+          <w:numId w:val="1254"/>
+        </w:numPr>
+        <w:pStyle w:val="Compact"/>
+      </w:pPr>
+      <w:r>
+        <w:rPr>
+          <w:bCs/>
+          <w:b/>
+        </w:rPr>
+        <w:t xml:space="preserve">Documents:</w:t>
+      </w:r>
+      <w:r>
+        <w:t xml:space="preserve"> </w:t>
+      </w:r>
+      <w:r>
+        <w:rPr>
+          <w:rStyle w:val="VerbatimChar"/>
+        </w:rPr>
+        <w:t xml:space="preserve">docs/Next_Owner_Market_AddOn_Modules_White_Paper.docx</w:t>
+      </w:r>
+      <w:r>
+        <w:t xml:space="preserve">,</w:t>
+      </w:r>
+      <w:r>
+        <w:t xml:space="preserve"> </w:t>
+      </w:r>
+      <w:r>
+        <w:rPr>
+          <w:rStyle w:val="VerbatimChar"/>
+        </w:rPr>
+        <w:t xml:space="preserve">docs/Next_Owner_Market_App_Builder_Playbook.docx</w:t>
+      </w:r>
+      <w:r>
+        <w:t xml:space="preserve">,</w:t>
+      </w:r>
+      <w:r>
+        <w:t xml:space="preserve"> </w:t>
+      </w:r>
+      <w:r>
+        <w:rPr>
+          <w:rStyle w:val="VerbatimChar"/>
+        </w:rPr>
+        <w:t xml:space="preserve">docs/Next_Owner_Market_Beat_The_Competition.docx</w:t>
+      </w:r>
+      <w:r>
+        <w:t xml:space="preserve">,</w:t>
+      </w:r>
+      <w:r>
+        <w:t xml:space="preserve"> </w:t>
+      </w:r>
+      <w:r>
+        <w:rPr>
+          <w:rStyle w:val="VerbatimChar"/>
+        </w:rPr>
+        <w:t xml:space="preserve">docs/Next_Owner_Market_Build_Journal.docx</w:t>
+      </w:r>
+      <w:r>
+        <w:t xml:space="preserve">,</w:t>
+      </w:r>
+      <w:r>
+        <w:t xml:space="preserve"> </w:t>
+      </w:r>
+      <w:r>
+        <w:rPr>
+          <w:rStyle w:val="VerbatimChar"/>
+        </w:rPr>
+        <w:t xml:space="preserve">docs/Next_Owner_Market_Build_Journal.md</w:t>
+      </w:r>
+      <w:r>
+        <w:t xml:space="preserve">,</w:t>
+      </w:r>
+      <w:r>
+        <w:t xml:space="preserve"> </w:t>
+      </w:r>
+      <w:r>
+        <w:rPr>
+          <w:rStyle w:val="VerbatimChar"/>
+        </w:rPr>
+        <w:t xml:space="preserve">docs/Next_Owner_Market_Change_Log.docx</w:t>
+      </w:r>
+      <w:r>
+        <w:t xml:space="preserve">,</w:t>
+      </w:r>
+      <w:r>
+        <w:t xml:space="preserve"> </w:t>
+      </w:r>
+      <w:r>
+        <w:rPr>
+          <w:rStyle w:val="VerbatimChar"/>
+        </w:rPr>
+        <w:t xml:space="preserve">docs/Next_Owner_Market_Change_Log.md</w:t>
+      </w:r>
+      <w:r>
+        <w:t xml:space="preserve">,</w:t>
+      </w:r>
+      <w:r>
+        <w:t xml:space="preserve"> </w:t>
+      </w:r>
+      <w:r>
+        <w:rPr>
+          <w:rStyle w:val="VerbatimChar"/>
+        </w:rPr>
+        <w:t xml:space="preserve">docs/Next_Owner_Market_Complete_Guide.docx</w:t>
+      </w:r>
+      <w:r>
+        <w:t xml:space="preserve">,</w:t>
+      </w:r>
+      <w:r>
+        <w:t xml:space="preserve"> </w:t>
+      </w:r>
+      <w:r>
+        <w:rPr>
+          <w:rStyle w:val="VerbatimChar"/>
+        </w:rPr>
+        <w:t xml:space="preserve">docs/Next_Owner_Market_Estate_Pack_Legal_Research.docx</w:t>
+      </w:r>
+      <w:r>
+        <w:t xml:space="preserve">,</w:t>
+      </w:r>
+      <w:r>
+        <w:t xml:space="preserve"> </w:t>
+      </w:r>
+      <w:r>
+        <w:rPr>
+          <w:rStyle w:val="VerbatimChar"/>
+        </w:rPr>
+        <w:t xml:space="preserve">docs/Next_Owner_Market_Facebook_Page_Kit.docx</w:t>
+      </w:r>
+      <w:r>
+        <w:t xml:space="preserve">,</w:t>
+      </w:r>
+      <w:r>
+        <w:t xml:space="preserve"> </w:t>
+      </w:r>
+      <w:r>
+        <w:rPr>
+          <w:rStyle w:val="VerbatimChar"/>
+        </w:rPr>
+        <w:t xml:space="preserve">docs/Next_Owner_Market_File_Index.docx</w:t>
+      </w:r>
+      <w:r>
+        <w:t xml:space="preserve">,</w:t>
+      </w:r>
+      <w:r>
+        <w:t xml:space="preserve"> </w:t>
+      </w:r>
+      <w:r>
+        <w:rPr>
+          <w:rStyle w:val="VerbatimChar"/>
+        </w:rPr>
+        <w:t xml:space="preserve">docs/Next_Owner_Market_Google_Merchant_Center_Fix.docx</w:t>
+      </w:r>
+      <w:r>
+        <w:t xml:space="preserve"> </w:t>
+      </w:r>
+      <w:r>
+        <w:t xml:space="preserve">(+13 more)</w:t>
+      </w:r>
+    </w:p>
+    <w:p>
+      <w:pPr>
+        <w:pStyle w:val="FirstParagraph"/>
+      </w:pPr>
+      <w:r>
+        <w:t xml:space="preserve">change id db1285d</w:t>
+      </w:r>
+    </w:p>
     <w:bookmarkEnd w:id="279"/>
+    <w:bookmarkStart w:id="280" w:name="X0cc1b15730bf82ff849a466a73a900b373b3cf5"/>
+    <w:p>
+      <w:pPr>
+        <w:pStyle w:val="Heading3"/>
+      </w:pPr>
+      <w:r>
+        <w:t xml:space="preserve">11:51 — Promo reel downloadable at nextownermarket.com/ads/whats-it-worth-reel.mp4 for sharing</w:t>
+      </w:r>
+    </w:p>
+    <w:p>
+      <w:pPr>
+        <w:numPr>
+          <w:ilvl w:val="0"/>
+          <w:numId w:val="1255"/>
+        </w:numPr>
+        <w:pStyle w:val="Compact"/>
+      </w:pPr>
+      <w:r>
+        <w:rPr>
+          <w:bCs/>
+          <w:b/>
+        </w:rPr>
+        <w:t xml:space="preserve">Static files (logo, icons):</w:t>
+      </w:r>
+      <w:r>
+        <w:t xml:space="preserve"> </w:t>
+      </w:r>
+      <w:r>
+        <w:rPr>
+          <w:rStyle w:val="VerbatimChar"/>
+        </w:rPr>
+        <w:t xml:space="preserve">public/ads/whats-it-worth-reel.mp4</w:t>
+      </w:r>
+    </w:p>
+    <w:p>
+      <w:pPr>
+        <w:pStyle w:val="FirstParagraph"/>
+      </w:pPr>
+      <w:r>
+        <w:t xml:space="preserve">change id f04a633</w:t>
+      </w:r>
+    </w:p>
     <w:bookmarkEnd w:id="280"/>
+    <w:bookmarkEnd w:id="281"/>
+    <w:bookmarkEnd w:id="282"/>
     <w:sectPr/>
   </w:body>
 </w:document>
@@ -36753,6 +36977,12 @@
     <w:abstractNumId w:val="991"/>
   </w:num>
   <w:num w:numId="1253">
+    <w:abstractNumId w:val="991"/>
+  </w:num>
+  <w:num w:numId="1254">
+    <w:abstractNumId w:val="991"/>
+  </w:num>
+  <w:num w:numId="1255">
     <w:abstractNumId w:val="991"/>
   </w:num>
 </w:numbering>

</xml_diff>

<commit_message>
Records: share and check-another buttons
Co-Authored-By: Claude Opus 5.5 <noreply@anthropic.com>
Claude-Session: https://claude.ai/code/session_01JPZJaTbXQFN2qiYRf4rkZK
</commit_message>
<xml_diff>
--- a/docs/Next_Owner_Market_Change_Log.docx
+++ b/docs/Next_Owner_Market_Change_Log.docx
@@ -2,7 +2,7 @@
 <file path=word/document.xml><?xml version="1.0" encoding="utf-8"?>
 <w:document xmlns:w="http://schemas.openxmlformats.org/wordprocessingml/2006/main" xmlns:m="http://schemas.openxmlformats.org/officeDocument/2006/math" xmlns:r="http://schemas.openxmlformats.org/officeDocument/2006/relationships" xmlns:o="urn:schemas-microsoft-com:office:office" xmlns:v="urn:schemas-microsoft-com:vml" xmlns:w10="urn:schemas-microsoft-com:office:word" xmlns:a="http://schemas.openxmlformats.org/drawingml/2006/main" xmlns:pic="http://schemas.openxmlformats.org/drawingml/2006/picture" xmlns:wp="http://schemas.openxmlformats.org/drawingml/2006/wordprocessingDrawing">
   <w:body>
-    <w:bookmarkStart w:id="282" w:name="next-owner-market--change-log"/>
+    <w:bookmarkStart w:id="284" w:name="next-owner-market--change-log"/>
     <w:p>
       <w:pPr>
         <w:pStyle w:val="Heading1"/>
@@ -20,7 +20,7 @@
           <w:iCs/>
           <w:i/>
         </w:rPr>
-        <w:t xml:space="preserve">Every change to the code, database, and documents, oldest first. Generated October 9, 2026 11:55 AM from the project history (255 changes).</w:t>
+        <w:t xml:space="preserve">Every change to the code, database, and documents, oldest first. Generated October 9, 2026 1:30 PM from the project history (257 changes).</w:t>
       </w:r>
     </w:p>
     <w:bookmarkStart w:id="52" w:name="tuesday-september-29-2026"/>
@@ -34728,7 +34728,7 @@
     </w:p>
     <w:bookmarkEnd w:id="269"/>
     <w:bookmarkEnd w:id="270"/>
-    <w:bookmarkStart w:id="281" w:name="friday-october-9-2026"/>
+    <w:bookmarkStart w:id="283" w:name="friday-october-9-2026"/>
     <w:p>
       <w:pPr>
         <w:pStyle w:val="Heading2"/>
@@ -36033,8 +36033,354 @@
       </w:r>
     </w:p>
     <w:bookmarkEnd w:id="280"/>
+    <w:bookmarkStart w:id="281" w:name="X9afa7abb2bfbcf73adf6a005906fc98f4327ee9"/>
+    <w:p>
+      <w:pPr>
+        <w:pStyle w:val="Heading3"/>
+      </w:pPr>
+      <w:r>
+        <w:t xml:space="preserve">11:55 — Records: shareable reel link</w:t>
+      </w:r>
+    </w:p>
+    <w:p>
+      <w:pPr>
+        <w:numPr>
+          <w:ilvl w:val="0"/>
+          <w:numId w:val="1256"/>
+        </w:numPr>
+        <w:pStyle w:val="Compact"/>
+      </w:pPr>
+      <w:r>
+        <w:rPr>
+          <w:bCs/>
+          <w:b/>
+        </w:rPr>
+        <w:t xml:space="preserve">Documents:</w:t>
+      </w:r>
+      <w:r>
+        <w:t xml:space="preserve"> </w:t>
+      </w:r>
+      <w:r>
+        <w:rPr>
+          <w:rStyle w:val="VerbatimChar"/>
+        </w:rPr>
+        <w:t xml:space="preserve">docs/Next_Owner_Market_AddOn_Modules_White_Paper.docx</w:t>
+      </w:r>
+      <w:r>
+        <w:t xml:space="preserve">,</w:t>
+      </w:r>
+      <w:r>
+        <w:t xml:space="preserve"> </w:t>
+      </w:r>
+      <w:r>
+        <w:rPr>
+          <w:rStyle w:val="VerbatimChar"/>
+        </w:rPr>
+        <w:t xml:space="preserve">docs/Next_Owner_Market_App_Builder_Playbook.docx</w:t>
+      </w:r>
+      <w:r>
+        <w:t xml:space="preserve">,</w:t>
+      </w:r>
+      <w:r>
+        <w:t xml:space="preserve"> </w:t>
+      </w:r>
+      <w:r>
+        <w:rPr>
+          <w:rStyle w:val="VerbatimChar"/>
+        </w:rPr>
+        <w:t xml:space="preserve">docs/Next_Owner_Market_Beat_The_Competition.docx</w:t>
+      </w:r>
+      <w:r>
+        <w:t xml:space="preserve">,</w:t>
+      </w:r>
+      <w:r>
+        <w:t xml:space="preserve"> </w:t>
+      </w:r>
+      <w:r>
+        <w:rPr>
+          <w:rStyle w:val="VerbatimChar"/>
+        </w:rPr>
+        <w:t xml:space="preserve">docs/Next_Owner_Market_Build_Journal.docx</w:t>
+      </w:r>
+      <w:r>
+        <w:t xml:space="preserve">,</w:t>
+      </w:r>
+      <w:r>
+        <w:t xml:space="preserve"> </w:t>
+      </w:r>
+      <w:r>
+        <w:rPr>
+          <w:rStyle w:val="VerbatimChar"/>
+        </w:rPr>
+        <w:t xml:space="preserve">docs/Next_Owner_Market_Build_Journal.md</w:t>
+      </w:r>
+      <w:r>
+        <w:t xml:space="preserve">,</w:t>
+      </w:r>
+      <w:r>
+        <w:t xml:space="preserve"> </w:t>
+      </w:r>
+      <w:r>
+        <w:rPr>
+          <w:rStyle w:val="VerbatimChar"/>
+        </w:rPr>
+        <w:t xml:space="preserve">docs/Next_Owner_Market_Change_Log.docx</w:t>
+      </w:r>
+      <w:r>
+        <w:t xml:space="preserve">,</w:t>
+      </w:r>
+      <w:r>
+        <w:t xml:space="preserve"> </w:t>
+      </w:r>
+      <w:r>
+        <w:rPr>
+          <w:rStyle w:val="VerbatimChar"/>
+        </w:rPr>
+        <w:t xml:space="preserve">docs/Next_Owner_Market_Change_Log.md</w:t>
+      </w:r>
+      <w:r>
+        <w:t xml:space="preserve">,</w:t>
+      </w:r>
+      <w:r>
+        <w:t xml:space="preserve"> </w:t>
+      </w:r>
+      <w:r>
+        <w:rPr>
+          <w:rStyle w:val="VerbatimChar"/>
+        </w:rPr>
+        <w:t xml:space="preserve">docs/Next_Owner_Market_Complete_Guide.docx</w:t>
+      </w:r>
+      <w:r>
+        <w:t xml:space="preserve">,</w:t>
+      </w:r>
+      <w:r>
+        <w:t xml:space="preserve"> </w:t>
+      </w:r>
+      <w:r>
+        <w:rPr>
+          <w:rStyle w:val="VerbatimChar"/>
+        </w:rPr>
+        <w:t xml:space="preserve">docs/Next_Owner_Market_Estate_Pack_Legal_Research.docx</w:t>
+      </w:r>
+      <w:r>
+        <w:t xml:space="preserve">,</w:t>
+      </w:r>
+      <w:r>
+        <w:t xml:space="preserve"> </w:t>
+      </w:r>
+      <w:r>
+        <w:rPr>
+          <w:rStyle w:val="VerbatimChar"/>
+        </w:rPr>
+        <w:t xml:space="preserve">docs/Next_Owner_Market_Facebook_Page_Kit.docx</w:t>
+      </w:r>
+      <w:r>
+        <w:t xml:space="preserve">,</w:t>
+      </w:r>
+      <w:r>
+        <w:t xml:space="preserve"> </w:t>
+      </w:r>
+      <w:r>
+        <w:rPr>
+          <w:rStyle w:val="VerbatimChar"/>
+        </w:rPr>
+        <w:t xml:space="preserve">docs/Next_Owner_Market_File_Index.docx</w:t>
+      </w:r>
+      <w:r>
+        <w:t xml:space="preserve">,</w:t>
+      </w:r>
+      <w:r>
+        <w:t xml:space="preserve"> </w:t>
+      </w:r>
+      <w:r>
+        <w:rPr>
+          <w:rStyle w:val="VerbatimChar"/>
+        </w:rPr>
+        <w:t xml:space="preserve">docs/Next_Owner_Market_Google_Merchant_Center_Fix.docx</w:t>
+      </w:r>
+      <w:r>
+        <w:t xml:space="preserve"> </w:t>
+      </w:r>
+      <w:r>
+        <w:t xml:space="preserve">(+13 more)</w:t>
+      </w:r>
+    </w:p>
+    <w:p>
+      <w:pPr>
+        <w:pStyle w:val="FirstParagraph"/>
+      </w:pPr>
+      <w:r>
+        <w:t xml:space="preserve">change id fbff8fd</w:t>
+      </w:r>
+    </w:p>
     <w:bookmarkEnd w:id="281"/>
+    <w:bookmarkStart w:id="282" w:name="X8ac08873431b60a6172a2e01b9cb601e4e51164"/>
+    <w:p>
+      <w:pPr>
+        <w:pStyle w:val="Heading3"/>
+      </w:pPr>
+      <w:r>
+        <w:t xml:space="preserve">13:25 — What's it worth, Buy or Pass and Sort the pile: big Share and Check another buttons right under the answer; Share opens the phone's share menu (Messages, Facebook, email, copy link) before listing</w:t>
+      </w:r>
+    </w:p>
+    <w:p>
+      <w:pPr>
+        <w:numPr>
+          <w:ilvl w:val="0"/>
+          <w:numId w:val="1257"/>
+        </w:numPr>
+        <w:pStyle w:val="Compact"/>
+      </w:pPr>
+      <w:r>
+        <w:rPr>
+          <w:bCs/>
+          <w:b/>
+        </w:rPr>
+        <w:t xml:space="preserve">Documents:</w:t>
+      </w:r>
+      <w:r>
+        <w:t xml:space="preserve"> </w:t>
+      </w:r>
+      <w:r>
+        <w:rPr>
+          <w:rStyle w:val="VerbatimChar"/>
+        </w:rPr>
+        <w:t xml:space="preserve">docs/Next_Owner_Market_Build_Journal.md</w:t>
+      </w:r>
+      <w:r>
+        <w:t xml:space="preserve">,</w:t>
+      </w:r>
+      <w:r>
+        <w:t xml:space="preserve"> </w:t>
+      </w:r>
+      <w:r>
+        <w:rPr>
+          <w:rStyle w:val="VerbatimChar"/>
+        </w:rPr>
+        <w:t xml:space="preserve">docs/Next_Owner_Market_Complete_Guide.md</w:t>
+      </w:r>
+      <w:r>
+        <w:t xml:space="preserve">,</w:t>
+      </w:r>
+      <w:r>
+        <w:t xml:space="preserve"> </w:t>
+      </w:r>
+      <w:r>
+        <w:rPr>
+          <w:rStyle w:val="VerbatimChar"/>
+        </w:rPr>
+        <w:t xml:space="preserve">docs/Next_Owner_Market_User_Guide.md</w:t>
+      </w:r>
+      <w:r>
+        <w:t xml:space="preserve">,</w:t>
+      </w:r>
+      <w:r>
+        <w:t xml:space="preserve"> </w:t>
+      </w:r>
+      <w:r>
+        <w:rPr>
+          <w:rStyle w:val="VerbatimChar"/>
+        </w:rPr>
+        <w:t xml:space="preserve">docs/journal_sessions/faa89acb-5a67-582b-a46a-1c3f3b736545.md</w:t>
+      </w:r>
+      <w:r>
+        <w:t xml:space="preserve">,</w:t>
+      </w:r>
+      <w:r>
+        <w:t xml:space="preserve"> </w:t>
+      </w:r>
+      <w:r>
+        <w:rPr>
+          <w:rStyle w:val="VerbatimChar"/>
+        </w:rPr>
+        <w:t xml:space="preserve">docs/journal_sessions/faa89acb-5a67-582b-a46a-1c3f3b736545.rows.json</w:t>
+      </w:r>
+    </w:p>
+    <w:p>
+      <w:pPr>
+        <w:numPr>
+          <w:ilvl w:val="0"/>
+          <w:numId w:val="1257"/>
+        </w:numPr>
+        <w:pStyle w:val="Compact"/>
+      </w:pPr>
+      <w:r>
+        <w:rPr>
+          <w:bCs/>
+          <w:b/>
+        </w:rPr>
+        <w:t xml:space="preserve">Public site pages:</w:t>
+      </w:r>
+      <w:r>
+        <w:t xml:space="preserve"> </w:t>
+      </w:r>
+      <w:r>
+        <w:rPr>
+          <w:rStyle w:val="VerbatimChar"/>
+        </w:rPr>
+        <w:t xml:space="preserve">src/app/buy-or-pass/BuyPassClient.tsx</w:t>
+      </w:r>
+      <w:r>
+        <w:t xml:space="preserve">,</w:t>
+      </w:r>
+      <w:r>
+        <w:t xml:space="preserve"> </w:t>
+      </w:r>
+      <w:r>
+        <w:rPr>
+          <w:rStyle w:val="VerbatimChar"/>
+        </w:rPr>
+        <w:t xml:space="preserve">src/app/pile/PileClient.tsx</w:t>
+      </w:r>
+      <w:r>
+        <w:t xml:space="preserve">,</w:t>
+      </w:r>
+      <w:r>
+        <w:t xml:space="preserve"> </w:t>
+      </w:r>
+      <w:r>
+        <w:rPr>
+          <w:rStyle w:val="VerbatimChar"/>
+        </w:rPr>
+        <w:t xml:space="preserve">src/app/worth/WorthClient.tsx</w:t>
+      </w:r>
+    </w:p>
+    <w:p>
+      <w:pPr>
+        <w:numPr>
+          <w:ilvl w:val="0"/>
+          <w:numId w:val="1257"/>
+        </w:numPr>
+        <w:pStyle w:val="Compact"/>
+      </w:pPr>
+      <w:r>
+        <w:rPr>
+          <w:bCs/>
+          <w:b/>
+        </w:rPr>
+        <w:t xml:space="preserve">Shared UI pieces:</w:t>
+      </w:r>
+      <w:r>
+        <w:t xml:space="preserve"> </w:t>
+      </w:r>
+      <w:r>
+        <w:rPr>
+          <w:rStyle w:val="VerbatimChar"/>
+        </w:rPr>
+        <w:t xml:space="preserve">src/components/ShareAndAgain.tsx</w:t>
+      </w:r>
+    </w:p>
+    <w:p>
+      <w:pPr>
+        <w:pStyle w:val="FirstParagraph"/>
+      </w:pPr>
+      <w:r>
+        <w:t xml:space="preserve">change id bf98408</w:t>
+      </w:r>
+    </w:p>
     <w:bookmarkEnd w:id="282"/>
+    <w:bookmarkEnd w:id="283"/>
+    <w:bookmarkEnd w:id="284"/>
     <w:sectPr/>
   </w:body>
 </w:document>
@@ -36983,6 +37329,12 @@
     <w:abstractNumId w:val="991"/>
   </w:num>
   <w:num w:numId="1255">
+    <w:abstractNumId w:val="991"/>
+  </w:num>
+  <w:num w:numId="1256">
+    <w:abstractNumId w:val="991"/>
+  </w:num>
+  <w:num w:numId="1257">
     <w:abstractNumId w:val="991"/>
   </w:num>
 </w:numbering>

</xml_diff>

<commit_message>
Records: check-another button after listing; twin lookup fix
Co-Authored-By: Claude Opus 5.5 <noreply@anthropic.com>
Claude-Session: https://claude.ai/code/session_01JPZJaTbXQFN2qiYRf4rkZK
</commit_message>
<xml_diff>
--- a/docs/Next_Owner_Market_Change_Log.docx
+++ b/docs/Next_Owner_Market_Change_Log.docx
@@ -2,7 +2,7 @@
 <file path=word/document.xml><?xml version="1.0" encoding="utf-8"?>
 <w:document xmlns:w="http://schemas.openxmlformats.org/wordprocessingml/2006/main" xmlns:m="http://schemas.openxmlformats.org/officeDocument/2006/math" xmlns:r="http://schemas.openxmlformats.org/officeDocument/2006/relationships" xmlns:o="urn:schemas-microsoft-com:office:office" xmlns:v="urn:schemas-microsoft-com:vml" xmlns:w10="urn:schemas-microsoft-com:office:word" xmlns:a="http://schemas.openxmlformats.org/drawingml/2006/main" xmlns:pic="http://schemas.openxmlformats.org/drawingml/2006/picture" xmlns:wp="http://schemas.openxmlformats.org/drawingml/2006/wordprocessingDrawing">
   <w:body>
-    <w:bookmarkStart w:id="286" w:name="next-owner-market--change-log"/>
+    <w:bookmarkStart w:id="289" w:name="next-owner-market--change-log"/>
     <w:p>
       <w:pPr>
         <w:pStyle w:val="Heading1"/>
@@ -20,7 +20,7 @@
           <w:iCs/>
           <w:i/>
         </w:rPr>
-        <w:t xml:space="preserve">Every change to the code, database, and documents, oldest first. Generated October 9, 2026 1:47 PM from the project history (259 changes).</w:t>
+        <w:t xml:space="preserve">Every change to the code, database, and documents, oldest first. Generated October 9, 2026 2:45 PM from the project history (262 changes).</w:t>
       </w:r>
     </w:p>
     <w:bookmarkStart w:id="52" w:name="tuesday-september-29-2026"/>
@@ -34728,7 +34728,7 @@
     </w:p>
     <w:bookmarkEnd w:id="269"/>
     <w:bookmarkEnd w:id="270"/>
-    <w:bookmarkStart w:id="285" w:name="friday-october-9-2026"/>
+    <w:bookmarkStart w:id="288" w:name="friday-october-9-2026"/>
     <w:p>
       <w:pPr>
         <w:pStyle w:val="Heading2"/>
@@ -36725,8 +36725,397 @@
       </w:r>
     </w:p>
     <w:bookmarkEnd w:id="284"/>
+    <w:bookmarkStart w:id="285" w:name="X6bbd9438fc4e63ca2b10c4640886d991acd53b7"/>
+    <w:p>
+      <w:pPr>
+        <w:pStyle w:val="Heading3"/>
+      </w:pPr>
+      <w:r>
+        <w:t xml:space="preserve">13:47 — Records: Share this find restored; playbook T-58</w:t>
+      </w:r>
+    </w:p>
+    <w:p>
+      <w:pPr>
+        <w:numPr>
+          <w:ilvl w:val="0"/>
+          <w:numId w:val="1260"/>
+        </w:numPr>
+        <w:pStyle w:val="Compact"/>
+      </w:pPr>
+      <w:r>
+        <w:rPr>
+          <w:bCs/>
+          <w:b/>
+        </w:rPr>
+        <w:t xml:space="preserve">Documents:</w:t>
+      </w:r>
+      <w:r>
+        <w:t xml:space="preserve"> </w:t>
+      </w:r>
+      <w:r>
+        <w:rPr>
+          <w:rStyle w:val="VerbatimChar"/>
+        </w:rPr>
+        <w:t xml:space="preserve">docs/Next_Owner_Market_AddOn_Modules_White_Paper.docx</w:t>
+      </w:r>
+      <w:r>
+        <w:t xml:space="preserve">,</w:t>
+      </w:r>
+      <w:r>
+        <w:t xml:space="preserve"> </w:t>
+      </w:r>
+      <w:r>
+        <w:rPr>
+          <w:rStyle w:val="VerbatimChar"/>
+        </w:rPr>
+        <w:t xml:space="preserve">docs/Next_Owner_Market_App_Builder_Playbook.docx</w:t>
+      </w:r>
+      <w:r>
+        <w:t xml:space="preserve">,</w:t>
+      </w:r>
+      <w:r>
+        <w:t xml:space="preserve"> </w:t>
+      </w:r>
+      <w:r>
+        <w:rPr>
+          <w:rStyle w:val="VerbatimChar"/>
+        </w:rPr>
+        <w:t xml:space="preserve">docs/Next_Owner_Market_App_Builder_Playbook.md</w:t>
+      </w:r>
+      <w:r>
+        <w:t xml:space="preserve">,</w:t>
+      </w:r>
+      <w:r>
+        <w:t xml:space="preserve"> </w:t>
+      </w:r>
+      <w:r>
+        <w:rPr>
+          <w:rStyle w:val="VerbatimChar"/>
+        </w:rPr>
+        <w:t xml:space="preserve">docs/Next_Owner_Market_Beat_The_Competition.docx</w:t>
+      </w:r>
+      <w:r>
+        <w:t xml:space="preserve">,</w:t>
+      </w:r>
+      <w:r>
+        <w:t xml:space="preserve"> </w:t>
+      </w:r>
+      <w:r>
+        <w:rPr>
+          <w:rStyle w:val="VerbatimChar"/>
+        </w:rPr>
+        <w:t xml:space="preserve">docs/Next_Owner_Market_Build_Journal.docx</w:t>
+      </w:r>
+      <w:r>
+        <w:t xml:space="preserve">,</w:t>
+      </w:r>
+      <w:r>
+        <w:t xml:space="preserve"> </w:t>
+      </w:r>
+      <w:r>
+        <w:rPr>
+          <w:rStyle w:val="VerbatimChar"/>
+        </w:rPr>
+        <w:t xml:space="preserve">docs/Next_Owner_Market_Build_Journal.md</w:t>
+      </w:r>
+      <w:r>
+        <w:t xml:space="preserve">,</w:t>
+      </w:r>
+      <w:r>
+        <w:t xml:space="preserve"> </w:t>
+      </w:r>
+      <w:r>
+        <w:rPr>
+          <w:rStyle w:val="VerbatimChar"/>
+        </w:rPr>
+        <w:t xml:space="preserve">docs/Next_Owner_Market_Change_Log.docx</w:t>
+      </w:r>
+      <w:r>
+        <w:t xml:space="preserve">,</w:t>
+      </w:r>
+      <w:r>
+        <w:t xml:space="preserve"> </w:t>
+      </w:r>
+      <w:r>
+        <w:rPr>
+          <w:rStyle w:val="VerbatimChar"/>
+        </w:rPr>
+        <w:t xml:space="preserve">docs/Next_Owner_Market_Change_Log.md</w:t>
+      </w:r>
+      <w:r>
+        <w:t xml:space="preserve">,</w:t>
+      </w:r>
+      <w:r>
+        <w:t xml:space="preserve"> </w:t>
+      </w:r>
+      <w:r>
+        <w:rPr>
+          <w:rStyle w:val="VerbatimChar"/>
+        </w:rPr>
+        <w:t xml:space="preserve">docs/Next_Owner_Market_Complete_Guide.docx</w:t>
+      </w:r>
+      <w:r>
+        <w:t xml:space="preserve">,</w:t>
+      </w:r>
+      <w:r>
+        <w:t xml:space="preserve"> </w:t>
+      </w:r>
+      <w:r>
+        <w:rPr>
+          <w:rStyle w:val="VerbatimChar"/>
+        </w:rPr>
+        <w:t xml:space="preserve">docs/Next_Owner_Market_Estate_Pack_Legal_Research.docx</w:t>
+      </w:r>
+      <w:r>
+        <w:t xml:space="preserve">,</w:t>
+      </w:r>
+      <w:r>
+        <w:t xml:space="preserve"> </w:t>
+      </w:r>
+      <w:r>
+        <w:rPr>
+          <w:rStyle w:val="VerbatimChar"/>
+        </w:rPr>
+        <w:t xml:space="preserve">docs/Next_Owner_Market_Facebook_Page_Kit.docx</w:t>
+      </w:r>
+      <w:r>
+        <w:t xml:space="preserve">,</w:t>
+      </w:r>
+      <w:r>
+        <w:t xml:space="preserve"> </w:t>
+      </w:r>
+      <w:r>
+        <w:rPr>
+          <w:rStyle w:val="VerbatimChar"/>
+        </w:rPr>
+        <w:t xml:space="preserve">docs/Next_Owner_Market_File_Index.docx</w:t>
+      </w:r>
+      <w:r>
+        <w:t xml:space="preserve"> </w:t>
+      </w:r>
+      <w:r>
+        <w:t xml:space="preserve">(+15 more)</w:t>
+      </w:r>
+    </w:p>
+    <w:p>
+      <w:pPr>
+        <w:pStyle w:val="FirstParagraph"/>
+      </w:pPr>
+      <w:r>
+        <w:t xml:space="preserve">change id 5d20733</w:t>
+      </w:r>
+    </w:p>
     <w:bookmarkEnd w:id="285"/>
+    <w:bookmarkStart w:id="286" w:name="X036b1f21b093773fab2a96a82c210e953529872"/>
+    <w:p>
+      <w:pPr>
+        <w:pStyle w:val="Heading3"/>
+      </w:pPr>
+      <w:r>
+        <w:t xml:space="preserve">14:35 — After a listing is written, a big 'Check another item' button goes straight back to a fresh lookup (or Buy or Pass / Sort the pile / Lookups, whichever you came from); no back arrow needed</w:t>
+      </w:r>
+    </w:p>
+    <w:p>
+      <w:pPr>
+        <w:numPr>
+          <w:ilvl w:val="0"/>
+          <w:numId w:val="1261"/>
+        </w:numPr>
+        <w:pStyle w:val="Compact"/>
+      </w:pPr>
+      <w:r>
+        <w:rPr>
+          <w:bCs/>
+          <w:b/>
+        </w:rPr>
+        <w:t xml:space="preserve">Documents:</w:t>
+      </w:r>
+      <w:r>
+        <w:t xml:space="preserve"> </w:t>
+      </w:r>
+      <w:r>
+        <w:rPr>
+          <w:rStyle w:val="VerbatimChar"/>
+        </w:rPr>
+        <w:t xml:space="preserve">docs/Next_Owner_Market_Build_Journal.md</w:t>
+      </w:r>
+      <w:r>
+        <w:t xml:space="preserve">,</w:t>
+      </w:r>
+      <w:r>
+        <w:t xml:space="preserve"> </w:t>
+      </w:r>
+      <w:r>
+        <w:rPr>
+          <w:rStyle w:val="VerbatimChar"/>
+        </w:rPr>
+        <w:t xml:space="preserve">docs/journal_sessions/faa89acb-5a67-582b-a46a-1c3f3b736545.md</w:t>
+      </w:r>
+      <w:r>
+        <w:t xml:space="preserve">,</w:t>
+      </w:r>
+      <w:r>
+        <w:t xml:space="preserve"> </w:t>
+      </w:r>
+      <w:r>
+        <w:rPr>
+          <w:rStyle w:val="VerbatimChar"/>
+        </w:rPr>
+        <w:t xml:space="preserve">docs/journal_sessions/faa89acb-5a67-582b-a46a-1c3f3b736545.rows.json</w:t>
+      </w:r>
+    </w:p>
+    <w:p>
+      <w:pPr>
+        <w:numPr>
+          <w:ilvl w:val="0"/>
+          <w:numId w:val="1261"/>
+        </w:numPr>
+        <w:pStyle w:val="Compact"/>
+      </w:pPr>
+      <w:r>
+        <w:rPr>
+          <w:bCs/>
+          <w:b/>
+        </w:rPr>
+        <w:t xml:space="preserve">Seller / staff app:</w:t>
+      </w:r>
+      <w:r>
+        <w:t xml:space="preserve"> </w:t>
+      </w:r>
+      <w:r>
+        <w:rPr>
+          <w:rStyle w:val="VerbatimChar"/>
+        </w:rPr>
+        <w:t xml:space="preserve">src/app/app/items/[id]/page.tsx</w:t>
+      </w:r>
+    </w:p>
+    <w:p>
+      <w:pPr>
+        <w:numPr>
+          <w:ilvl w:val="0"/>
+          <w:numId w:val="1261"/>
+        </w:numPr>
+        <w:pStyle w:val="Compact"/>
+      </w:pPr>
+      <w:r>
+        <w:rPr>
+          <w:bCs/>
+          <w:b/>
+        </w:rPr>
+        <w:t xml:space="preserve">Public site pages:</w:t>
+      </w:r>
+      <w:r>
+        <w:t xml:space="preserve"> </w:t>
+      </w:r>
+      <w:r>
+        <w:rPr>
+          <w:rStyle w:val="VerbatimChar"/>
+        </w:rPr>
+        <w:t xml:space="preserve">src/app/buy-or-pass/BuyPassClient.tsx</w:t>
+      </w:r>
+      <w:r>
+        <w:t xml:space="preserve">,</w:t>
+      </w:r>
+      <w:r>
+        <w:t xml:space="preserve"> </w:t>
+      </w:r>
+      <w:r>
+        <w:rPr>
+          <w:rStyle w:val="VerbatimChar"/>
+        </w:rPr>
+        <w:t xml:space="preserve">src/app/buy-or-pass/page.tsx</w:t>
+      </w:r>
+      <w:r>
+        <w:t xml:space="preserve">,</w:t>
+      </w:r>
+      <w:r>
+        <w:t xml:space="preserve"> </w:t>
+      </w:r>
+      <w:r>
+        <w:rPr>
+          <w:rStyle w:val="VerbatimChar"/>
+        </w:rPr>
+        <w:t xml:space="preserve">src/app/lookups/LookupsClient.tsx</w:t>
+      </w:r>
+      <w:r>
+        <w:t xml:space="preserve">,</w:t>
+      </w:r>
+      <w:r>
+        <w:t xml:space="preserve"> </w:t>
+      </w:r>
+      <w:r>
+        <w:rPr>
+          <w:rStyle w:val="VerbatimChar"/>
+        </w:rPr>
+        <w:t xml:space="preserve">src/app/pile/PileClient.tsx</w:t>
+      </w:r>
+      <w:r>
+        <w:t xml:space="preserve">,</w:t>
+      </w:r>
+      <w:r>
+        <w:t xml:space="preserve"> </w:t>
+      </w:r>
+      <w:r>
+        <w:rPr>
+          <w:rStyle w:val="VerbatimChar"/>
+        </w:rPr>
+        <w:t xml:space="preserve">src/app/worth/WorthClient.tsx</w:t>
+      </w:r>
+    </w:p>
+    <w:p>
+      <w:pPr>
+        <w:pStyle w:val="FirstParagraph"/>
+      </w:pPr>
+      <w:r>
+        <w:t xml:space="preserve">change id eb446cb</w:t>
+      </w:r>
+    </w:p>
     <w:bookmarkEnd w:id="286"/>
+    <w:bookmarkStart w:id="287" w:name="Xc4b0e84f62ea06b20fe20d0db2d812d43a047c6"/>
+    <w:p>
+      <w:pPr>
+        <w:pStyle w:val="Heading3"/>
+      </w:pPr>
+      <w:r>
+        <w:t xml:space="preserve">14:40 — Listing an item now also clears any twin lookup of the same item done shortly before (looked up twice with new photos or notes), so it doesn't linger in 'not listed yet'</w:t>
+      </w:r>
+    </w:p>
+    <w:p>
+      <w:pPr>
+        <w:numPr>
+          <w:ilvl w:val="0"/>
+          <w:numId w:val="1262"/>
+        </w:numPr>
+        <w:pStyle w:val="Compact"/>
+      </w:pPr>
+      <w:r>
+        <w:rPr>
+          <w:bCs/>
+          <w:b/>
+        </w:rPr>
+        <w:t xml:space="preserve">Server routes (API):</w:t>
+      </w:r>
+      <w:r>
+        <w:t xml:space="preserve"> </w:t>
+      </w:r>
+      <w:r>
+        <w:rPr>
+          <w:rStyle w:val="VerbatimChar"/>
+        </w:rPr>
+        <w:t xml:space="preserve">src/app/api/lookups/route.ts</w:t>
+      </w:r>
+    </w:p>
+    <w:p>
+      <w:pPr>
+        <w:pStyle w:val="FirstParagraph"/>
+      </w:pPr>
+      <w:r>
+        <w:t xml:space="preserve">change id 09c4578</w:t>
+      </w:r>
+    </w:p>
+    <w:bookmarkEnd w:id="287"/>
+    <w:bookmarkEnd w:id="288"/>
+    <w:bookmarkEnd w:id="289"/>
     <w:sectPr/>
   </w:body>
 </w:document>
@@ -37687,6 +38076,15 @@
     <w:abstractNumId w:val="991"/>
   </w:num>
   <w:num w:numId="1259">
+    <w:abstractNumId w:val="991"/>
+  </w:num>
+  <w:num w:numId="1260">
+    <w:abstractNumId w:val="991"/>
+  </w:num>
+  <w:num w:numId="1261">
+    <w:abstractNumId w:val="991"/>
+  </w:num>
+  <w:num w:numId="1262">
     <w:abstractNumId w:val="991"/>
   </w:num>
 </w:numbering>

</xml_diff>

<commit_message>
Find it for less: strict answer schema (no more empty or tangled results); guides, playbook T-60/61, mission
Co-Authored-By: Claude Opus 5.5 <noreply@anthropic.com>
Claude-Session: https://claude.ai/code/session_01JPZJaTbXQFN2qiYRf4rkZK
</commit_message>
<xml_diff>
--- a/docs/Next_Owner_Market_Change_Log.docx
+++ b/docs/Next_Owner_Market_Change_Log.docx
@@ -2,7 +2,7 @@
 <file path=word/document.xml><?xml version="1.0" encoding="utf-8"?>
 <w:document xmlns:w="http://schemas.openxmlformats.org/wordprocessingml/2006/main" xmlns:m="http://schemas.openxmlformats.org/officeDocument/2006/math" xmlns:r="http://schemas.openxmlformats.org/officeDocument/2006/relationships" xmlns:o="urn:schemas-microsoft-com:office:office" xmlns:v="urn:schemas-microsoft-com:vml" xmlns:w10="urn:schemas-microsoft-com:office:word" xmlns:a="http://schemas.openxmlformats.org/drawingml/2006/main" xmlns:pic="http://schemas.openxmlformats.org/drawingml/2006/picture" xmlns:wp="http://schemas.openxmlformats.org/drawingml/2006/wordprocessingDrawing">
   <w:body>
-    <w:bookmarkStart w:id="291" w:name="next-owner-market--change-log"/>
+    <w:bookmarkStart w:id="293" w:name="next-owner-market--change-log"/>
     <w:p>
       <w:pPr>
         <w:pStyle w:val="Heading1"/>
@@ -20,7 +20,7 @@
           <w:iCs/>
           <w:i/>
         </w:rPr>
-        <w:t xml:space="preserve">Every change to the code, database, and documents, oldest first. Generated October 9, 2026 5:14 PM from the project history (264 changes).</w:t>
+        <w:t xml:space="preserve">Every change to the code, database, and documents, oldest first. Generated October 9, 2026 6:54 PM from the project history (266 changes).</w:t>
       </w:r>
     </w:p>
     <w:bookmarkStart w:id="52" w:name="tuesday-september-29-2026"/>
@@ -34728,7 +34728,7 @@
     </w:p>
     <w:bookmarkEnd w:id="269"/>
     <w:bookmarkEnd w:id="270"/>
-    <w:bookmarkStart w:id="290" w:name="friday-october-9-2026"/>
+    <w:bookmarkStart w:id="292" w:name="friday-october-9-2026"/>
     <w:p>
       <w:pPr>
         <w:pStyle w:val="Heading2"/>
@@ -37411,8 +37411,281 @@
       </w:r>
     </w:p>
     <w:bookmarkEnd w:id="289"/>
+    <w:bookmarkStart w:id="290" w:name="Xf9c0be587158f9cdef4f5341140bbd296484b86"/>
+    <w:p>
+      <w:pPr>
+        <w:pStyle w:val="Heading3"/>
+      </w:pPr>
+      <w:r>
+        <w:t xml:space="preserve">17:15 — Rules: locked layout for lookup answer screens (owner, Oct 9); playbook T-59</w:t>
+      </w:r>
+    </w:p>
+    <w:p>
+      <w:pPr>
+        <w:numPr>
+          <w:ilvl w:val="0"/>
+          <w:numId w:val="1265"/>
+        </w:numPr>
+        <w:pStyle w:val="Compact"/>
+      </w:pPr>
+      <w:r>
+        <w:rPr>
+          <w:bCs/>
+          <w:b/>
+        </w:rPr>
+        <w:t xml:space="preserve">Project rules:</w:t>
+      </w:r>
+      <w:r>
+        <w:t xml:space="preserve"> </w:t>
+      </w:r>
+      <w:r>
+        <w:rPr>
+          <w:rStyle w:val="VerbatimChar"/>
+        </w:rPr>
+        <w:t xml:space="preserve">CLAUDE.md</w:t>
+      </w:r>
+    </w:p>
+    <w:p>
+      <w:pPr>
+        <w:numPr>
+          <w:ilvl w:val="0"/>
+          <w:numId w:val="1265"/>
+        </w:numPr>
+        <w:pStyle w:val="Compact"/>
+      </w:pPr>
+      <w:r>
+        <w:rPr>
+          <w:bCs/>
+          <w:b/>
+        </w:rPr>
+        <w:t xml:space="preserve">Documents:</w:t>
+      </w:r>
+      <w:r>
+        <w:t xml:space="preserve"> </w:t>
+      </w:r>
+      <w:r>
+        <w:rPr>
+          <w:rStyle w:val="VerbatimChar"/>
+        </w:rPr>
+        <w:t xml:space="preserve">docs/Next_Owner_Market_AddOn_Modules_White_Paper.docx</w:t>
+      </w:r>
+      <w:r>
+        <w:t xml:space="preserve">,</w:t>
+      </w:r>
+      <w:r>
+        <w:t xml:space="preserve"> </w:t>
+      </w:r>
+      <w:r>
+        <w:rPr>
+          <w:rStyle w:val="VerbatimChar"/>
+        </w:rPr>
+        <w:t xml:space="preserve">docs/Next_Owner_Market_App_Builder_Playbook.docx</w:t>
+      </w:r>
+      <w:r>
+        <w:t xml:space="preserve">,</w:t>
+      </w:r>
+      <w:r>
+        <w:t xml:space="preserve"> </w:t>
+      </w:r>
+      <w:r>
+        <w:rPr>
+          <w:rStyle w:val="VerbatimChar"/>
+        </w:rPr>
+        <w:t xml:space="preserve">docs/Next_Owner_Market_App_Builder_Playbook.md</w:t>
+      </w:r>
+      <w:r>
+        <w:t xml:space="preserve">,</w:t>
+      </w:r>
+      <w:r>
+        <w:t xml:space="preserve"> </w:t>
+      </w:r>
+      <w:r>
+        <w:rPr>
+          <w:rStyle w:val="VerbatimChar"/>
+        </w:rPr>
+        <w:t xml:space="preserve">docs/Next_Owner_Market_Beat_The_Competition.docx</w:t>
+      </w:r>
+      <w:r>
+        <w:t xml:space="preserve">,</w:t>
+      </w:r>
+      <w:r>
+        <w:t xml:space="preserve"> </w:t>
+      </w:r>
+      <w:r>
+        <w:rPr>
+          <w:rStyle w:val="VerbatimChar"/>
+        </w:rPr>
+        <w:t xml:space="preserve">docs/Next_Owner_Market_Build_Journal.docx</w:t>
+      </w:r>
+      <w:r>
+        <w:t xml:space="preserve">,</w:t>
+      </w:r>
+      <w:r>
+        <w:t xml:space="preserve"> </w:t>
+      </w:r>
+      <w:r>
+        <w:rPr>
+          <w:rStyle w:val="VerbatimChar"/>
+        </w:rPr>
+        <w:t xml:space="preserve">docs/Next_Owner_Market_Build_Journal.md</w:t>
+      </w:r>
+      <w:r>
+        <w:t xml:space="preserve">,</w:t>
+      </w:r>
+      <w:r>
+        <w:t xml:space="preserve"> </w:t>
+      </w:r>
+      <w:r>
+        <w:rPr>
+          <w:rStyle w:val="VerbatimChar"/>
+        </w:rPr>
+        <w:t xml:space="preserve">docs/Next_Owner_Market_Change_Log.docx</w:t>
+      </w:r>
+      <w:r>
+        <w:t xml:space="preserve">,</w:t>
+      </w:r>
+      <w:r>
+        <w:t xml:space="preserve"> </w:t>
+      </w:r>
+      <w:r>
+        <w:rPr>
+          <w:rStyle w:val="VerbatimChar"/>
+        </w:rPr>
+        <w:t xml:space="preserve">docs/Next_Owner_Market_Change_Log.md</w:t>
+      </w:r>
+      <w:r>
+        <w:t xml:space="preserve">,</w:t>
+      </w:r>
+      <w:r>
+        <w:t xml:space="preserve"> </w:t>
+      </w:r>
+      <w:r>
+        <w:rPr>
+          <w:rStyle w:val="VerbatimChar"/>
+        </w:rPr>
+        <w:t xml:space="preserve">docs/Next_Owner_Market_Complete_Guide.docx</w:t>
+      </w:r>
+      <w:r>
+        <w:t xml:space="preserve">,</w:t>
+      </w:r>
+      <w:r>
+        <w:t xml:space="preserve"> </w:t>
+      </w:r>
+      <w:r>
+        <w:rPr>
+          <w:rStyle w:val="VerbatimChar"/>
+        </w:rPr>
+        <w:t xml:space="preserve">docs/Next_Owner_Market_Estate_Pack_Legal_Research.docx</w:t>
+      </w:r>
+      <w:r>
+        <w:t xml:space="preserve">,</w:t>
+      </w:r>
+      <w:r>
+        <w:t xml:space="preserve"> </w:t>
+      </w:r>
+      <w:r>
+        <w:rPr>
+          <w:rStyle w:val="VerbatimChar"/>
+        </w:rPr>
+        <w:t xml:space="preserve">docs/Next_Owner_Market_Facebook_Page_Kit.docx</w:t>
+      </w:r>
+      <w:r>
+        <w:t xml:space="preserve">,</w:t>
+      </w:r>
+      <w:r>
+        <w:t xml:space="preserve"> </w:t>
+      </w:r>
+      <w:r>
+        <w:rPr>
+          <w:rStyle w:val="VerbatimChar"/>
+        </w:rPr>
+        <w:t xml:space="preserve">docs/Next_Owner_Market_File_Index.docx</w:t>
+      </w:r>
+      <w:r>
+        <w:t xml:space="preserve"> </w:t>
+      </w:r>
+      <w:r>
+        <w:t xml:space="preserve">(+16 more)</w:t>
+      </w:r>
+    </w:p>
+    <w:p>
+      <w:pPr>
+        <w:pStyle w:val="FirstParagraph"/>
+      </w:pPr>
+      <w:r>
+        <w:t xml:space="preserve">change id cd981d4</w:t>
+      </w:r>
+    </w:p>
     <w:bookmarkEnd w:id="290"/>
+    <w:bookmarkStart w:id="291" w:name="Xdd0297aa5bb7286ad1d41df1449b51c29735eee"/>
+    <w:p>
+      <w:pPr>
+        <w:pStyle w:val="Heading3"/>
+      </w:pPr>
+      <w:r>
+        <w:t xml:space="preserve">18:49 — Records: journal update</w:t>
+      </w:r>
+    </w:p>
+    <w:p>
+      <w:pPr>
+        <w:numPr>
+          <w:ilvl w:val="0"/>
+          <w:numId w:val="1266"/>
+        </w:numPr>
+        <w:pStyle w:val="Compact"/>
+      </w:pPr>
+      <w:r>
+        <w:rPr>
+          <w:bCs/>
+          <w:b/>
+        </w:rPr>
+        <w:t xml:space="preserve">Documents:</w:t>
+      </w:r>
+      <w:r>
+        <w:t xml:space="preserve"> </w:t>
+      </w:r>
+      <w:r>
+        <w:rPr>
+          <w:rStyle w:val="VerbatimChar"/>
+        </w:rPr>
+        <w:t xml:space="preserve">docs/Next_Owner_Market_Build_Journal.md</w:t>
+      </w:r>
+      <w:r>
+        <w:t xml:space="preserve">,</w:t>
+      </w:r>
+      <w:r>
+        <w:t xml:space="preserve"> </w:t>
+      </w:r>
+      <w:r>
+        <w:rPr>
+          <w:rStyle w:val="VerbatimChar"/>
+        </w:rPr>
+        <w:t xml:space="preserve">docs/journal_sessions/faa89acb-5a67-582b-a46a-1c3f3b736545.md</w:t>
+      </w:r>
+      <w:r>
+        <w:t xml:space="preserve">,</w:t>
+      </w:r>
+      <w:r>
+        <w:t xml:space="preserve"> </w:t>
+      </w:r>
+      <w:r>
+        <w:rPr>
+          <w:rStyle w:val="VerbatimChar"/>
+        </w:rPr>
+        <w:t xml:space="preserve">docs/journal_sessions/faa89acb-5a67-582b-a46a-1c3f3b736545.rows.json</w:t>
+      </w:r>
+    </w:p>
+    <w:p>
+      <w:pPr>
+        <w:pStyle w:val="FirstParagraph"/>
+      </w:pPr>
+      <w:r>
+        <w:t xml:space="preserve">change id ecfb1c8</w:t>
+      </w:r>
+    </w:p>
     <w:bookmarkEnd w:id="291"/>
+    <w:bookmarkEnd w:id="292"/>
+    <w:bookmarkEnd w:id="293"/>
     <w:sectPr/>
   </w:body>
 </w:document>
@@ -38388,6 +38661,12 @@
     <w:abstractNumId w:val="991"/>
   </w:num>
   <w:num w:numId="1264">
+    <w:abstractNumId w:val="991"/>
+  </w:num>
+  <w:num w:numId="1265">
+    <w:abstractNumId w:val="991"/>
+  </w:num>
+  <w:num w:numId="1266">
     <w:abstractNumId w:val="991"/>
   </w:num>
 </w:numbering>

</xml_diff>

<commit_message>
Rules Harvest prompt: collect lessons from every project into the master files
Co-Authored-By: Claude Opus 5.5 <noreply@anthropic.com>
Claude-Session: https://claude.ai/code/session_01JPZJaTbXQFN2qiYRf4rkZK
</commit_message>
<xml_diff>
--- a/docs/Next_Owner_Market_Change_Log.docx
+++ b/docs/Next_Owner_Market_Change_Log.docx
@@ -2,7 +2,7 @@
 <file path=word/document.xml><?xml version="1.0" encoding="utf-8"?>
 <w:document xmlns:w="http://schemas.openxmlformats.org/wordprocessingml/2006/main" xmlns:m="http://schemas.openxmlformats.org/officeDocument/2006/math" xmlns:r="http://schemas.openxmlformats.org/officeDocument/2006/relationships" xmlns:o="urn:schemas-microsoft-com:office:office" xmlns:v="urn:schemas-microsoft-com:vml" xmlns:w10="urn:schemas-microsoft-com:office:word" xmlns:a="http://schemas.openxmlformats.org/drawingml/2006/main" xmlns:pic="http://schemas.openxmlformats.org/drawingml/2006/picture" xmlns:wp="http://schemas.openxmlformats.org/drawingml/2006/wordprocessingDrawing">
   <w:body>
-    <w:bookmarkStart w:id="302" w:name="next-owner-market--change-log"/>
+    <w:bookmarkStart w:id="303" w:name="next-owner-market--change-log"/>
     <w:p>
       <w:pPr>
         <w:pStyle w:val="Heading1"/>
@@ -20,7 +20,7 @@
           <w:iCs/>
           <w:i/>
         </w:rPr>
-        <w:t xml:space="preserve">Every change to the code, database, and documents, oldest first. Generated October 23, 2026 1:58 PM from the project history (274 changes).</w:t>
+        <w:t xml:space="preserve">Every change to the code, database, and documents, oldest first. Generated October 23, 2026 2:02 PM from the project history (275 changes).</w:t>
       </w:r>
     </w:p>
     <w:bookmarkStart w:id="52" w:name="tuesday-september-29-2026"/>
@@ -38677,7 +38677,7 @@
     </w:p>
     <w:bookmarkEnd w:id="297"/>
     <w:bookmarkEnd w:id="298"/>
-    <w:bookmarkStart w:id="301" w:name="friday-october-23-2026"/>
+    <w:bookmarkStart w:id="302" w:name="friday-october-23-2026"/>
     <w:p>
       <w:pPr>
         <w:pStyle w:val="Heading2"/>
@@ -38833,8 +38833,189 @@
       </w:r>
     </w:p>
     <w:bookmarkEnd w:id="300"/>
+    <w:bookmarkStart w:id="301" w:name="X8feae1baa5f41a5d6e4bc4f4bc620da6450eabf"/>
+    <w:p>
+      <w:pPr>
+        <w:pStyle w:val="Heading3"/>
+      </w:pPr>
+      <w:r>
+        <w:t xml:space="preserve">13:58 — Records</w:t>
+      </w:r>
+    </w:p>
+    <w:p>
+      <w:pPr>
+        <w:numPr>
+          <w:ilvl w:val="0"/>
+          <w:numId w:val="1275"/>
+        </w:numPr>
+        <w:pStyle w:val="Compact"/>
+      </w:pPr>
+      <w:r>
+        <w:rPr>
+          <w:bCs/>
+          <w:b/>
+        </w:rPr>
+        <w:t xml:space="preserve">Documents:</w:t>
+      </w:r>
+      <w:r>
+        <w:t xml:space="preserve"> </w:t>
+      </w:r>
+      <w:r>
+        <w:rPr>
+          <w:rStyle w:val="VerbatimChar"/>
+        </w:rPr>
+        <w:t xml:space="preserve">docs/Next_Owner_Market_AddOn_Modules_White_Paper.docx</w:t>
+      </w:r>
+      <w:r>
+        <w:t xml:space="preserve">,</w:t>
+      </w:r>
+      <w:r>
+        <w:t xml:space="preserve"> </w:t>
+      </w:r>
+      <w:r>
+        <w:rPr>
+          <w:rStyle w:val="VerbatimChar"/>
+        </w:rPr>
+        <w:t xml:space="preserve">docs/Next_Owner_Market_App_Builder_Playbook.docx</w:t>
+      </w:r>
+      <w:r>
+        <w:t xml:space="preserve">,</w:t>
+      </w:r>
+      <w:r>
+        <w:t xml:space="preserve"> </w:t>
+      </w:r>
+      <w:r>
+        <w:rPr>
+          <w:rStyle w:val="VerbatimChar"/>
+        </w:rPr>
+        <w:t xml:space="preserve">docs/Next_Owner_Market_App_Builder_Playbook.md</w:t>
+      </w:r>
+      <w:r>
+        <w:t xml:space="preserve">,</w:t>
+      </w:r>
+      <w:r>
+        <w:t xml:space="preserve"> </w:t>
+      </w:r>
+      <w:r>
+        <w:rPr>
+          <w:rStyle w:val="VerbatimChar"/>
+        </w:rPr>
+        <w:t xml:space="preserve">docs/Next_Owner_Market_Beat_The_Competition.docx</w:t>
+      </w:r>
+      <w:r>
+        <w:t xml:space="preserve">,</w:t>
+      </w:r>
+      <w:r>
+        <w:t xml:space="preserve"> </w:t>
+      </w:r>
+      <w:r>
+        <w:rPr>
+          <w:rStyle w:val="VerbatimChar"/>
+        </w:rPr>
+        <w:t xml:space="preserve">docs/Next_Owner_Market_Build_Journal.docx</w:t>
+      </w:r>
+      <w:r>
+        <w:t xml:space="preserve">,</w:t>
+      </w:r>
+      <w:r>
+        <w:t xml:space="preserve"> </w:t>
+      </w:r>
+      <w:r>
+        <w:rPr>
+          <w:rStyle w:val="VerbatimChar"/>
+        </w:rPr>
+        <w:t xml:space="preserve">docs/Next_Owner_Market_Change_Log.docx</w:t>
+      </w:r>
+      <w:r>
+        <w:t xml:space="preserve">,</w:t>
+      </w:r>
+      <w:r>
+        <w:t xml:space="preserve"> </w:t>
+      </w:r>
+      <w:r>
+        <w:rPr>
+          <w:rStyle w:val="VerbatimChar"/>
+        </w:rPr>
+        <w:t xml:space="preserve">docs/Next_Owner_Market_Change_Log.md</w:t>
+      </w:r>
+      <w:r>
+        <w:t xml:space="preserve">,</w:t>
+      </w:r>
+      <w:r>
+        <w:t xml:space="preserve"> </w:t>
+      </w:r>
+      <w:r>
+        <w:rPr>
+          <w:rStyle w:val="VerbatimChar"/>
+        </w:rPr>
+        <w:t xml:space="preserve">docs/Next_Owner_Market_Complete_Guide.docx</w:t>
+      </w:r>
+      <w:r>
+        <w:t xml:space="preserve">,</w:t>
+      </w:r>
+      <w:r>
+        <w:t xml:space="preserve"> </w:t>
+      </w:r>
+      <w:r>
+        <w:rPr>
+          <w:rStyle w:val="VerbatimChar"/>
+        </w:rPr>
+        <w:t xml:space="preserve">docs/Next_Owner_Market_Estate_Pack_Legal_Research.docx</w:t>
+      </w:r>
+      <w:r>
+        <w:t xml:space="preserve">,</w:t>
+      </w:r>
+      <w:r>
+        <w:t xml:space="preserve"> </w:t>
+      </w:r>
+      <w:r>
+        <w:rPr>
+          <w:rStyle w:val="VerbatimChar"/>
+        </w:rPr>
+        <w:t xml:space="preserve">docs/Next_Owner_Market_Facebook_Page_Kit.docx</w:t>
+      </w:r>
+      <w:r>
+        <w:t xml:space="preserve">,</w:t>
+      </w:r>
+      <w:r>
+        <w:t xml:space="preserve"> </w:t>
+      </w:r>
+      <w:r>
+        <w:rPr>
+          <w:rStyle w:val="VerbatimChar"/>
+        </w:rPr>
+        <w:t xml:space="preserve">docs/Next_Owner_Market_File_Index.docx</w:t>
+      </w:r>
+      <w:r>
+        <w:t xml:space="preserve">,</w:t>
+      </w:r>
+      <w:r>
+        <w:t xml:space="preserve"> </w:t>
+      </w:r>
+      <w:r>
+        <w:rPr>
+          <w:rStyle w:val="VerbatimChar"/>
+        </w:rPr>
+        <w:t xml:space="preserve">docs/Next_Owner_Market_Google_Merchant_Center_Fix.docx</w:t>
+      </w:r>
+      <w:r>
+        <w:t xml:space="preserve"> </w:t>
+      </w:r>
+      <w:r>
+        <w:t xml:space="preserve">(+11 more)</w:t>
+      </w:r>
+    </w:p>
+    <w:p>
+      <w:pPr>
+        <w:pStyle w:val="FirstParagraph"/>
+      </w:pPr>
+      <w:r>
+        <w:t xml:space="preserve">change id 861cf96</w:t>
+      </w:r>
+    </w:p>
     <w:bookmarkEnd w:id="301"/>
     <w:bookmarkEnd w:id="302"/>
+    <w:bookmarkEnd w:id="303"/>
     <w:sectPr/>
   </w:body>
 </w:document>
@@ -39840,6 +40021,9 @@
     <w:abstractNumId w:val="991"/>
   </w:num>
   <w:num w:numId="1274">
+    <w:abstractNumId w:val="991"/>
+  </w:num>
+  <w:num w:numId="1275">
     <w:abstractNumId w:val="991"/>
   </w:num>
 </w:numbering>

</xml_diff>

<commit_message>
User Guide: sold ads are never deleted; rebuilt documents
Co-Authored-By: Claude Opus 5.5 <noreply@anthropic.com>
Claude-Session: https://claude.ai/code/session_01JPZJaTbXQFN2qiYRf4rkZK
</commit_message>
<xml_diff>
--- a/docs/Next_Owner_Market_Change_Log.docx
+++ b/docs/Next_Owner_Market_Change_Log.docx
@@ -2,7 +2,7 @@
 <file path=word/document.xml><?xml version="1.0" encoding="utf-8"?>
 <w:document xmlns:w="http://schemas.openxmlformats.org/wordprocessingml/2006/main" xmlns:m="http://schemas.openxmlformats.org/officeDocument/2006/math" xmlns:r="http://schemas.openxmlformats.org/officeDocument/2006/relationships" xmlns:o="urn:schemas-microsoft-com:office:office" xmlns:v="urn:schemas-microsoft-com:vml" xmlns:w10="urn:schemas-microsoft-com:office:word" xmlns:a="http://schemas.openxmlformats.org/drawingml/2006/main" xmlns:pic="http://schemas.openxmlformats.org/drawingml/2006/picture" xmlns:wp="http://schemas.openxmlformats.org/drawingml/2006/wordprocessingDrawing">
   <w:body>
-    <w:bookmarkStart w:id="401" w:name="next-owner-market--change-log"/>
+    <w:bookmarkStart w:id="403" w:name="next-owner-market--change-log"/>
     <w:p>
       <w:pPr>
         <w:pStyle w:val="Heading1"/>
@@ -20,7 +20,7 @@
           <w:iCs/>
           <w:i/>
         </w:rPr>
-        <w:t xml:space="preserve">Every change to the code, database, and documents, oldest first. Generated October 24, 2026 1:08 PM from the project history (372 changes).</w:t>
+        <w:t xml:space="preserve">Every change to the code, database, and documents, oldest first. Generated October 24, 2026 1:15 PM from the project history (374 changes).</w:t>
       </w:r>
     </w:p>
     <w:bookmarkStart w:id="52" w:name="tuesday-september-29-2026"/>
@@ -47040,7 +47040,7 @@
     </w:p>
     <w:bookmarkEnd w:id="367"/>
     <w:bookmarkEnd w:id="368"/>
-    <w:bookmarkStart w:id="400" w:name="saturday-october-24-2026"/>
+    <w:bookmarkStart w:id="402" w:name="saturday-october-24-2026"/>
     <w:p>
       <w:pPr>
         <w:pStyle w:val="Heading2"/>
@@ -50740,8 +50740,293 @@
       </w:r>
     </w:p>
     <w:bookmarkEnd w:id="399"/>
+    <w:bookmarkStart w:id="400" w:name="X340ba3a6c4d1c572492747049f7b7f6afe114fd"/>
+    <w:p>
+      <w:pPr>
+        <w:pStyle w:val="Heading3"/>
+      </w:pPr>
+      <w:r>
+        <w:t xml:space="preserve">13:09 — Rebuilt documents for the zip</w:t>
+      </w:r>
+    </w:p>
+    <w:p>
+      <w:pPr>
+        <w:numPr>
+          <w:ilvl w:val="0"/>
+          <w:numId w:val="1373"/>
+        </w:numPr>
+        <w:pStyle w:val="Compact"/>
+      </w:pPr>
+      <w:r>
+        <w:rPr>
+          <w:bCs/>
+          <w:b/>
+        </w:rPr>
+        <w:t xml:space="preserve">Documents:</w:t>
+      </w:r>
+      <w:r>
+        <w:t xml:space="preserve"> </w:t>
+      </w:r>
+      <w:r>
+        <w:rPr>
+          <w:rStyle w:val="VerbatimChar"/>
+        </w:rPr>
+        <w:t xml:space="preserve">docs/Next_Owner_Market_AddOn_Modules_White_Paper.docx</w:t>
+      </w:r>
+      <w:r>
+        <w:t xml:space="preserve">,</w:t>
+      </w:r>
+      <w:r>
+        <w:t xml:space="preserve"> </w:t>
+      </w:r>
+      <w:r>
+        <w:rPr>
+          <w:rStyle w:val="VerbatimChar"/>
+        </w:rPr>
+        <w:t xml:space="preserve">docs/Next_Owner_Market_App_Builder_Playbook.docx</w:t>
+      </w:r>
+      <w:r>
+        <w:t xml:space="preserve">,</w:t>
+      </w:r>
+      <w:r>
+        <w:t xml:space="preserve"> </w:t>
+      </w:r>
+      <w:r>
+        <w:rPr>
+          <w:rStyle w:val="VerbatimChar"/>
+        </w:rPr>
+        <w:t xml:space="preserve">docs/Next_Owner_Market_Beat_The_Competition.docx</w:t>
+      </w:r>
+      <w:r>
+        <w:t xml:space="preserve">,</w:t>
+      </w:r>
+      <w:r>
+        <w:t xml:space="preserve"> </w:t>
+      </w:r>
+      <w:r>
+        <w:rPr>
+          <w:rStyle w:val="VerbatimChar"/>
+        </w:rPr>
+        <w:t xml:space="preserve">docs/Next_Owner_Market_Build_Journal.docx</w:t>
+      </w:r>
+      <w:r>
+        <w:t xml:space="preserve">,</w:t>
+      </w:r>
+      <w:r>
+        <w:t xml:space="preserve"> </w:t>
+      </w:r>
+      <w:r>
+        <w:rPr>
+          <w:rStyle w:val="VerbatimChar"/>
+        </w:rPr>
+        <w:t xml:space="preserve">docs/Next_Owner_Market_Change_Log.docx</w:t>
+      </w:r>
+      <w:r>
+        <w:t xml:space="preserve">,</w:t>
+      </w:r>
+      <w:r>
+        <w:t xml:space="preserve"> </w:t>
+      </w:r>
+      <w:r>
+        <w:rPr>
+          <w:rStyle w:val="VerbatimChar"/>
+        </w:rPr>
+        <w:t xml:space="preserve">docs/Next_Owner_Market_Change_Log.md</w:t>
+      </w:r>
+      <w:r>
+        <w:t xml:space="preserve">,</w:t>
+      </w:r>
+      <w:r>
+        <w:t xml:space="preserve"> </w:t>
+      </w:r>
+      <w:r>
+        <w:rPr>
+          <w:rStyle w:val="VerbatimChar"/>
+        </w:rPr>
+        <w:t xml:space="preserve">docs/Next_Owner_Market_Chat_Harvest.docx</w:t>
+      </w:r>
+      <w:r>
+        <w:t xml:space="preserve">,</w:t>
+      </w:r>
+      <w:r>
+        <w:t xml:space="preserve"> </w:t>
+      </w:r>
+      <w:r>
+        <w:rPr>
+          <w:rStyle w:val="VerbatimChar"/>
+        </w:rPr>
+        <w:t xml:space="preserve">docs/Next_Owner_Market_Complete_Guide.docx</w:t>
+      </w:r>
+      <w:r>
+        <w:t xml:space="preserve">,</w:t>
+      </w:r>
+      <w:r>
+        <w:t xml:space="preserve"> </w:t>
+      </w:r>
+      <w:r>
+        <w:rPr>
+          <w:rStyle w:val="VerbatimChar"/>
+        </w:rPr>
+        <w:t xml:space="preserve">docs/Next_Owner_Market_Estate_Pack_Legal_Research.docx</w:t>
+      </w:r>
+      <w:r>
+        <w:t xml:space="preserve">,</w:t>
+      </w:r>
+      <w:r>
+        <w:t xml:space="preserve"> </w:t>
+      </w:r>
+      <w:r>
+        <w:rPr>
+          <w:rStyle w:val="VerbatimChar"/>
+        </w:rPr>
+        <w:t xml:space="preserve">docs/Next_Owner_Market_Facebook_Page_Kit.docx</w:t>
+      </w:r>
+      <w:r>
+        <w:t xml:space="preserve">,</w:t>
+      </w:r>
+      <w:r>
+        <w:t xml:space="preserve"> </w:t>
+      </w:r>
+      <w:r>
+        <w:rPr>
+          <w:rStyle w:val="VerbatimChar"/>
+        </w:rPr>
+        <w:t xml:space="preserve">docs/Next_Owner_Market_Feedback_For_Anthropic.docx</w:t>
+      </w:r>
+      <w:r>
+        <w:t xml:space="preserve">,</w:t>
+      </w:r>
+      <w:r>
+        <w:t xml:space="preserve"> </w:t>
+      </w:r>
+      <w:r>
+        <w:rPr>
+          <w:rStyle w:val="VerbatimChar"/>
+        </w:rPr>
+        <w:t xml:space="preserve">docs/Next_Owner_Market_File_Index.docx</w:t>
+      </w:r>
+      <w:r>
+        <w:t xml:space="preserve"> </w:t>
+      </w:r>
+      <w:r>
+        <w:t xml:space="preserve">(+15 more)</w:t>
+      </w:r>
+    </w:p>
+    <w:p>
+      <w:pPr>
+        <w:pStyle w:val="FirstParagraph"/>
+      </w:pPr>
+      <w:r>
+        <w:t xml:space="preserve">change id f73c906</w:t>
+      </w:r>
+    </w:p>
     <w:bookmarkEnd w:id="400"/>
+    <w:bookmarkStart w:id="401" w:name="X04813246989d3dfbdd67dbb9a28cba8a932603c"/>
+    <w:p>
+      <w:pPr>
+        <w:pStyle w:val="Heading3"/>
+      </w:pPr>
+      <w:r>
+        <w:t xml:space="preserve">13:14 — Never delete an ad Facebook shows as Sold or Sold and shipped: 'It's marked Sold on Facebook' button and instructions; Sold button keeps the ad; sales history shows sold-on-Facebook items</w:t>
+      </w:r>
+    </w:p>
+    <w:p>
+      <w:pPr>
+        <w:numPr>
+          <w:ilvl w:val="0"/>
+          <w:numId w:val="1374"/>
+        </w:numPr>
+        <w:pStyle w:val="Compact"/>
+      </w:pPr>
+      <w:r>
+        <w:rPr>
+          <w:bCs/>
+          <w:b/>
+        </w:rPr>
+        <w:t xml:space="preserve">Seller / staff app:</w:t>
+      </w:r>
+      <w:r>
+        <w:t xml:space="preserve"> </w:t>
+      </w:r>
+      <w:r>
+        <w:rPr>
+          <w:rStyle w:val="VerbatimChar"/>
+        </w:rPr>
+        <w:t xml:space="preserve">src/app/app/relist/RelistClient.tsx</w:t>
+      </w:r>
+      <w:r>
+        <w:t xml:space="preserve">,</w:t>
+      </w:r>
+      <w:r>
+        <w:t xml:space="preserve"> </w:t>
+      </w:r>
+      <w:r>
+        <w:rPr>
+          <w:rStyle w:val="VerbatimChar"/>
+        </w:rPr>
+        <w:t xml:space="preserve">src/app/app/relist/SoldBox.tsx</w:t>
+      </w:r>
+      <w:r>
+        <w:t xml:space="preserve">,</w:t>
+      </w:r>
+      <w:r>
+        <w:t xml:space="preserve"> </w:t>
+      </w:r>
+      <w:r>
+        <w:rPr>
+          <w:rStyle w:val="VerbatimChar"/>
+        </w:rPr>
+        <w:t xml:space="preserve">src/app/app/relist/next/NextClient.tsx</w:t>
+      </w:r>
+      <w:r>
+        <w:t xml:space="preserve">,</w:t>
+      </w:r>
+      <w:r>
+        <w:t xml:space="preserve"> </w:t>
+      </w:r>
+      <w:r>
+        <w:rPr>
+          <w:rStyle w:val="VerbatimChar"/>
+        </w:rPr>
+        <w:t xml:space="preserve">src/app/app/relist/page.tsx</w:t>
+      </w:r>
+    </w:p>
+    <w:p>
+      <w:pPr>
+        <w:numPr>
+          <w:ilvl w:val="0"/>
+          <w:numId w:val="1374"/>
+        </w:numPr>
+        <w:pStyle w:val="Compact"/>
+      </w:pPr>
+      <w:r>
+        <w:rPr>
+          <w:bCs/>
+          <w:b/>
+        </w:rPr>
+        <w:t xml:space="preserve">Database (migrations):</w:t>
+      </w:r>
+      <w:r>
+        <w:t xml:space="preserve"> </w:t>
+      </w:r>
+      <w:r>
+        <w:rPr>
+          <w:rStyle w:val="VerbatimChar"/>
+        </w:rPr>
+        <w:t xml:space="preserve">supabase/migrations/054_fb_sold_seen.sql</w:t>
+      </w:r>
+    </w:p>
+    <w:p>
+      <w:pPr>
+        <w:pStyle w:val="FirstParagraph"/>
+      </w:pPr>
+      <w:r>
+        <w:t xml:space="preserve">change id cc01e87</w:t>
+      </w:r>
+    </w:p>
     <w:bookmarkEnd w:id="401"/>
+    <w:bookmarkEnd w:id="402"/>
+    <w:bookmarkEnd w:id="403"/>
     <w:sectPr/>
   </w:body>
 </w:document>
@@ -52043,6 +52328,12 @@
   <w:num w:numId="1372">
     <w:abstractNumId w:val="991"/>
   </w:num>
+  <w:num w:numId="1373">
+    <w:abstractNumId w:val="991"/>
+  </w:num>
+  <w:num w:numId="1374">
+    <w:abstractNumId w:val="991"/>
+  </w:num>
 </w:numbering>
 </file>
 

</xml_diff>

<commit_message>
Docs: journal and guide
Co-Authored-By: Claude Opus 5.5 <noreply@anthropic.com>
Claude-Session: https://claude.ai/code/session_01JPZJaTbXQFN2qiYRf4rkZK
</commit_message>
<xml_diff>
--- a/docs/Next_Owner_Market_Change_Log.docx
+++ b/docs/Next_Owner_Market_Change_Log.docx
@@ -2,7 +2,7 @@
 <file path=word/document.xml><?xml version="1.0" encoding="utf-8"?>
 <w:document xmlns:w="http://schemas.openxmlformats.org/wordprocessingml/2006/main" xmlns:m="http://schemas.openxmlformats.org/officeDocument/2006/math" xmlns:r="http://schemas.openxmlformats.org/officeDocument/2006/relationships" xmlns:o="urn:schemas-microsoft-com:office:office" xmlns:v="urn:schemas-microsoft-com:vml" xmlns:w10="urn:schemas-microsoft-com:office:word" xmlns:a="http://schemas.openxmlformats.org/drawingml/2006/main" xmlns:pic="http://schemas.openxmlformats.org/drawingml/2006/picture" xmlns:wp="http://schemas.openxmlformats.org/drawingml/2006/wordprocessingDrawing">
   <w:body>
-    <w:bookmarkStart w:id="413" w:name="next-owner-market--change-log"/>
+    <w:bookmarkStart w:id="417" w:name="next-owner-market--change-log"/>
     <w:p>
       <w:pPr>
         <w:pStyle w:val="Heading1"/>
@@ -20,7 +20,7 @@
           <w:iCs/>
           <w:i/>
         </w:rPr>
-        <w:t xml:space="preserve">Every change to the code, database, and documents, oldest first. Generated October 26, 2026 11:31 AM from the project history (382 changes).</w:t>
+        <w:t xml:space="preserve">Every change to the code, database, and documents, oldest first. Generated October 26, 2026 12:06 PM from the project history (386 changes).</w:t>
       </w:r>
     </w:p>
     <w:bookmarkStart w:id="52" w:name="tuesday-september-29-2026"/>
@@ -52085,7 +52085,7 @@
     </w:p>
     <w:bookmarkEnd w:id="409"/>
     <w:bookmarkEnd w:id="410"/>
-    <w:bookmarkStart w:id="412" w:name="monday-october-26-2026"/>
+    <w:bookmarkStart w:id="416" w:name="monday-october-26-2026"/>
     <w:p>
       <w:pPr>
         <w:pStyle w:val="Heading2"/>
@@ -52223,8 +52223,404 @@
       </w:r>
     </w:p>
     <w:bookmarkEnd w:id="411"/>
+    <w:bookmarkStart w:id="412" w:name="X1bee2e0d85911f52a3fbfffe6cfb4e53b3c4537"/>
+    <w:p>
+      <w:pPr>
+        <w:pStyle w:val="Heading3"/>
+      </w:pPr>
+      <w:r>
+        <w:t xml:space="preserve">11:32 — Docs: per-ad shipping choice, how Facebook prices shipping, T-76</w:t>
+      </w:r>
+    </w:p>
+    <w:p>
+      <w:pPr>
+        <w:numPr>
+          <w:ilvl w:val="0"/>
+          <w:numId w:val="1383"/>
+        </w:numPr>
+        <w:pStyle w:val="Compact"/>
+      </w:pPr>
+      <w:r>
+        <w:rPr>
+          <w:bCs/>
+          <w:b/>
+        </w:rPr>
+        <w:t xml:space="preserve">Documents:</w:t>
+      </w:r>
+      <w:r>
+        <w:t xml:space="preserve"> </w:t>
+      </w:r>
+      <w:r>
+        <w:rPr>
+          <w:rStyle w:val="VerbatimChar"/>
+        </w:rPr>
+        <w:t xml:space="preserve">docs/Next_Owner_Market_AddOn_Modules_White_Paper.docx</w:t>
+      </w:r>
+      <w:r>
+        <w:t xml:space="preserve">,</w:t>
+      </w:r>
+      <w:r>
+        <w:t xml:space="preserve"> </w:t>
+      </w:r>
+      <w:r>
+        <w:rPr>
+          <w:rStyle w:val="VerbatimChar"/>
+        </w:rPr>
+        <w:t xml:space="preserve">docs/Next_Owner_Market_App_Builder_Playbook.docx</w:t>
+      </w:r>
+      <w:r>
+        <w:t xml:space="preserve">,</w:t>
+      </w:r>
+      <w:r>
+        <w:t xml:space="preserve"> </w:t>
+      </w:r>
+      <w:r>
+        <w:rPr>
+          <w:rStyle w:val="VerbatimChar"/>
+        </w:rPr>
+        <w:t xml:space="preserve">docs/Next_Owner_Market_App_Builder_Playbook.md</w:t>
+      </w:r>
+      <w:r>
+        <w:t xml:space="preserve">,</w:t>
+      </w:r>
+      <w:r>
+        <w:t xml:space="preserve"> </w:t>
+      </w:r>
+      <w:r>
+        <w:rPr>
+          <w:rStyle w:val="VerbatimChar"/>
+        </w:rPr>
+        <w:t xml:space="preserve">docs/Next_Owner_Market_Beat_The_Competition.docx</w:t>
+      </w:r>
+      <w:r>
+        <w:t xml:space="preserve">,</w:t>
+      </w:r>
+      <w:r>
+        <w:t xml:space="preserve"> </w:t>
+      </w:r>
+      <w:r>
+        <w:rPr>
+          <w:rStyle w:val="VerbatimChar"/>
+        </w:rPr>
+        <w:t xml:space="preserve">docs/Next_Owner_Market_Build_Journal.docx</w:t>
+      </w:r>
+      <w:r>
+        <w:t xml:space="preserve">,</w:t>
+      </w:r>
+      <w:r>
+        <w:t xml:space="preserve"> </w:t>
+      </w:r>
+      <w:r>
+        <w:rPr>
+          <w:rStyle w:val="VerbatimChar"/>
+        </w:rPr>
+        <w:t xml:space="preserve">docs/Next_Owner_Market_Change_Log.docx</w:t>
+      </w:r>
+      <w:r>
+        <w:t xml:space="preserve">,</w:t>
+      </w:r>
+      <w:r>
+        <w:t xml:space="preserve"> </w:t>
+      </w:r>
+      <w:r>
+        <w:rPr>
+          <w:rStyle w:val="VerbatimChar"/>
+        </w:rPr>
+        <w:t xml:space="preserve">docs/Next_Owner_Market_Change_Log.md</w:t>
+      </w:r>
+      <w:r>
+        <w:t xml:space="preserve">,</w:t>
+      </w:r>
+      <w:r>
+        <w:t xml:space="preserve"> </w:t>
+      </w:r>
+      <w:r>
+        <w:rPr>
+          <w:rStyle w:val="VerbatimChar"/>
+        </w:rPr>
+        <w:t xml:space="preserve">docs/Next_Owner_Market_Chat_Harvest.docx</w:t>
+      </w:r>
+      <w:r>
+        <w:t xml:space="preserve">,</w:t>
+      </w:r>
+      <w:r>
+        <w:t xml:space="preserve"> </w:t>
+      </w:r>
+      <w:r>
+        <w:rPr>
+          <w:rStyle w:val="VerbatimChar"/>
+        </w:rPr>
+        <w:t xml:space="preserve">docs/Next_Owner_Market_Complete_Guide.docx</w:t>
+      </w:r>
+      <w:r>
+        <w:t xml:space="preserve">,</w:t>
+      </w:r>
+      <w:r>
+        <w:t xml:space="preserve"> </w:t>
+      </w:r>
+      <w:r>
+        <w:rPr>
+          <w:rStyle w:val="VerbatimChar"/>
+        </w:rPr>
+        <w:t xml:space="preserve">docs/Next_Owner_Market_Estate_Pack_Legal_Research.docx</w:t>
+      </w:r>
+      <w:r>
+        <w:t xml:space="preserve">,</w:t>
+      </w:r>
+      <w:r>
+        <w:t xml:space="preserve"> </w:t>
+      </w:r>
+      <w:r>
+        <w:rPr>
+          <w:rStyle w:val="VerbatimChar"/>
+        </w:rPr>
+        <w:t xml:space="preserve">docs/Next_Owner_Market_Facebook_Page_Kit.docx</w:t>
+      </w:r>
+      <w:r>
+        <w:t xml:space="preserve">,</w:t>
+      </w:r>
+      <w:r>
+        <w:t xml:space="preserve"> </w:t>
+      </w:r>
+      <w:r>
+        <w:rPr>
+          <w:rStyle w:val="VerbatimChar"/>
+        </w:rPr>
+        <w:t xml:space="preserve">docs/Next_Owner_Market_Feedback_For_Anthropic.docx</w:t>
+      </w:r>
+      <w:r>
+        <w:t xml:space="preserve"> </w:t>
+      </w:r>
+      <w:r>
+        <w:t xml:space="preserve">(+19 more)</w:t>
+      </w:r>
+    </w:p>
+    <w:p>
+      <w:pPr>
+        <w:pStyle w:val="FirstParagraph"/>
+      </w:pPr>
+      <w:r>
+        <w:t xml:space="preserve">change id c7f3188</w:t>
+      </w:r>
+    </w:p>
     <w:bookmarkEnd w:id="412"/>
+    <w:bookmarkStart w:id="413" w:name="X036de7dd9cabe06a07af35ad2006ad7a9d5ab7e"/>
+    <w:p>
+      <w:pPr>
+        <w:pStyle w:val="Heading3"/>
+      </w:pPr>
+      <w:r>
+        <w:t xml:space="preserve">11:58 — Facebook shipping: type the box-size billed weight into Facebook's weight box; over 70 lb posts as pickup</w:t>
+      </w:r>
+    </w:p>
+    <w:p>
+      <w:pPr>
+        <w:numPr>
+          <w:ilvl w:val="0"/>
+          <w:numId w:val="1384"/>
+        </w:numPr>
+        <w:pStyle w:val="Compact"/>
+      </w:pPr>
+      <w:r>
+        <w:rPr>
+          <w:bCs/>
+          <w:b/>
+        </w:rPr>
+        <w:t xml:space="preserve">Seller / staff app:</w:t>
+      </w:r>
+      <w:r>
+        <w:t xml:space="preserve"> </w:t>
+      </w:r>
+      <w:r>
+        <w:rPr>
+          <w:rStyle w:val="VerbatimChar"/>
+        </w:rPr>
+        <w:t xml:space="preserve">src/app/app/relist/EditBox.tsx</w:t>
+      </w:r>
+      <w:r>
+        <w:t xml:space="preserve">,</w:t>
+      </w:r>
+      <w:r>
+        <w:t xml:space="preserve"> </w:t>
+      </w:r>
+      <w:r>
+        <w:rPr>
+          <w:rStyle w:val="VerbatimChar"/>
+        </w:rPr>
+        <w:t xml:space="preserve">src/app/app/relist/next/NextClient.tsx</w:t>
+      </w:r>
+    </w:p>
+    <w:p>
+      <w:pPr>
+        <w:numPr>
+          <w:ilvl w:val="0"/>
+          <w:numId w:val="1384"/>
+        </w:numPr>
+        <w:pStyle w:val="Compact"/>
+      </w:pPr>
+      <w:r>
+        <w:rPr>
+          <w:bCs/>
+          <w:b/>
+        </w:rPr>
+        <w:t xml:space="preserve">Shared code (logic):</w:t>
+      </w:r>
+      <w:r>
+        <w:t xml:space="preserve"> </w:t>
+      </w:r>
+      <w:r>
+        <w:rPr>
+          <w:rStyle w:val="VerbatimChar"/>
+        </w:rPr>
+        <w:t xml:space="preserve">src/lib/fbship.ts</w:t>
+      </w:r>
+    </w:p>
+    <w:p>
+      <w:pPr>
+        <w:pStyle w:val="FirstParagraph"/>
+      </w:pPr>
+      <w:r>
+        <w:t xml:space="preserve">change id ea47117</w:t>
+      </w:r>
+    </w:p>
     <w:bookmarkEnd w:id="413"/>
+    <w:bookmarkStart w:id="414" w:name="X359754fca71e82a0d77998dd556dacfd7190e5e"/>
+    <w:p>
+      <w:pPr>
+        <w:pStyle w:val="Heading3"/>
+      </w:pPr>
+      <w:r>
+        <w:t xml:space="preserve">12:01 — Facebook posts: Product tags (up to 20) and Brand fields for search; Chrome steps fill them</w:t>
+      </w:r>
+    </w:p>
+    <w:p>
+      <w:pPr>
+        <w:numPr>
+          <w:ilvl w:val="0"/>
+          <w:numId w:val="1385"/>
+        </w:numPr>
+        <w:pStyle w:val="Compact"/>
+      </w:pPr>
+      <w:r>
+        <w:rPr>
+          <w:bCs/>
+          <w:b/>
+        </w:rPr>
+        <w:t xml:space="preserve">Documents:</w:t>
+      </w:r>
+      <w:r>
+        <w:t xml:space="preserve"> </w:t>
+      </w:r>
+      <w:r>
+        <w:rPr>
+          <w:rStyle w:val="VerbatimChar"/>
+        </w:rPr>
+        <w:t xml:space="preserve">docs/Next_Owner_Market_User_Guide.md</w:t>
+      </w:r>
+    </w:p>
+    <w:p>
+      <w:pPr>
+        <w:numPr>
+          <w:ilvl w:val="0"/>
+          <w:numId w:val="1385"/>
+        </w:numPr>
+        <w:pStyle w:val="Compact"/>
+      </w:pPr>
+      <w:r>
+        <w:rPr>
+          <w:bCs/>
+          <w:b/>
+        </w:rPr>
+        <w:t xml:space="preserve">Seller / staff app:</w:t>
+      </w:r>
+      <w:r>
+        <w:t xml:space="preserve"> </w:t>
+      </w:r>
+      <w:r>
+        <w:rPr>
+          <w:rStyle w:val="VerbatimChar"/>
+        </w:rPr>
+        <w:t xml:space="preserve">src/app/app/relist/RelistClient.tsx</w:t>
+      </w:r>
+      <w:r>
+        <w:t xml:space="preserve">,</w:t>
+      </w:r>
+      <w:r>
+        <w:t xml:space="preserve"> </w:t>
+      </w:r>
+      <w:r>
+        <w:rPr>
+          <w:rStyle w:val="VerbatimChar"/>
+        </w:rPr>
+        <w:t xml:space="preserve">src/app/app/relist/next/NextClient.tsx</w:t>
+      </w:r>
+      <w:r>
+        <w:t xml:space="preserve">,</w:t>
+      </w:r>
+      <w:r>
+        <w:t xml:space="preserve"> </w:t>
+      </w:r>
+      <w:r>
+        <w:rPr>
+          <w:rStyle w:val="VerbatimChar"/>
+        </w:rPr>
+        <w:t xml:space="preserve">src/app/app/relist/next/page.tsx</w:t>
+      </w:r>
+    </w:p>
+    <w:p>
+      <w:pPr>
+        <w:pStyle w:val="FirstParagraph"/>
+      </w:pPr>
+      <w:r>
+        <w:t xml:space="preserve">change id 93bbbaa</w:t>
+      </w:r>
+    </w:p>
+    <w:bookmarkEnd w:id="414"/>
+    <w:bookmarkStart w:id="415" w:name="Xf7ecb3efd1c01cf668165d61d0b86fa7096ae4f"/>
+    <w:p>
+      <w:pPr>
+        <w:pStyle w:val="Heading3"/>
+      </w:pPr>
+      <w:r>
+        <w:t xml:space="preserve">12:03 — Docs: search words in User Guide</w:t>
+      </w:r>
+    </w:p>
+    <w:p>
+      <w:pPr>
+        <w:numPr>
+          <w:ilvl w:val="0"/>
+          <w:numId w:val="1386"/>
+        </w:numPr>
+        <w:pStyle w:val="Compact"/>
+      </w:pPr>
+      <w:r>
+        <w:rPr>
+          <w:bCs/>
+          <w:b/>
+        </w:rPr>
+        <w:t xml:space="preserve">Documents:</w:t>
+      </w:r>
+      <w:r>
+        <w:t xml:space="preserve"> </w:t>
+      </w:r>
+      <w:r>
+        <w:rPr>
+          <w:rStyle w:val="VerbatimChar"/>
+        </w:rPr>
+        <w:t xml:space="preserve">docs/Next_Owner_Market_User_Guide.md</w:t>
+      </w:r>
+    </w:p>
+    <w:p>
+      <w:pPr>
+        <w:pStyle w:val="FirstParagraph"/>
+      </w:pPr>
+      <w:r>
+        <w:t xml:space="preserve">change id 13632b8</w:t>
+      </w:r>
+    </w:p>
+    <w:bookmarkEnd w:id="415"/>
+    <w:bookmarkEnd w:id="416"/>
+    <w:bookmarkEnd w:id="417"/>
     <w:sectPr/>
   </w:body>
 </w:document>
@@ -53556,6 +53952,18 @@
   <w:num w:numId="1382">
     <w:abstractNumId w:val="991"/>
   </w:num>
+  <w:num w:numId="1383">
+    <w:abstractNumId w:val="991"/>
+  </w:num>
+  <w:num w:numId="1384">
+    <w:abstractNumId w:val="991"/>
+  </w:num>
+  <w:num w:numId="1385">
+    <w:abstractNumId w:val="991"/>
+  </w:num>
+  <w:num w:numId="1386">
+    <w:abstractNumId w:val="991"/>
+  </w:num>
 </w:numbering>
 </file>
 

</xml_diff>

<commit_message>
Docs: Advanced What's it worth in User Guide
Co-Authored-By: Claude Opus 5.5 <noreply@anthropic.com>
Claude-Session: https://claude.ai/code/session_01JPZJaTbXQFN2qiYRf4rkZK
</commit_message>
<xml_diff>
--- a/docs/Next_Owner_Market_Change_Log.docx
+++ b/docs/Next_Owner_Market_Change_Log.docx
@@ -2,7 +2,7 @@
 <file path=word/document.xml><?xml version="1.0" encoding="utf-8"?>
 <w:document xmlns:w="http://schemas.openxmlformats.org/wordprocessingml/2006/main" xmlns:m="http://schemas.openxmlformats.org/officeDocument/2006/math" xmlns:r="http://schemas.openxmlformats.org/officeDocument/2006/relationships" xmlns:o="urn:schemas-microsoft-com:office:office" xmlns:v="urn:schemas-microsoft-com:vml" xmlns:w10="urn:schemas-microsoft-com:office:word" xmlns:a="http://schemas.openxmlformats.org/drawingml/2006/main" xmlns:pic="http://schemas.openxmlformats.org/drawingml/2006/picture" xmlns:wp="http://schemas.openxmlformats.org/drawingml/2006/wordprocessingDrawing">
   <w:body>
-    <w:bookmarkStart w:id="417" w:name="next-owner-market--change-log"/>
+    <w:bookmarkStart w:id="419" w:name="next-owner-market--change-log"/>
     <w:p>
       <w:pPr>
         <w:pStyle w:val="Heading1"/>
@@ -20,7 +20,7 @@
           <w:iCs/>
           <w:i/>
         </w:rPr>
-        <w:t xml:space="preserve">Every change to the code, database, and documents, oldest first. Generated October 26, 2026 12:06 PM from the project history (386 changes).</w:t>
+        <w:t xml:space="preserve">Every change to the code, database, and documents, oldest first. Generated October 26, 2026 7:36 PM from the project history (388 changes).</w:t>
       </w:r>
     </w:p>
     <w:bookmarkStart w:id="52" w:name="tuesday-september-29-2026"/>
@@ -52085,7 +52085,7 @@
     </w:p>
     <w:bookmarkEnd w:id="409"/>
     <w:bookmarkEnd w:id="410"/>
-    <w:bookmarkStart w:id="416" w:name="monday-october-26-2026"/>
+    <w:bookmarkStart w:id="418" w:name="monday-october-26-2026"/>
     <w:p>
       <w:pPr>
         <w:pStyle w:val="Heading2"/>
@@ -52619,8 +52619,428 @@
       </w:r>
     </w:p>
     <w:bookmarkEnd w:id="415"/>
+    <w:bookmarkStart w:id="416" w:name="Xe70b052b4fade6569736c8ae755e88ad29a2adb"/>
+    <w:p>
+      <w:pPr>
+        <w:pStyle w:val="Heading3"/>
+      </w:pPr>
+      <w:r>
+        <w:t xml:space="preserve">12:06 — Docs: journal and guide</w:t>
+      </w:r>
+    </w:p>
+    <w:p>
+      <w:pPr>
+        <w:numPr>
+          <w:ilvl w:val="0"/>
+          <w:numId w:val="1387"/>
+        </w:numPr>
+        <w:pStyle w:val="Compact"/>
+      </w:pPr>
+      <w:r>
+        <w:rPr>
+          <w:bCs/>
+          <w:b/>
+        </w:rPr>
+        <w:t xml:space="preserve">Documents:</w:t>
+      </w:r>
+      <w:r>
+        <w:t xml:space="preserve"> </w:t>
+      </w:r>
+      <w:r>
+        <w:rPr>
+          <w:rStyle w:val="VerbatimChar"/>
+        </w:rPr>
+        <w:t xml:space="preserve">docs/Next_Owner_Market_AddOn_Modules_White_Paper.docx</w:t>
+      </w:r>
+      <w:r>
+        <w:t xml:space="preserve">,</w:t>
+      </w:r>
+      <w:r>
+        <w:t xml:space="preserve"> </w:t>
+      </w:r>
+      <w:r>
+        <w:rPr>
+          <w:rStyle w:val="VerbatimChar"/>
+        </w:rPr>
+        <w:t xml:space="preserve">docs/Next_Owner_Market_App_Builder_Playbook.docx</w:t>
+      </w:r>
+      <w:r>
+        <w:t xml:space="preserve">,</w:t>
+      </w:r>
+      <w:r>
+        <w:t xml:space="preserve"> </w:t>
+      </w:r>
+      <w:r>
+        <w:rPr>
+          <w:rStyle w:val="VerbatimChar"/>
+        </w:rPr>
+        <w:t xml:space="preserve">docs/Next_Owner_Market_Beat_The_Competition.docx</w:t>
+      </w:r>
+      <w:r>
+        <w:t xml:space="preserve">,</w:t>
+      </w:r>
+      <w:r>
+        <w:t xml:space="preserve"> </w:t>
+      </w:r>
+      <w:r>
+        <w:rPr>
+          <w:rStyle w:val="VerbatimChar"/>
+        </w:rPr>
+        <w:t xml:space="preserve">docs/Next_Owner_Market_Build_Journal.docx</w:t>
+      </w:r>
+      <w:r>
+        <w:t xml:space="preserve">,</w:t>
+      </w:r>
+      <w:r>
+        <w:t xml:space="preserve"> </w:t>
+      </w:r>
+      <w:r>
+        <w:rPr>
+          <w:rStyle w:val="VerbatimChar"/>
+        </w:rPr>
+        <w:t xml:space="preserve">docs/Next_Owner_Market_Change_Log.docx</w:t>
+      </w:r>
+      <w:r>
+        <w:t xml:space="preserve">,</w:t>
+      </w:r>
+      <w:r>
+        <w:t xml:space="preserve"> </w:t>
+      </w:r>
+      <w:r>
+        <w:rPr>
+          <w:rStyle w:val="VerbatimChar"/>
+        </w:rPr>
+        <w:t xml:space="preserve">docs/Next_Owner_Market_Change_Log.md</w:t>
+      </w:r>
+      <w:r>
+        <w:t xml:space="preserve">,</w:t>
+      </w:r>
+      <w:r>
+        <w:t xml:space="preserve"> </w:t>
+      </w:r>
+      <w:r>
+        <w:rPr>
+          <w:rStyle w:val="VerbatimChar"/>
+        </w:rPr>
+        <w:t xml:space="preserve">docs/Next_Owner_Market_Chat_Harvest.docx</w:t>
+      </w:r>
+      <w:r>
+        <w:t xml:space="preserve">,</w:t>
+      </w:r>
+      <w:r>
+        <w:t xml:space="preserve"> </w:t>
+      </w:r>
+      <w:r>
+        <w:rPr>
+          <w:rStyle w:val="VerbatimChar"/>
+        </w:rPr>
+        <w:t xml:space="preserve">docs/Next_Owner_Market_Complete_Guide.docx</w:t>
+      </w:r>
+      <w:r>
+        <w:t xml:space="preserve">,</w:t>
+      </w:r>
+      <w:r>
+        <w:t xml:space="preserve"> </w:t>
+      </w:r>
+      <w:r>
+        <w:rPr>
+          <w:rStyle w:val="VerbatimChar"/>
+        </w:rPr>
+        <w:t xml:space="preserve">docs/Next_Owner_Market_Estate_Pack_Legal_Research.docx</w:t>
+      </w:r>
+      <w:r>
+        <w:t xml:space="preserve">,</w:t>
+      </w:r>
+      <w:r>
+        <w:t xml:space="preserve"> </w:t>
+      </w:r>
+      <w:r>
+        <w:rPr>
+          <w:rStyle w:val="VerbatimChar"/>
+        </w:rPr>
+        <w:t xml:space="preserve">docs/Next_Owner_Market_Facebook_Page_Kit.docx</w:t>
+      </w:r>
+      <w:r>
+        <w:t xml:space="preserve">,</w:t>
+      </w:r>
+      <w:r>
+        <w:t xml:space="preserve"> </w:t>
+      </w:r>
+      <w:r>
+        <w:rPr>
+          <w:rStyle w:val="VerbatimChar"/>
+        </w:rPr>
+        <w:t xml:space="preserve">docs/Next_Owner_Market_Feedback_For_Anthropic.docx</w:t>
+      </w:r>
+      <w:r>
+        <w:t xml:space="preserve">,</w:t>
+      </w:r>
+      <w:r>
+        <w:t xml:space="preserve"> </w:t>
+      </w:r>
+      <w:r>
+        <w:rPr>
+          <w:rStyle w:val="VerbatimChar"/>
+        </w:rPr>
+        <w:t xml:space="preserve">docs/Next_Owner_Market_File_Index.docx</w:t>
+      </w:r>
+      <w:r>
+        <w:t xml:space="preserve"> </w:t>
+      </w:r>
+      <w:r>
+        <w:t xml:space="preserve">(+15 more)</w:t>
+      </w:r>
+    </w:p>
+    <w:p>
+      <w:pPr>
+        <w:pStyle w:val="FirstParagraph"/>
+      </w:pPr>
+      <w:r>
+        <w:t xml:space="preserve">change id fc895fd</w:t>
+      </w:r>
+    </w:p>
     <w:bookmarkEnd w:id="416"/>
+    <w:bookmarkStart w:id="417" w:name="X5d0af395e66182218462030a66d035450349106"/>
+    <w:p>
+      <w:pPr>
+        <w:pStyle w:val="Heading3"/>
+      </w:pPr>
+      <w:r>
+        <w:t xml:space="preserve">19:34 — 🔬 Advanced What's it worth (owner only): live-search value, step-by-step test guide, known faults, manuals, parts, listing; saved reports, follow-up questions, Word white paper download</w:t>
+      </w:r>
+    </w:p>
+    <w:p>
+      <w:pPr>
+        <w:numPr>
+          <w:ilvl w:val="0"/>
+          <w:numId w:val="1388"/>
+        </w:numPr>
+        <w:pStyle w:val="Compact"/>
+      </w:pPr>
+      <w:r>
+        <w:rPr>
+          <w:bCs/>
+          <w:b/>
+        </w:rPr>
+        <w:t xml:space="preserve">Dependencies:</w:t>
+      </w:r>
+      <w:r>
+        <w:t xml:space="preserve"> </w:t>
+      </w:r>
+      <w:r>
+        <w:rPr>
+          <w:rStyle w:val="VerbatimChar"/>
+        </w:rPr>
+        <w:t xml:space="preserve">package-lock.json</w:t>
+      </w:r>
+      <w:r>
+        <w:t xml:space="preserve">,</w:t>
+      </w:r>
+      <w:r>
+        <w:t xml:space="preserve"> </w:t>
+      </w:r>
+      <w:r>
+        <w:rPr>
+          <w:rStyle w:val="VerbatimChar"/>
+        </w:rPr>
+        <w:t xml:space="preserve">package.json</w:t>
+      </w:r>
+    </w:p>
+    <w:p>
+      <w:pPr>
+        <w:numPr>
+          <w:ilvl w:val="0"/>
+          <w:numId w:val="1388"/>
+        </w:numPr>
+        <w:pStyle w:val="Compact"/>
+      </w:pPr>
+      <w:r>
+        <w:rPr>
+          <w:bCs/>
+          <w:b/>
+        </w:rPr>
+        <w:t xml:space="preserve">Server routes (API):</w:t>
+      </w:r>
+      <w:r>
+        <w:t xml:space="preserve"> </w:t>
+      </w:r>
+      <w:r>
+        <w:rPr>
+          <w:rStyle w:val="VerbatimChar"/>
+        </w:rPr>
+        <w:t xml:space="preserve">src/app/api/deep/[id]/ask/route.ts</w:t>
+      </w:r>
+      <w:r>
+        <w:t xml:space="preserve">,</w:t>
+      </w:r>
+      <w:r>
+        <w:t xml:space="preserve"> </w:t>
+      </w:r>
+      <w:r>
+        <w:rPr>
+          <w:rStyle w:val="VerbatimChar"/>
+        </w:rPr>
+        <w:t xml:space="preserve">src/app/api/deep/[id]/docx/route.ts</w:t>
+      </w:r>
+      <w:r>
+        <w:t xml:space="preserve">,</w:t>
+      </w:r>
+      <w:r>
+        <w:t xml:space="preserve"> </w:t>
+      </w:r>
+      <w:r>
+        <w:rPr>
+          <w:rStyle w:val="VerbatimChar"/>
+        </w:rPr>
+        <w:t xml:space="preserve">src/app/api/deep/route.ts</w:t>
+      </w:r>
+    </w:p>
+    <w:p>
+      <w:pPr>
+        <w:numPr>
+          <w:ilvl w:val="0"/>
+          <w:numId w:val="1388"/>
+        </w:numPr>
+        <w:pStyle w:val="Compact"/>
+      </w:pPr>
+      <w:r>
+        <w:rPr>
+          <w:bCs/>
+          <w:b/>
+        </w:rPr>
+        <w:t xml:space="preserve">Seller / staff app:</w:t>
+      </w:r>
+      <w:r>
+        <w:t xml:space="preserve"> </w:t>
+      </w:r>
+      <w:r>
+        <w:rPr>
+          <w:rStyle w:val="VerbatimChar"/>
+        </w:rPr>
+        <w:t xml:space="preserve">src/app/app/deep/NewDeep.tsx</w:t>
+      </w:r>
+      <w:r>
+        <w:t xml:space="preserve">,</w:t>
+      </w:r>
+      <w:r>
+        <w:t xml:space="preserve"> </w:t>
+      </w:r>
+      <w:r>
+        <w:rPr>
+          <w:rStyle w:val="VerbatimChar"/>
+        </w:rPr>
+        <w:t xml:space="preserve">src/app/app/deep/[id]/ReportView.tsx</w:t>
+      </w:r>
+      <w:r>
+        <w:t xml:space="preserve">,</w:t>
+      </w:r>
+      <w:r>
+        <w:t xml:space="preserve"> </w:t>
+      </w:r>
+      <w:r>
+        <w:rPr>
+          <w:rStyle w:val="VerbatimChar"/>
+        </w:rPr>
+        <w:t xml:space="preserve">src/app/app/deep/[id]/page.tsx</w:t>
+      </w:r>
+      <w:r>
+        <w:t xml:space="preserve">,</w:t>
+      </w:r>
+      <w:r>
+        <w:t xml:space="preserve"> </w:t>
+      </w:r>
+      <w:r>
+        <w:rPr>
+          <w:rStyle w:val="VerbatimChar"/>
+        </w:rPr>
+        <w:t xml:space="preserve">src/app/app/deep/page.tsx</w:t>
+      </w:r>
+      <w:r>
+        <w:t xml:space="preserve">,</w:t>
+      </w:r>
+      <w:r>
+        <w:t xml:space="preserve"> </w:t>
+      </w:r>
+      <w:r>
+        <w:rPr>
+          <w:rStyle w:val="VerbatimChar"/>
+        </w:rPr>
+        <w:t xml:space="preserve">src/app/app/layout.tsx</w:t>
+      </w:r>
+    </w:p>
+    <w:p>
+      <w:pPr>
+        <w:numPr>
+          <w:ilvl w:val="0"/>
+          <w:numId w:val="1388"/>
+        </w:numPr>
+        <w:pStyle w:val="Compact"/>
+      </w:pPr>
+      <w:r>
+        <w:rPr>
+          <w:bCs/>
+          <w:b/>
+        </w:rPr>
+        <w:t xml:space="preserve">Shared code (logic):</w:t>
+      </w:r>
+      <w:r>
+        <w:t xml:space="preserve"> </w:t>
+      </w:r>
+      <w:r>
+        <w:rPr>
+          <w:rStyle w:val="VerbatimChar"/>
+        </w:rPr>
+        <w:t xml:space="preserve">src/lib/deepcheck.ts</w:t>
+      </w:r>
+      <w:r>
+        <w:t xml:space="preserve">,</w:t>
+      </w:r>
+      <w:r>
+        <w:t xml:space="preserve"> </w:t>
+      </w:r>
+      <w:r>
+        <w:rPr>
+          <w:rStyle w:val="VerbatimChar"/>
+        </w:rPr>
+        <w:t xml:space="preserve">src/lib/deepdocx.ts</w:t>
+      </w:r>
+    </w:p>
+    <w:p>
+      <w:pPr>
+        <w:numPr>
+          <w:ilvl w:val="0"/>
+          <w:numId w:val="1388"/>
+        </w:numPr>
+        <w:pStyle w:val="Compact"/>
+      </w:pPr>
+      <w:r>
+        <w:rPr>
+          <w:bCs/>
+          <w:b/>
+        </w:rPr>
+        <w:t xml:space="preserve">Database (migrations):</w:t>
+      </w:r>
+      <w:r>
+        <w:t xml:space="preserve"> </w:t>
+      </w:r>
+      <w:r>
+        <w:rPr>
+          <w:rStyle w:val="VerbatimChar"/>
+        </w:rPr>
+        <w:t xml:space="preserve">supabase/migrations/057_deep_reports.sql</w:t>
+      </w:r>
+    </w:p>
+    <w:p>
+      <w:pPr>
+        <w:pStyle w:val="FirstParagraph"/>
+      </w:pPr>
+      <w:r>
+        <w:t xml:space="preserve">change id 8ecfe2f</w:t>
+      </w:r>
+    </w:p>
     <w:bookmarkEnd w:id="417"/>
+    <w:bookmarkEnd w:id="418"/>
+    <w:bookmarkEnd w:id="419"/>
     <w:sectPr/>
   </w:body>
 </w:document>
@@ -53964,6 +54384,12 @@
   <w:num w:numId="1386">
     <w:abstractNumId w:val="991"/>
   </w:num>
+  <w:num w:numId="1387">
+    <w:abstractNumId w:val="991"/>
+  </w:num>
+  <w:num w:numId="1388">
+    <w:abstractNumId w:val="991"/>
+  </w:num>
 </w:numbering>
 </file>
 

</xml_diff>

<commit_message>
Docs: deep report listing in User Guide
Co-Authored-By: Claude Opus 5.5 <noreply@anthropic.com>
Claude-Session: https://claude.ai/code/session_01JPZJaTbXQFN2qiYRf4rkZK
</commit_message>
<xml_diff>
--- a/docs/Next_Owner_Market_Change_Log.docx
+++ b/docs/Next_Owner_Market_Change_Log.docx
@@ -2,7 +2,7 @@
 <file path=word/document.xml><?xml version="1.0" encoding="utf-8"?>
 <w:document xmlns:w="http://schemas.openxmlformats.org/wordprocessingml/2006/main" xmlns:m="http://schemas.openxmlformats.org/officeDocument/2006/math" xmlns:r="http://schemas.openxmlformats.org/officeDocument/2006/relationships" xmlns:o="urn:schemas-microsoft-com:office:office" xmlns:v="urn:schemas-microsoft-com:vml" xmlns:w10="urn:schemas-microsoft-com:office:word" xmlns:a="http://schemas.openxmlformats.org/drawingml/2006/main" xmlns:pic="http://schemas.openxmlformats.org/drawingml/2006/picture" xmlns:wp="http://schemas.openxmlformats.org/drawingml/2006/wordprocessingDrawing">
   <w:body>
-    <w:bookmarkStart w:id="421" w:name="next-owner-market--change-log"/>
+    <w:bookmarkStart w:id="423" w:name="next-owner-market--change-log"/>
     <w:p>
       <w:pPr>
         <w:pStyle w:val="Heading1"/>
@@ -20,7 +20,7 @@
           <w:iCs/>
           <w:i/>
         </w:rPr>
-        <w:t xml:space="preserve">Every change to the code, database, and documents, oldest first. Generated October 26, 2026 7:52 PM from the project history (390 changes).</w:t>
+        <w:t xml:space="preserve">Every change to the code, database, and documents, oldest first. Generated October 26, 2026 8:18 PM from the project history (392 changes).</w:t>
       </w:r>
     </w:p>
     <w:bookmarkStart w:id="52" w:name="tuesday-september-29-2026"/>
@@ -52085,7 +52085,7 @@
     </w:p>
     <w:bookmarkEnd w:id="409"/>
     <w:bookmarkEnd w:id="410"/>
-    <w:bookmarkStart w:id="420" w:name="monday-october-26-2026"/>
+    <w:bookmarkStart w:id="422" w:name="monday-october-26-2026"/>
     <w:p>
       <w:pPr>
         <w:pStyle w:val="Heading2"/>
@@ -53263,8 +53263,294 @@
       </w:r>
     </w:p>
     <w:bookmarkEnd w:id="419"/>
+    <w:bookmarkStart w:id="420" w:name="X72295f82da3cc111c1c3f3d91dc651579a8e11c"/>
+    <w:p>
+      <w:pPr>
+        <w:pStyle w:val="Heading3"/>
+      </w:pPr>
+      <w:r>
+        <w:t xml:space="preserve">19:52 — Docs: journal</w:t>
+      </w:r>
+    </w:p>
+    <w:p>
+      <w:pPr>
+        <w:numPr>
+          <w:ilvl w:val="0"/>
+          <w:numId w:val="1391"/>
+        </w:numPr>
+        <w:pStyle w:val="Compact"/>
+      </w:pPr>
+      <w:r>
+        <w:rPr>
+          <w:bCs/>
+          <w:b/>
+        </w:rPr>
+        <w:t xml:space="preserve">Documents:</w:t>
+      </w:r>
+      <w:r>
+        <w:t xml:space="preserve"> </w:t>
+      </w:r>
+      <w:r>
+        <w:rPr>
+          <w:rStyle w:val="VerbatimChar"/>
+        </w:rPr>
+        <w:t xml:space="preserve">docs/Next_Owner_Market_AddOn_Modules_White_Paper.docx</w:t>
+      </w:r>
+      <w:r>
+        <w:t xml:space="preserve">,</w:t>
+      </w:r>
+      <w:r>
+        <w:t xml:space="preserve"> </w:t>
+      </w:r>
+      <w:r>
+        <w:rPr>
+          <w:rStyle w:val="VerbatimChar"/>
+        </w:rPr>
+        <w:t xml:space="preserve">docs/Next_Owner_Market_App_Builder_Playbook.docx</w:t>
+      </w:r>
+      <w:r>
+        <w:t xml:space="preserve">,</w:t>
+      </w:r>
+      <w:r>
+        <w:t xml:space="preserve"> </w:t>
+      </w:r>
+      <w:r>
+        <w:rPr>
+          <w:rStyle w:val="VerbatimChar"/>
+        </w:rPr>
+        <w:t xml:space="preserve">docs/Next_Owner_Market_Beat_The_Competition.docx</w:t>
+      </w:r>
+      <w:r>
+        <w:t xml:space="preserve">,</w:t>
+      </w:r>
+      <w:r>
+        <w:t xml:space="preserve"> </w:t>
+      </w:r>
+      <w:r>
+        <w:rPr>
+          <w:rStyle w:val="VerbatimChar"/>
+        </w:rPr>
+        <w:t xml:space="preserve">docs/Next_Owner_Market_Build_Journal.docx</w:t>
+      </w:r>
+      <w:r>
+        <w:t xml:space="preserve">,</w:t>
+      </w:r>
+      <w:r>
+        <w:t xml:space="preserve"> </w:t>
+      </w:r>
+      <w:r>
+        <w:rPr>
+          <w:rStyle w:val="VerbatimChar"/>
+        </w:rPr>
+        <w:t xml:space="preserve">docs/Next_Owner_Market_Change_Log.docx</w:t>
+      </w:r>
+      <w:r>
+        <w:t xml:space="preserve">,</w:t>
+      </w:r>
+      <w:r>
+        <w:t xml:space="preserve"> </w:t>
+      </w:r>
+      <w:r>
+        <w:rPr>
+          <w:rStyle w:val="VerbatimChar"/>
+        </w:rPr>
+        <w:t xml:space="preserve">docs/Next_Owner_Market_Change_Log.md</w:t>
+      </w:r>
+      <w:r>
+        <w:t xml:space="preserve">,</w:t>
+      </w:r>
+      <w:r>
+        <w:t xml:space="preserve"> </w:t>
+      </w:r>
+      <w:r>
+        <w:rPr>
+          <w:rStyle w:val="VerbatimChar"/>
+        </w:rPr>
+        <w:t xml:space="preserve">docs/Next_Owner_Market_Chat_Harvest.docx</w:t>
+      </w:r>
+      <w:r>
+        <w:t xml:space="preserve">,</w:t>
+      </w:r>
+      <w:r>
+        <w:t xml:space="preserve"> </w:t>
+      </w:r>
+      <w:r>
+        <w:rPr>
+          <w:rStyle w:val="VerbatimChar"/>
+        </w:rPr>
+        <w:t xml:space="preserve">docs/Next_Owner_Market_Complete_Guide.docx</w:t>
+      </w:r>
+      <w:r>
+        <w:t xml:space="preserve">,</w:t>
+      </w:r>
+      <w:r>
+        <w:t xml:space="preserve"> </w:t>
+      </w:r>
+      <w:r>
+        <w:rPr>
+          <w:rStyle w:val="VerbatimChar"/>
+        </w:rPr>
+        <w:t xml:space="preserve">docs/Next_Owner_Market_Estate_Pack_Legal_Research.docx</w:t>
+      </w:r>
+      <w:r>
+        <w:t xml:space="preserve">,</w:t>
+      </w:r>
+      <w:r>
+        <w:t xml:space="preserve"> </w:t>
+      </w:r>
+      <w:r>
+        <w:rPr>
+          <w:rStyle w:val="VerbatimChar"/>
+        </w:rPr>
+        <w:t xml:space="preserve">docs/Next_Owner_Market_Facebook_Page_Kit.docx</w:t>
+      </w:r>
+      <w:r>
+        <w:t xml:space="preserve">,</w:t>
+      </w:r>
+      <w:r>
+        <w:t xml:space="preserve"> </w:t>
+      </w:r>
+      <w:r>
+        <w:rPr>
+          <w:rStyle w:val="VerbatimChar"/>
+        </w:rPr>
+        <w:t xml:space="preserve">docs/Next_Owner_Market_Feedback_For_Anthropic.docx</w:t>
+      </w:r>
+      <w:r>
+        <w:t xml:space="preserve">,</w:t>
+      </w:r>
+      <w:r>
+        <w:t xml:space="preserve"> </w:t>
+      </w:r>
+      <w:r>
+        <w:rPr>
+          <w:rStyle w:val="VerbatimChar"/>
+        </w:rPr>
+        <w:t xml:space="preserve">docs/Next_Owner_Market_File_Index.docx</w:t>
+      </w:r>
+      <w:r>
+        <w:t xml:space="preserve"> </w:t>
+      </w:r>
+      <w:r>
+        <w:t xml:space="preserve">(+15 more)</w:t>
+      </w:r>
+    </w:p>
+    <w:p>
+      <w:pPr>
+        <w:pStyle w:val="FirstParagraph"/>
+      </w:pPr>
+      <w:r>
+        <w:t xml:space="preserve">change id 229b0cf</w:t>
+      </w:r>
+    </w:p>
     <w:bookmarkEnd w:id="420"/>
+    <w:bookmarkStart w:id="421" w:name="X9476c5a18631afbede2b2af31c6779a66e024e8"/>
+    <w:p>
+      <w:pPr>
+        <w:pStyle w:val="Heading3"/>
+      </w:pPr>
+      <w:r>
+        <w:t xml:space="preserve">20:16 — Advanced What's it worth: make it a listing in the app, and change the listing by saying what to change (with undo)</w:t>
+      </w:r>
+    </w:p>
+    <w:p>
+      <w:pPr>
+        <w:numPr>
+          <w:ilvl w:val="0"/>
+          <w:numId w:val="1392"/>
+        </w:numPr>
+        <w:pStyle w:val="Compact"/>
+      </w:pPr>
+      <w:r>
+        <w:rPr>
+          <w:bCs/>
+          <w:b/>
+        </w:rPr>
+        <w:t xml:space="preserve">Server routes (API):</w:t>
+      </w:r>
+      <w:r>
+        <w:t xml:space="preserve"> </w:t>
+      </w:r>
+      <w:r>
+        <w:rPr>
+          <w:rStyle w:val="VerbatimChar"/>
+        </w:rPr>
+        <w:t xml:space="preserve">src/app/api/deep/[id]/listing/route.ts</w:t>
+      </w:r>
+    </w:p>
+    <w:p>
+      <w:pPr>
+        <w:numPr>
+          <w:ilvl w:val="0"/>
+          <w:numId w:val="1392"/>
+        </w:numPr>
+        <w:pStyle w:val="Compact"/>
+      </w:pPr>
+      <w:r>
+        <w:rPr>
+          <w:bCs/>
+          <w:b/>
+        </w:rPr>
+        <w:t xml:space="preserve">Seller / staff app:</w:t>
+      </w:r>
+      <w:r>
+        <w:t xml:space="preserve"> </w:t>
+      </w:r>
+      <w:r>
+        <w:rPr>
+          <w:rStyle w:val="VerbatimChar"/>
+        </w:rPr>
+        <w:t xml:space="preserve">src/app/app/deep/[id]/ReportView.tsx</w:t>
+      </w:r>
+      <w:r>
+        <w:t xml:space="preserve">,</w:t>
+      </w:r>
+      <w:r>
+        <w:t xml:space="preserve"> </w:t>
+      </w:r>
+      <w:r>
+        <w:rPr>
+          <w:rStyle w:val="VerbatimChar"/>
+        </w:rPr>
+        <w:t xml:space="preserve">src/app/app/deep/[id]/page.tsx</w:t>
+      </w:r>
+    </w:p>
+    <w:p>
+      <w:pPr>
+        <w:numPr>
+          <w:ilvl w:val="0"/>
+          <w:numId w:val="1392"/>
+        </w:numPr>
+        <w:pStyle w:val="Compact"/>
+      </w:pPr>
+      <w:r>
+        <w:rPr>
+          <w:bCs/>
+          <w:b/>
+        </w:rPr>
+        <w:t xml:space="preserve">Database (migrations):</w:t>
+      </w:r>
+      <w:r>
+        <w:t xml:space="preserve"> </w:t>
+      </w:r>
+      <w:r>
+        <w:rPr>
+          <w:rStyle w:val="VerbatimChar"/>
+        </w:rPr>
+        <w:t xml:space="preserve">supabase/migrations/058_deep_item.sql</w:t>
+      </w:r>
+    </w:p>
+    <w:p>
+      <w:pPr>
+        <w:pStyle w:val="FirstParagraph"/>
+      </w:pPr>
+      <w:r>
+        <w:t xml:space="preserve">change id 30a6930</w:t>
+      </w:r>
+    </w:p>
     <w:bookmarkEnd w:id="421"/>
+    <w:bookmarkEnd w:id="422"/>
+    <w:bookmarkEnd w:id="423"/>
     <w:sectPr/>
   </w:body>
 </w:document>
@@ -54620,6 +54906,12 @@
   <w:num w:numId="1390">
     <w:abstractNumId w:val="991"/>
   </w:num>
+  <w:num w:numId="1391">
+    <w:abstractNumId w:val="991"/>
+  </w:num>
+  <w:num w:numId="1392">
+    <w:abstractNumId w:val="991"/>
+  </w:num>
 </w:numbering>
 </file>
 

</xml_diff>